<commit_message>
Přegenerovat slovníček pro garanta a pojistit ho proti zastarání
Export .docx, který se sdílí s garantem, byl z #81, ale glossary.md se
od té doby změnil v #91 (poločas t(1/2)) a #98 (popisné indexy). Garant
by četl verzi, které chybí celá nová tabulka — 28 odstavců.

Konvertor se navíc nedal spustit tak, jak README popisovalo: package.json
má "type": "module", takže .js soubor s require() skončí na ReferenceError.
Přejmenováno na .cjs; dokumentovaný příkaz teď funguje.

Aby to znovu neuteklo, konvertor ukládá vedle dokumentu otisk předlohy
(.sha256) a nový test ho porovnává s aktuálním glossary.md. Úprava
slovníčku bez přegenerování tím shodí npm test.

Ověřeno: kurzíva 130, indexy 71, uniklý markup 0. Test ověřen i obráceně —
po změně glossary.md bez regenerace selže.

Testy: 341/341. Bez bumpu verze, do prohlížeče nic nejde.

Co-authored-by: Copilot <223556219+Copilot@users.noreply.github.com>
</commit_message>
<xml_diff>
--- a/docs/notation/export/slovnicek-velicin.docx
+++ b/docs/notation/export/slovnicek-velicin.docx
@@ -8130,7 +8130,7 @@
           <w:i w:val="false"/>
           <w:iCs w:val="false"/>
         </w:rPr>
-        <w:t xml:space="preserve">Důsledek, který zatím neřešíme:</w:t>
+        <w:t xml:space="preserve">Slova psaná ve vzorci celá.</w:t>
       </w:r>
       <w:r>
         <w:rPr>
@@ -8139,7 +8139,1256 @@
           <w:i w:val="false"/>
           <w:iCs w:val="false"/>
         </w:rPr>
-        <w:t xml:space="preserve"> popisky grafů jsou sdílené přes CZ/EN/ES, takže lokalizované indexy si vyžádají jejich převedení do i18n. To je práce fáze 2.</w:t>
+        <w:t xml:space="preserve"> Některé indexy nejsou zkratkou, ale běžným slovem; ve vzorci se sázejí stojatě a překládají stejně jako zkratky.</w:t>
+      </w:r>
+    </w:p>
+    <w:tbl>
+      <w:tblPr>
+        <w:tblW w:type="dxa" w:w="9026"/>
+        <w:tblBorders>
+          <w:top w:val="single" w:color="auto" w:sz="4"/>
+          <w:left w:val="single" w:color="auto" w:sz="4"/>
+          <w:bottom w:val="single" w:color="auto" w:sz="4"/>
+          <w:right w:val="single" w:color="auto" w:sz="4"/>
+          <w:insideH w:val="single" w:color="auto" w:sz="4"/>
+          <w:insideV w:val="single" w:color="auto" w:sz="4"/>
+        </w:tblBorders>
+      </w:tblPr>
+      <w:tblGrid>
+        <w:gridCol w:w="2256"/>
+        <w:gridCol w:w="2256"/>
+        <w:gridCol w:w="2256"/>
+        <w:gridCol w:w="2258"/>
+      </w:tblGrid>
+      <w:tr>
+        <w:trPr>
+          <w:tblHeader/>
+        </w:trPr>
+        <w:tc>
+          <w:tcPr>
+            <w:tcW w:type="dxa" w:w="2256"/>
+            <w:tcBorders>
+              <w:top w:val="single" w:color="B8C4CE" w:sz="1"/>
+              <w:left w:val="single" w:color="B8C4CE" w:sz="1"/>
+              <w:bottom w:val="single" w:color="B8C4CE" w:sz="1"/>
+              <w:right w:val="single" w:color="B8C4CE" w:sz="1"/>
+            </w:tcBorders>
+            <w:shd w:fill="DCE6F1" w:val="clear"/>
+            <w:tcMar>
+              <w:top w:type="dxa" w:w="60"/>
+              <w:left w:type="dxa" w:w="100"/>
+              <w:bottom w:type="dxa" w:w="60"/>
+              <w:right w:type="dxa" w:w="100"/>
+            </w:tcMar>
+            <w:vAlign w:val="center"/>
+          </w:tcPr>
+          <w:p>
+            <w:pPr>
+              <w:spacing w:after="20" w:before="20"/>
+            </w:pPr>
+            <w:r>
+              <w:rPr>
+                <w:b/>
+                <w:bCs/>
+                <w:i w:val="false"/>
+                <w:iCs w:val="false"/>
+              </w:rPr>
+              <w:t xml:space="preserve">Význam</w:t>
+            </w:r>
+          </w:p>
+        </w:tc>
+        <w:tc>
+          <w:tcPr>
+            <w:tcW w:type="dxa" w:w="2256"/>
+            <w:tcBorders>
+              <w:top w:val="single" w:color="B8C4CE" w:sz="1"/>
+              <w:left w:val="single" w:color="B8C4CE" w:sz="1"/>
+              <w:bottom w:val="single" w:color="B8C4CE" w:sz="1"/>
+              <w:right w:val="single" w:color="B8C4CE" w:sz="1"/>
+            </w:tcBorders>
+            <w:shd w:fill="DCE6F1" w:val="clear"/>
+            <w:tcMar>
+              <w:top w:type="dxa" w:w="60"/>
+              <w:left w:type="dxa" w:w="100"/>
+              <w:bottom w:type="dxa" w:w="60"/>
+              <w:right w:type="dxa" w:w="100"/>
+            </w:tcMar>
+            <w:vAlign w:val="center"/>
+          </w:tcPr>
+          <w:p>
+            <w:pPr>
+              <w:spacing w:after="20" w:before="20"/>
+            </w:pPr>
+            <w:r>
+              <w:rPr>
+                <w:b/>
+                <w:bCs/>
+                <w:i w:val="false"/>
+                <w:iCs w:val="false"/>
+              </w:rPr>
+              <w:t xml:space="preserve">Zdroj (EN)</w:t>
+            </w:r>
+          </w:p>
+        </w:tc>
+        <w:tc>
+          <w:tcPr>
+            <w:tcW w:type="dxa" w:w="2256"/>
+            <w:tcBorders>
+              <w:top w:val="single" w:color="B8C4CE" w:sz="1"/>
+              <w:left w:val="single" w:color="B8C4CE" w:sz="1"/>
+              <w:bottom w:val="single" w:color="B8C4CE" w:sz="1"/>
+              <w:right w:val="single" w:color="B8C4CE" w:sz="1"/>
+            </w:tcBorders>
+            <w:shd w:fill="DCE6F1" w:val="clear"/>
+            <w:tcMar>
+              <w:top w:type="dxa" w:w="60"/>
+              <w:left w:type="dxa" w:w="100"/>
+              <w:bottom w:type="dxa" w:w="60"/>
+              <w:right w:type="dxa" w:w="100"/>
+            </w:tcMar>
+            <w:vAlign w:val="center"/>
+          </w:tcPr>
+          <w:p>
+            <w:pPr>
+              <w:spacing w:after="20" w:before="20"/>
+            </w:pPr>
+            <w:r>
+              <w:rPr>
+                <w:b/>
+                <w:bCs/>
+                <w:i w:val="false"/>
+                <w:iCs w:val="false"/>
+              </w:rPr>
+              <w:t xml:space="preserve">CZ</w:t>
+            </w:r>
+          </w:p>
+        </w:tc>
+        <w:tc>
+          <w:tcPr>
+            <w:tcW w:type="dxa" w:w="2258"/>
+            <w:tcBorders>
+              <w:top w:val="single" w:color="B8C4CE" w:sz="1"/>
+              <w:left w:val="single" w:color="B8C4CE" w:sz="1"/>
+              <w:bottom w:val="single" w:color="B8C4CE" w:sz="1"/>
+              <w:right w:val="single" w:color="B8C4CE" w:sz="1"/>
+            </w:tcBorders>
+            <w:shd w:fill="DCE6F1" w:val="clear"/>
+            <w:tcMar>
+              <w:top w:type="dxa" w:w="60"/>
+              <w:left w:type="dxa" w:w="100"/>
+              <w:bottom w:type="dxa" w:w="60"/>
+              <w:right w:type="dxa" w:w="100"/>
+            </w:tcMar>
+            <w:vAlign w:val="center"/>
+          </w:tcPr>
+          <w:p>
+            <w:pPr>
+              <w:spacing w:after="20" w:before="20"/>
+            </w:pPr>
+            <w:r>
+              <w:rPr>
+                <w:b/>
+                <w:bCs/>
+                <w:i w:val="false"/>
+                <w:iCs w:val="false"/>
+              </w:rPr>
+              <w:t xml:space="preserve">Příklad</w:t>
+            </w:r>
+          </w:p>
+        </w:tc>
+      </w:tr>
+      <w:tr>
+        <w:trPr>
+          <w:tblHeader w:val="false"/>
+        </w:trPr>
+        <w:tc>
+          <w:tcPr>
+            <w:tcW w:type="dxa" w:w="2256"/>
+            <w:tcBorders>
+              <w:top w:val="single" w:color="B8C4CE" w:sz="1"/>
+              <w:left w:val="single" w:color="B8C4CE" w:sz="1"/>
+              <w:bottom w:val="single" w:color="B8C4CE" w:sz="1"/>
+              <w:right w:val="single" w:color="B8C4CE" w:sz="1"/>
+            </w:tcBorders>
+            <w:tcMar>
+              <w:top w:type="dxa" w:w="60"/>
+              <w:left w:type="dxa" w:w="100"/>
+              <w:bottom w:type="dxa" w:w="60"/>
+              <w:right w:type="dxa" w:w="100"/>
+            </w:tcMar>
+            <w:vAlign w:val="center"/>
+          </w:tcPr>
+          <w:p>
+            <w:pPr>
+              <w:spacing w:after="20" w:before="20"/>
+            </w:pPr>
+            <w:r>
+              <w:rPr>
+                <w:b w:val="false"/>
+                <w:bCs w:val="false"/>
+                <w:i w:val="false"/>
+                <w:iCs w:val="false"/>
+              </w:rPr>
+              <w:t xml:space="preserve">hloubka</w:t>
+            </w:r>
+          </w:p>
+        </w:tc>
+        <w:tc>
+          <w:tcPr>
+            <w:tcW w:type="dxa" w:w="2256"/>
+            <w:tcBorders>
+              <w:top w:val="single" w:color="B8C4CE" w:sz="1"/>
+              <w:left w:val="single" w:color="B8C4CE" w:sz="1"/>
+              <w:bottom w:val="single" w:color="B8C4CE" w:sz="1"/>
+              <w:right w:val="single" w:color="B8C4CE" w:sz="1"/>
+            </w:tcBorders>
+            <w:tcMar>
+              <w:top w:type="dxa" w:w="60"/>
+              <w:left w:type="dxa" w:w="100"/>
+              <w:bottom w:type="dxa" w:w="60"/>
+              <w:right w:type="dxa" w:w="100"/>
+            </w:tcMar>
+            <w:vAlign w:val="center"/>
+          </w:tcPr>
+          <w:p>
+            <w:pPr>
+              <w:spacing w:after="20" w:before="20"/>
+            </w:pPr>
+            <w:r>
+              <w:rPr>
+                <w:b w:val="false"/>
+                <w:bCs w:val="false"/>
+                <w:i w:val="false"/>
+                <w:iCs w:val="false"/>
+              </w:rPr>
+              <w:t xml:space="preserve">depth</w:t>
+            </w:r>
+          </w:p>
+        </w:tc>
+        <w:tc>
+          <w:tcPr>
+            <w:tcW w:type="dxa" w:w="2256"/>
+            <w:tcBorders>
+              <w:top w:val="single" w:color="B8C4CE" w:sz="1"/>
+              <w:left w:val="single" w:color="B8C4CE" w:sz="1"/>
+              <w:bottom w:val="single" w:color="B8C4CE" w:sz="1"/>
+              <w:right w:val="single" w:color="B8C4CE" w:sz="1"/>
+            </w:tcBorders>
+            <w:tcMar>
+              <w:top w:type="dxa" w:w="60"/>
+              <w:left w:type="dxa" w:w="100"/>
+              <w:bottom w:type="dxa" w:w="60"/>
+              <w:right w:type="dxa" w:w="100"/>
+            </w:tcMar>
+            <w:vAlign w:val="center"/>
+          </w:tcPr>
+          <w:p>
+            <w:pPr>
+              <w:spacing w:after="20" w:before="20"/>
+            </w:pPr>
+            <w:r>
+              <w:rPr>
+                <w:b w:val="false"/>
+                <w:bCs w:val="false"/>
+                <w:i w:val="false"/>
+                <w:iCs w:val="false"/>
+              </w:rPr>
+              <w:t xml:space="preserve">hloubka</w:t>
+            </w:r>
+          </w:p>
+        </w:tc>
+        <w:tc>
+          <w:tcPr>
+            <w:tcW w:type="dxa" w:w="2258"/>
+            <w:tcBorders>
+              <w:top w:val="single" w:color="B8C4CE" w:sz="1"/>
+              <w:left w:val="single" w:color="B8C4CE" w:sz="1"/>
+              <w:bottom w:val="single" w:color="B8C4CE" w:sz="1"/>
+              <w:right w:val="single" w:color="B8C4CE" w:sz="1"/>
+            </w:tcBorders>
+            <w:tcMar>
+              <w:top w:type="dxa" w:w="60"/>
+              <w:left w:type="dxa" w:w="100"/>
+              <w:bottom w:type="dxa" w:w="60"/>
+              <w:right w:type="dxa" w:w="100"/>
+            </w:tcMar>
+            <w:vAlign w:val="center"/>
+          </w:tcPr>
+          <w:p>
+            <w:pPr>
+              <w:spacing w:after="20" w:before="20"/>
+            </w:pPr>
+            <w:r>
+              <w:rPr>
+                <w:b w:val="false"/>
+                <w:bCs w:val="false"/>
+                <w:i/>
+                <w:iCs/>
+              </w:rPr>
+              <w:t xml:space="preserve">p</w:t>
+            </w:r>
+            <w:r>
+              <w:rPr>
+                <w:b w:val="false"/>
+                <w:bCs w:val="false"/>
+                <w:i w:val="false"/>
+                <w:iCs w:val="false"/>
+                <w:vertAlign w:val="subscript"/>
+              </w:rPr>
+              <w:t xml:space="preserve">okol</w:t>
+            </w:r>
+            <w:r>
+              <w:rPr>
+                <w:b w:val="false"/>
+                <w:bCs w:val="false"/>
+                <w:i w:val="false"/>
+                <w:iCs w:val="false"/>
+              </w:rPr>
+              <w:t xml:space="preserve"> = 1 + hloubka / 10</w:t>
+            </w:r>
+          </w:p>
+        </w:tc>
+      </w:tr>
+      <w:tr>
+        <w:trPr>
+          <w:tblHeader w:val="false"/>
+        </w:trPr>
+        <w:tc>
+          <w:tcPr>
+            <w:tcW w:type="dxa" w:w="2256"/>
+            <w:tcBorders>
+              <w:top w:val="single" w:color="B8C4CE" w:sz="1"/>
+              <w:left w:val="single" w:color="B8C4CE" w:sz="1"/>
+              <w:bottom w:val="single" w:color="B8C4CE" w:sz="1"/>
+              <w:right w:val="single" w:color="B8C4CE" w:sz="1"/>
+            </w:tcBorders>
+            <w:tcMar>
+              <w:top w:type="dxa" w:w="60"/>
+              <w:left w:type="dxa" w:w="100"/>
+              <w:bottom w:type="dxa" w:w="60"/>
+              <w:right w:type="dxa" w:w="100"/>
+            </w:tcMar>
+            <w:vAlign w:val="center"/>
+          </w:tcPr>
+          <w:p>
+            <w:pPr>
+              <w:spacing w:after="20" w:before="20"/>
+            </w:pPr>
+            <w:r>
+              <w:rPr>
+                <w:b w:val="false"/>
+                <w:bCs w:val="false"/>
+                <w:i w:val="false"/>
+                <w:iCs w:val="false"/>
+              </w:rPr>
+              <w:t xml:space="preserve">lahev</w:t>
+            </w:r>
+          </w:p>
+        </w:tc>
+        <w:tc>
+          <w:tcPr>
+            <w:tcW w:type="dxa" w:w="2256"/>
+            <w:tcBorders>
+              <w:top w:val="single" w:color="B8C4CE" w:sz="1"/>
+              <w:left w:val="single" w:color="B8C4CE" w:sz="1"/>
+              <w:bottom w:val="single" w:color="B8C4CE" w:sz="1"/>
+              <w:right w:val="single" w:color="B8C4CE" w:sz="1"/>
+            </w:tcBorders>
+            <w:tcMar>
+              <w:top w:type="dxa" w:w="60"/>
+              <w:left w:type="dxa" w:w="100"/>
+              <w:bottom w:type="dxa" w:w="60"/>
+              <w:right w:type="dxa" w:w="100"/>
+            </w:tcMar>
+            <w:vAlign w:val="center"/>
+          </w:tcPr>
+          <w:p>
+            <w:pPr>
+              <w:spacing w:after="20" w:before="20"/>
+            </w:pPr>
+            <w:r>
+              <w:rPr>
+                <w:b w:val="false"/>
+                <w:bCs w:val="false"/>
+                <w:i w:val="false"/>
+                <w:iCs w:val="false"/>
+              </w:rPr>
+              <w:t xml:space="preserve">cyl</w:t>
+            </w:r>
+          </w:p>
+        </w:tc>
+        <w:tc>
+          <w:tcPr>
+            <w:tcW w:type="dxa" w:w="2256"/>
+            <w:tcBorders>
+              <w:top w:val="single" w:color="B8C4CE" w:sz="1"/>
+              <w:left w:val="single" w:color="B8C4CE" w:sz="1"/>
+              <w:bottom w:val="single" w:color="B8C4CE" w:sz="1"/>
+              <w:right w:val="single" w:color="B8C4CE" w:sz="1"/>
+            </w:tcBorders>
+            <w:tcMar>
+              <w:top w:type="dxa" w:w="60"/>
+              <w:left w:type="dxa" w:w="100"/>
+              <w:bottom w:type="dxa" w:w="60"/>
+              <w:right w:type="dxa" w:w="100"/>
+            </w:tcMar>
+            <w:vAlign w:val="center"/>
+          </w:tcPr>
+          <w:p>
+            <w:pPr>
+              <w:spacing w:after="20" w:before="20"/>
+            </w:pPr>
+            <w:r>
+              <w:rPr>
+                <w:b w:val="false"/>
+                <w:bCs w:val="false"/>
+                <w:i w:val="false"/>
+                <w:iCs w:val="false"/>
+              </w:rPr>
+              <w:t xml:space="preserve">lahev</w:t>
+            </w:r>
+          </w:p>
+        </w:tc>
+        <w:tc>
+          <w:tcPr>
+            <w:tcW w:type="dxa" w:w="2258"/>
+            <w:tcBorders>
+              <w:top w:val="single" w:color="B8C4CE" w:sz="1"/>
+              <w:left w:val="single" w:color="B8C4CE" w:sz="1"/>
+              <w:bottom w:val="single" w:color="B8C4CE" w:sz="1"/>
+              <w:right w:val="single" w:color="B8C4CE" w:sz="1"/>
+            </w:tcBorders>
+            <w:tcMar>
+              <w:top w:type="dxa" w:w="60"/>
+              <w:left w:type="dxa" w:w="100"/>
+              <w:bottom w:type="dxa" w:w="60"/>
+              <w:right w:type="dxa" w:w="100"/>
+            </w:tcMar>
+            <w:vAlign w:val="center"/>
+          </w:tcPr>
+          <w:p>
+            <w:pPr>
+              <w:spacing w:after="20" w:before="20"/>
+            </w:pPr>
+            <w:r>
+              <w:rPr>
+                <w:b w:val="false"/>
+                <w:bCs w:val="false"/>
+                <w:i/>
+                <w:iCs/>
+              </w:rPr>
+              <w:t xml:space="preserve">V</w:t>
+            </w:r>
+            <w:r>
+              <w:rPr>
+                <w:b w:val="false"/>
+                <w:bCs w:val="false"/>
+                <w:i w:val="false"/>
+                <w:iCs w:val="false"/>
+                <w:vertAlign w:val="subscript"/>
+              </w:rPr>
+              <w:t xml:space="preserve">lahev</w:t>
+            </w:r>
+          </w:p>
+        </w:tc>
+      </w:tr>
+      <w:tr>
+        <w:trPr>
+          <w:tblHeader w:val="false"/>
+        </w:trPr>
+        <w:tc>
+          <w:tcPr>
+            <w:tcW w:type="dxa" w:w="2256"/>
+            <w:tcBorders>
+              <w:top w:val="single" w:color="B8C4CE" w:sz="1"/>
+              <w:left w:val="single" w:color="B8C4CE" w:sz="1"/>
+              <w:bottom w:val="single" w:color="B8C4CE" w:sz="1"/>
+              <w:right w:val="single" w:color="B8C4CE" w:sz="1"/>
+            </w:tcBorders>
+            <w:tcMar>
+              <w:top w:type="dxa" w:w="60"/>
+              <w:left w:type="dxa" w:w="100"/>
+              <w:bottom w:type="dxa" w:w="60"/>
+              <w:right w:type="dxa" w:w="100"/>
+            </w:tcMar>
+            <w:vAlign w:val="center"/>
+          </w:tcPr>
+          <w:p>
+            <w:pPr>
+              <w:spacing w:after="20" w:before="20"/>
+            </w:pPr>
+            <w:r>
+              <w:rPr>
+                <w:b w:val="false"/>
+                <w:bCs w:val="false"/>
+                <w:i w:val="false"/>
+                <w:iCs w:val="false"/>
+              </w:rPr>
+              <w:t xml:space="preserve">počáteční tlak</w:t>
+            </w:r>
+          </w:p>
+        </w:tc>
+        <w:tc>
+          <w:tcPr>
+            <w:tcW w:type="dxa" w:w="2256"/>
+            <w:tcBorders>
+              <w:top w:val="single" w:color="B8C4CE" w:sz="1"/>
+              <w:left w:val="single" w:color="B8C4CE" w:sz="1"/>
+              <w:bottom w:val="single" w:color="B8C4CE" w:sz="1"/>
+              <w:right w:val="single" w:color="B8C4CE" w:sz="1"/>
+            </w:tcBorders>
+            <w:tcMar>
+              <w:top w:type="dxa" w:w="60"/>
+              <w:left w:type="dxa" w:w="100"/>
+              <w:bottom w:type="dxa" w:w="60"/>
+              <w:right w:type="dxa" w:w="100"/>
+            </w:tcMar>
+            <w:vAlign w:val="center"/>
+          </w:tcPr>
+          <w:p>
+            <w:pPr>
+              <w:spacing w:after="20" w:before="20"/>
+            </w:pPr>
+            <w:r>
+              <w:rPr>
+                <w:b w:val="false"/>
+                <w:bCs w:val="false"/>
+                <w:i w:val="false"/>
+                <w:iCs w:val="false"/>
+              </w:rPr>
+              <w:t xml:space="preserve">start</w:t>
+            </w:r>
+          </w:p>
+        </w:tc>
+        <w:tc>
+          <w:tcPr>
+            <w:tcW w:type="dxa" w:w="2256"/>
+            <w:tcBorders>
+              <w:top w:val="single" w:color="B8C4CE" w:sz="1"/>
+              <w:left w:val="single" w:color="B8C4CE" w:sz="1"/>
+              <w:bottom w:val="single" w:color="B8C4CE" w:sz="1"/>
+              <w:right w:val="single" w:color="B8C4CE" w:sz="1"/>
+            </w:tcBorders>
+            <w:tcMar>
+              <w:top w:type="dxa" w:w="60"/>
+              <w:left w:type="dxa" w:w="100"/>
+              <w:bottom w:type="dxa" w:w="60"/>
+              <w:right w:type="dxa" w:w="100"/>
+            </w:tcMar>
+            <w:vAlign w:val="center"/>
+          </w:tcPr>
+          <w:p>
+            <w:pPr>
+              <w:spacing w:after="20" w:before="20"/>
+            </w:pPr>
+            <w:r>
+              <w:rPr>
+                <w:b w:val="false"/>
+                <w:bCs w:val="false"/>
+                <w:i w:val="false"/>
+                <w:iCs w:val="false"/>
+              </w:rPr>
+              <w:t xml:space="preserve">poč</w:t>
+            </w:r>
+          </w:p>
+        </w:tc>
+        <w:tc>
+          <w:tcPr>
+            <w:tcW w:type="dxa" w:w="2258"/>
+            <w:tcBorders>
+              <w:top w:val="single" w:color="B8C4CE" w:sz="1"/>
+              <w:left w:val="single" w:color="B8C4CE" w:sz="1"/>
+              <w:bottom w:val="single" w:color="B8C4CE" w:sz="1"/>
+              <w:right w:val="single" w:color="B8C4CE" w:sz="1"/>
+            </w:tcBorders>
+            <w:tcMar>
+              <w:top w:type="dxa" w:w="60"/>
+              <w:left w:type="dxa" w:w="100"/>
+              <w:bottom w:type="dxa" w:w="60"/>
+              <w:right w:type="dxa" w:w="100"/>
+            </w:tcMar>
+            <w:vAlign w:val="center"/>
+          </w:tcPr>
+          <w:p>
+            <w:pPr>
+              <w:spacing w:after="20" w:before="20"/>
+            </w:pPr>
+            <w:r>
+              <w:rPr>
+                <w:b w:val="false"/>
+                <w:bCs w:val="false"/>
+                <w:i/>
+                <w:iCs/>
+              </w:rPr>
+              <w:t xml:space="preserve">p</w:t>
+            </w:r>
+            <w:r>
+              <w:rPr>
+                <w:b w:val="false"/>
+                <w:bCs w:val="false"/>
+                <w:i w:val="false"/>
+                <w:iCs w:val="false"/>
+                <w:vertAlign w:val="subscript"/>
+              </w:rPr>
+              <w:t xml:space="preserve">poč</w:t>
+            </w:r>
+          </w:p>
+        </w:tc>
+      </w:tr>
+      <w:tr>
+        <w:trPr>
+          <w:tblHeader w:val="false"/>
+        </w:trPr>
+        <w:tc>
+          <w:tcPr>
+            <w:tcW w:type="dxa" w:w="2256"/>
+            <w:tcBorders>
+              <w:top w:val="single" w:color="B8C4CE" w:sz="1"/>
+              <w:left w:val="single" w:color="B8C4CE" w:sz="1"/>
+              <w:bottom w:val="single" w:color="B8C4CE" w:sz="1"/>
+              <w:right w:val="single" w:color="B8C4CE" w:sz="1"/>
+            </w:tcBorders>
+            <w:tcMar>
+              <w:top w:type="dxa" w:w="60"/>
+              <w:left w:type="dxa" w:w="100"/>
+              <w:bottom w:type="dxa" w:w="60"/>
+              <w:right w:type="dxa" w:w="100"/>
+            </w:tcMar>
+            <w:vAlign w:val="center"/>
+          </w:tcPr>
+          <w:p>
+            <w:pPr>
+              <w:spacing w:after="20" w:before="20"/>
+            </w:pPr>
+            <w:r>
+              <w:rPr>
+                <w:b w:val="false"/>
+                <w:bCs w:val="false"/>
+                <w:i w:val="false"/>
+                <w:iCs w:val="false"/>
+              </w:rPr>
+              <w:t xml:space="preserve">rezerva</w:t>
+            </w:r>
+          </w:p>
+        </w:tc>
+        <w:tc>
+          <w:tcPr>
+            <w:tcW w:type="dxa" w:w="2256"/>
+            <w:tcBorders>
+              <w:top w:val="single" w:color="B8C4CE" w:sz="1"/>
+              <w:left w:val="single" w:color="B8C4CE" w:sz="1"/>
+              <w:bottom w:val="single" w:color="B8C4CE" w:sz="1"/>
+              <w:right w:val="single" w:color="B8C4CE" w:sz="1"/>
+            </w:tcBorders>
+            <w:tcMar>
+              <w:top w:type="dxa" w:w="60"/>
+              <w:left w:type="dxa" w:w="100"/>
+              <w:bottom w:type="dxa" w:w="60"/>
+              <w:right w:type="dxa" w:w="100"/>
+            </w:tcMar>
+            <w:vAlign w:val="center"/>
+          </w:tcPr>
+          <w:p>
+            <w:pPr>
+              <w:spacing w:after="20" w:before="20"/>
+            </w:pPr>
+            <w:r>
+              <w:rPr>
+                <w:b w:val="false"/>
+                <w:bCs w:val="false"/>
+                <w:i w:val="false"/>
+                <w:iCs w:val="false"/>
+              </w:rPr>
+              <w:t xml:space="preserve">reserve</w:t>
+            </w:r>
+          </w:p>
+        </w:tc>
+        <w:tc>
+          <w:tcPr>
+            <w:tcW w:type="dxa" w:w="2256"/>
+            <w:tcBorders>
+              <w:top w:val="single" w:color="B8C4CE" w:sz="1"/>
+              <w:left w:val="single" w:color="B8C4CE" w:sz="1"/>
+              <w:bottom w:val="single" w:color="B8C4CE" w:sz="1"/>
+              <w:right w:val="single" w:color="B8C4CE" w:sz="1"/>
+            </w:tcBorders>
+            <w:tcMar>
+              <w:top w:type="dxa" w:w="60"/>
+              <w:left w:type="dxa" w:w="100"/>
+              <w:bottom w:type="dxa" w:w="60"/>
+              <w:right w:type="dxa" w:w="100"/>
+            </w:tcMar>
+            <w:vAlign w:val="center"/>
+          </w:tcPr>
+          <w:p>
+            <w:pPr>
+              <w:spacing w:after="20" w:before="20"/>
+            </w:pPr>
+            <w:r>
+              <w:rPr>
+                <w:b w:val="false"/>
+                <w:bCs w:val="false"/>
+                <w:i w:val="false"/>
+                <w:iCs w:val="false"/>
+              </w:rPr>
+              <w:t xml:space="preserve">rez</w:t>
+            </w:r>
+          </w:p>
+        </w:tc>
+        <w:tc>
+          <w:tcPr>
+            <w:tcW w:type="dxa" w:w="2258"/>
+            <w:tcBorders>
+              <w:top w:val="single" w:color="B8C4CE" w:sz="1"/>
+              <w:left w:val="single" w:color="B8C4CE" w:sz="1"/>
+              <w:bottom w:val="single" w:color="B8C4CE" w:sz="1"/>
+              <w:right w:val="single" w:color="B8C4CE" w:sz="1"/>
+            </w:tcBorders>
+            <w:tcMar>
+              <w:top w:type="dxa" w:w="60"/>
+              <w:left w:type="dxa" w:w="100"/>
+              <w:bottom w:type="dxa" w:w="60"/>
+              <w:right w:type="dxa" w:w="100"/>
+            </w:tcMar>
+            <w:vAlign w:val="center"/>
+          </w:tcPr>
+          <w:p>
+            <w:pPr>
+              <w:spacing w:after="20" w:before="20"/>
+            </w:pPr>
+            <w:r>
+              <w:rPr>
+                <w:b w:val="false"/>
+                <w:bCs w:val="false"/>
+                <w:i/>
+                <w:iCs/>
+              </w:rPr>
+              <w:t xml:space="preserve">p</w:t>
+            </w:r>
+            <w:r>
+              <w:rPr>
+                <w:b w:val="false"/>
+                <w:bCs w:val="false"/>
+                <w:i w:val="false"/>
+                <w:iCs w:val="false"/>
+                <w:vertAlign w:val="subscript"/>
+              </w:rPr>
+              <w:t xml:space="preserve">rez</w:t>
+            </w:r>
+          </w:p>
+        </w:tc>
+      </w:tr>
+      <w:tr>
+        <w:trPr>
+          <w:tblHeader w:val="false"/>
+        </w:trPr>
+        <w:tc>
+          <w:tcPr>
+            <w:tcW w:type="dxa" w:w="2256"/>
+            <w:tcBorders>
+              <w:top w:val="single" w:color="B8C4CE" w:sz="1"/>
+              <w:left w:val="single" w:color="B8C4CE" w:sz="1"/>
+              <w:bottom w:val="single" w:color="B8C4CE" w:sz="1"/>
+              <w:right w:val="single" w:color="B8C4CE" w:sz="1"/>
+            </w:tcBorders>
+            <w:tcMar>
+              <w:top w:type="dxa" w:w="60"/>
+              <w:left w:type="dxa" w:w="100"/>
+              <w:bottom w:type="dxa" w:w="60"/>
+              <w:right w:type="dxa" w:w="100"/>
+            </w:tcMar>
+            <w:vAlign w:val="center"/>
+          </w:tcPr>
+          <w:p>
+            <w:pPr>
+              <w:spacing w:after="20" w:before="20"/>
+            </w:pPr>
+            <w:r>
+              <w:rPr>
+                <w:b w:val="false"/>
+                <w:bCs w:val="false"/>
+                <w:i w:val="false"/>
+                <w:iCs w:val="false"/>
+              </w:rPr>
+              <w:t xml:space="preserve">průměrný</w:t>
+            </w:r>
+          </w:p>
+        </w:tc>
+        <w:tc>
+          <w:tcPr>
+            <w:tcW w:type="dxa" w:w="2256"/>
+            <w:tcBorders>
+              <w:top w:val="single" w:color="B8C4CE" w:sz="1"/>
+              <w:left w:val="single" w:color="B8C4CE" w:sz="1"/>
+              <w:bottom w:val="single" w:color="B8C4CE" w:sz="1"/>
+              <w:right w:val="single" w:color="B8C4CE" w:sz="1"/>
+            </w:tcBorders>
+            <w:tcMar>
+              <w:top w:type="dxa" w:w="60"/>
+              <w:left w:type="dxa" w:w="100"/>
+              <w:bottom w:type="dxa" w:w="60"/>
+              <w:right w:type="dxa" w:w="100"/>
+            </w:tcMar>
+            <w:vAlign w:val="center"/>
+          </w:tcPr>
+          <w:p>
+            <w:pPr>
+              <w:spacing w:after="20" w:before="20"/>
+            </w:pPr>
+            <w:r>
+              <w:rPr>
+                <w:b w:val="false"/>
+                <w:bCs w:val="false"/>
+                <w:i w:val="false"/>
+                <w:iCs w:val="false"/>
+              </w:rPr>
+              <w:t xml:space="preserve">avg</w:t>
+            </w:r>
+          </w:p>
+        </w:tc>
+        <w:tc>
+          <w:tcPr>
+            <w:tcW w:type="dxa" w:w="2256"/>
+            <w:tcBorders>
+              <w:top w:val="single" w:color="B8C4CE" w:sz="1"/>
+              <w:left w:val="single" w:color="B8C4CE" w:sz="1"/>
+              <w:bottom w:val="single" w:color="B8C4CE" w:sz="1"/>
+              <w:right w:val="single" w:color="B8C4CE" w:sz="1"/>
+            </w:tcBorders>
+            <w:tcMar>
+              <w:top w:type="dxa" w:w="60"/>
+              <w:left w:type="dxa" w:w="100"/>
+              <w:bottom w:type="dxa" w:w="60"/>
+              <w:right w:type="dxa" w:w="100"/>
+            </w:tcMar>
+            <w:vAlign w:val="center"/>
+          </w:tcPr>
+          <w:p>
+            <w:pPr>
+              <w:spacing w:after="20" w:before="20"/>
+            </w:pPr>
+            <w:r>
+              <w:rPr>
+                <w:b w:val="false"/>
+                <w:bCs w:val="false"/>
+                <w:i w:val="false"/>
+                <w:iCs w:val="false"/>
+              </w:rPr>
+              <w:t xml:space="preserve">prům</w:t>
+            </w:r>
+          </w:p>
+        </w:tc>
+        <w:tc>
+          <w:tcPr>
+            <w:tcW w:type="dxa" w:w="2258"/>
+            <w:tcBorders>
+              <w:top w:val="single" w:color="B8C4CE" w:sz="1"/>
+              <w:left w:val="single" w:color="B8C4CE" w:sz="1"/>
+              <w:bottom w:val="single" w:color="B8C4CE" w:sz="1"/>
+              <w:right w:val="single" w:color="B8C4CE" w:sz="1"/>
+            </w:tcBorders>
+            <w:tcMar>
+              <w:top w:type="dxa" w:w="60"/>
+              <w:left w:type="dxa" w:w="100"/>
+              <w:bottom w:type="dxa" w:w="60"/>
+              <w:right w:type="dxa" w:w="100"/>
+            </w:tcMar>
+            <w:vAlign w:val="center"/>
+          </w:tcPr>
+          <w:p>
+            <w:pPr>
+              <w:spacing w:after="20" w:before="20"/>
+            </w:pPr>
+            <w:r>
+              <w:rPr>
+                <w:b w:val="false"/>
+                <w:bCs w:val="false"/>
+                <w:i/>
+                <w:iCs/>
+              </w:rPr>
+              <w:t xml:space="preserve">p</w:t>
+            </w:r>
+            <w:r>
+              <w:rPr>
+                <w:b w:val="false"/>
+                <w:bCs w:val="false"/>
+                <w:i w:val="false"/>
+                <w:iCs w:val="false"/>
+                <w:vertAlign w:val="subscript"/>
+              </w:rPr>
+              <w:t xml:space="preserve">prům</w:t>
+            </w:r>
+          </w:p>
+        </w:tc>
+      </w:tr>
+    </w:tbl>
+    <w:p>
+      <w:pPr>
+        <w:spacing w:after="160"/>
+      </w:pPr>
+    </w:p>
+    <w:p>
+      <w:pPr>
+        <w:spacing w:after="120"/>
+      </w:pPr>
+      <w:r>
+        <w:rPr>
+          <w:b/>
+          <w:bCs/>
+          <w:i w:val="false"/>
+          <w:iCs w:val="false"/>
+        </w:rPr>
+        <w:t xml:space="preserve">Zkratky se nepřekládají</w:t>
+      </w:r>
+      <w:r>
+        <w:rPr>
+          <w:b w:val="false"/>
+          <w:bCs w:val="false"/>
+          <w:i w:val="false"/>
+          <w:iCs w:val="false"/>
+        </w:rPr>
+        <w:t xml:space="preserve"> (§5): </w:t>
+      </w:r>
+      <w:r>
+        <w:rPr>
+          <w:rFonts w:ascii="Consolas" w:cs="Consolas" w:eastAsia="Consolas" w:hAnsi="Consolas"/>
+          <w:b w:val="false"/>
+          <w:bCs w:val="false"/>
+          <w:i w:val="false"/>
+          <w:iCs w:val="false"/>
+          <w:color w:val="8B2500"/>
+          <w:sz w:val="20"/>
+          <w:szCs w:val="20"/>
+        </w:rPr>
+        <w:t xml:space="preserve">SAC</w:t>
+      </w:r>
+      <w:r>
+        <w:rPr>
+          <w:b w:val="false"/>
+          <w:bCs w:val="false"/>
+          <w:i w:val="false"/>
+          <w:iCs w:val="false"/>
+        </w:rPr>
+        <w:t xml:space="preserve">, </w:t>
+      </w:r>
+      <w:r>
+        <w:rPr>
+          <w:rFonts w:ascii="Consolas" w:cs="Consolas" w:eastAsia="Consolas" w:hAnsi="Consolas"/>
+          <w:b w:val="false"/>
+          <w:bCs w:val="false"/>
+          <w:i w:val="false"/>
+          <w:iCs w:val="false"/>
+          <w:color w:val="8B2500"/>
+          <w:sz w:val="20"/>
+          <w:szCs w:val="20"/>
+        </w:rPr>
+        <w:t xml:space="preserve">MOD</w:t>
+      </w:r>
+      <w:r>
+        <w:rPr>
+          <w:b w:val="false"/>
+          <w:bCs w:val="false"/>
+          <w:i w:val="false"/>
+          <w:iCs w:val="false"/>
+        </w:rPr>
+        <w:t xml:space="preserve">, </w:t>
+      </w:r>
+      <w:r>
+        <w:rPr>
+          <w:rFonts w:ascii="Consolas" w:cs="Consolas" w:eastAsia="Consolas" w:hAnsi="Consolas"/>
+          <w:b w:val="false"/>
+          <w:bCs w:val="false"/>
+          <w:i w:val="false"/>
+          <w:iCs w:val="false"/>
+          <w:color w:val="8B2500"/>
+          <w:sz w:val="20"/>
+          <w:szCs w:val="20"/>
+        </w:rPr>
+        <w:t xml:space="preserve">OTU</w:t>
+      </w:r>
+      <w:r>
+        <w:rPr>
+          <w:b w:val="false"/>
+          <w:bCs w:val="false"/>
+          <w:i w:val="false"/>
+          <w:iCs w:val="false"/>
+        </w:rPr>
+        <w:t xml:space="preserve">, </w:t>
+      </w:r>
+      <w:r>
+        <w:rPr>
+          <w:rFonts w:ascii="Consolas" w:cs="Consolas" w:eastAsia="Consolas" w:hAnsi="Consolas"/>
+          <w:b w:val="false"/>
+          <w:bCs w:val="false"/>
+          <w:i w:val="false"/>
+          <w:iCs w:val="false"/>
+          <w:color w:val="8B2500"/>
+          <w:sz w:val="20"/>
+          <w:szCs w:val="20"/>
+        </w:rPr>
+        <w:t xml:space="preserve">NDL</w:t>
+      </w:r>
+      <w:r>
+        <w:rPr>
+          <w:b w:val="false"/>
+          <w:bCs w:val="false"/>
+          <w:i w:val="false"/>
+          <w:iCs w:val="false"/>
+        </w:rPr>
+        <w:t xml:space="preserve">, </w:t>
+      </w:r>
+      <w:r>
+        <w:rPr>
+          <w:rFonts w:ascii="Consolas" w:cs="Consolas" w:eastAsia="Consolas" w:hAnsi="Consolas"/>
+          <w:b w:val="false"/>
+          <w:bCs w:val="false"/>
+          <w:i w:val="false"/>
+          <w:iCs w:val="false"/>
+          <w:color w:val="8B2500"/>
+          <w:sz w:val="20"/>
+          <w:szCs w:val="20"/>
+        </w:rPr>
+        <w:t xml:space="preserve">GF</w:t>
+      </w:r>
+      <w:r>
+        <w:rPr>
+          <w:b w:val="false"/>
+          <w:bCs w:val="false"/>
+          <w:i w:val="false"/>
+          <w:iCs w:val="false"/>
+        </w:rPr>
+        <w:t xml:space="preserve"> zůstávají ve všech jazycích stejné — ve vzorci ale musí být stojatě (</w:t>
+      </w:r>
+      <w:r>
+        <w:rPr>
+          <w:rFonts w:ascii="Consolas" w:cs="Consolas" w:eastAsia="Consolas" w:hAnsi="Consolas"/>
+          <w:b w:val="false"/>
+          <w:bCs w:val="false"/>
+          <w:i w:val="false"/>
+          <w:iCs w:val="false"/>
+          <w:color w:val="8B2500"/>
+          <w:sz w:val="20"/>
+          <w:szCs w:val="20"/>
+        </w:rPr>
+        <w:t xml:space="preserve">\mathrm{SAC}</w:t>
+      </w:r>
+      <w:r>
+        <w:rPr>
+          <w:b w:val="false"/>
+          <w:bCs w:val="false"/>
+          <w:i w:val="false"/>
+          <w:iCs w:val="false"/>
+        </w:rPr>
+        <w:t xml:space="preserve">), jinak je KaTeX vysází jako součin kurzívních písmen </w:t>
+      </w:r>
+      <w:r>
+        <w:rPr>
+          <w:b w:val="false"/>
+          <w:bCs w:val="false"/>
+          <w:i/>
+          <w:iCs/>
+        </w:rPr>
+        <w:t xml:space="preserve">S</w:t>
+      </w:r>
+      <w:r>
+        <w:rPr>
+          <w:b w:val="false"/>
+          <w:bCs w:val="false"/>
+          <w:i w:val="false"/>
+          <w:iCs w:val="false"/>
+        </w:rPr>
+        <w:t xml:space="preserve">·</w:t>
+      </w:r>
+      <w:r>
+        <w:rPr>
+          <w:b w:val="false"/>
+          <w:bCs w:val="false"/>
+          <w:i/>
+          <w:iCs/>
+        </w:rPr>
+        <w:t xml:space="preserve">A</w:t>
+      </w:r>
+      <w:r>
+        <w:rPr>
+          <w:b w:val="false"/>
+          <w:bCs w:val="false"/>
+          <w:i w:val="false"/>
+          <w:iCs w:val="false"/>
+        </w:rPr>
+        <w:t xml:space="preserve">·</w:t>
+      </w:r>
+      <w:r>
+        <w:rPr>
+          <w:b w:val="false"/>
+          <w:bCs w:val="false"/>
+          <w:i/>
+          <w:iCs/>
+        </w:rPr>
+        <w:t xml:space="preserve">C</w:t>
+      </w:r>
+      <w:r>
+        <w:rPr>
+          <w:b w:val="false"/>
+          <w:bCs w:val="false"/>
+          <w:i w:val="false"/>
+          <w:iCs w:val="false"/>
+        </w:rPr>
+        <w:t xml:space="preserve">.</w:t>
+      </w:r>
+    </w:p>
+    <w:p>
+      <w:pPr>
+        <w:spacing w:after="120"/>
+      </w:pPr>
+      <w:r>
+        <w:rPr>
+          <w:b/>
+          <w:bCs/>
+          <w:i w:val="false"/>
+          <w:iCs w:val="false"/>
+        </w:rPr>
+        <w:t xml:space="preserve">Vyřešeno ve fázi 2:</w:t>
+      </w:r>
+      <w:r>
+        <w:rPr>
+          <w:b w:val="false"/>
+          <w:bCs w:val="false"/>
+          <w:i w:val="false"/>
+          <w:iCs w:val="false"/>
+        </w:rPr>
+        <w:t xml:space="preserve"> vzorce se sázejí z jednoho anglického zdroje a překládá je </w:t>
+      </w:r>
+      <w:r>
+        <w:rPr>
+          <w:rFonts w:ascii="Consolas" w:cs="Consolas" w:eastAsia="Consolas" w:hAnsi="Consolas"/>
+          <w:b w:val="false"/>
+          <w:bCs w:val="false"/>
+          <w:i w:val="false"/>
+          <w:iCs w:val="false"/>
+          <w:color w:val="8B2500"/>
+          <w:sz w:val="20"/>
+          <w:szCs w:val="20"/>
+        </w:rPr>
+        <w:t xml:space="preserve">localizeLatex()</w:t>
+      </w:r>
+      <w:r>
+        <w:rPr>
+          <w:b w:val="false"/>
+          <w:bCs w:val="false"/>
+          <w:i w:val="false"/>
+          <w:iCs w:val="false"/>
+        </w:rPr>
+        <w:t xml:space="preserve"> v </w:t>
+      </w:r>
+      <w:r>
+        <w:rPr>
+          <w:rFonts w:ascii="Consolas" w:cs="Consolas" w:eastAsia="Consolas" w:hAnsi="Consolas"/>
+          <w:b w:val="false"/>
+          <w:bCs w:val="false"/>
+          <w:i w:val="false"/>
+          <w:iCs w:val="false"/>
+          <w:color w:val="8B2500"/>
+          <w:sz w:val="20"/>
+          <w:szCs w:val="20"/>
+        </w:rPr>
+        <w:t xml:space="preserve">js/format.js</w:t>
+      </w:r>
+      <w:r>
+        <w:rPr>
+          <w:b w:val="false"/>
+          <w:bCs w:val="false"/>
+          <w:i w:val="false"/>
+          <w:iCs w:val="false"/>
+        </w:rPr>
+        <w:t xml:space="preserve"> — tabulka </w:t>
+      </w:r>
+      <w:r>
+        <w:rPr>
+          <w:rFonts w:ascii="Consolas" w:cs="Consolas" w:eastAsia="Consolas" w:hAnsi="Consolas"/>
+          <w:b w:val="false"/>
+          <w:bCs w:val="false"/>
+          <w:i w:val="false"/>
+          <w:iCs w:val="false"/>
+          <w:color w:val="8B2500"/>
+          <w:sz w:val="20"/>
+          <w:szCs w:val="20"/>
+        </w:rPr>
+        <w:t xml:space="preserve">UPRIGHT_CS</w:t>
+      </w:r>
+      <w:r>
+        <w:rPr>
+          <w:b w:val="false"/>
+          <w:bCs w:val="false"/>
+          <w:i w:val="false"/>
+          <w:iCs w:val="false"/>
+        </w:rPr>
+        <w:t xml:space="preserve"> je strojovým protějškem obou tabulek výše. Do HTML se tedy píše kanonický anglický tvar (</w:t>
+      </w:r>
+      <w:r>
+        <w:rPr>
+          <w:rFonts w:ascii="Consolas" w:cs="Consolas" w:eastAsia="Consolas" w:hAnsi="Consolas"/>
+          <w:b w:val="false"/>
+          <w:bCs w:val="false"/>
+          <w:i w:val="false"/>
+          <w:iCs w:val="false"/>
+          <w:color w:val="8B2500"/>
+          <w:sz w:val="20"/>
+          <w:szCs w:val="20"/>
+        </w:rPr>
+        <w:t xml:space="preserve">p_{\mathrm{tot}}</w:t>
+      </w:r>
+      <w:r>
+        <w:rPr>
+          <w:b w:val="false"/>
+          <w:bCs w:val="false"/>
+          <w:i w:val="false"/>
+          <w:iCs w:val="false"/>
+        </w:rPr>
+        <w:t xml:space="preserve">) a český čtenář dostane </w:t>
+      </w:r>
+      <w:r>
+        <w:rPr>
+          <w:rFonts w:ascii="Consolas" w:cs="Consolas" w:eastAsia="Consolas" w:hAnsi="Consolas"/>
+          <w:b w:val="false"/>
+          <w:bCs w:val="false"/>
+          <w:i w:val="false"/>
+          <w:iCs w:val="false"/>
+          <w:color w:val="8B2500"/>
+          <w:sz w:val="20"/>
+          <w:szCs w:val="20"/>
+        </w:rPr>
+        <w:t xml:space="preserve">p_{\mathrm{celk}}</w:t>
+      </w:r>
+      <w:r>
+        <w:rPr>
+          <w:b w:val="false"/>
+          <w:bCs w:val="false"/>
+          <w:i w:val="false"/>
+          <w:iCs w:val="false"/>
+        </w:rPr>
+        <w:t xml:space="preserve">. Popisky grafů jdou přes </w:t>
+      </w:r>
+      <w:r>
+        <w:rPr>
+          <w:rFonts w:ascii="Consolas" w:cs="Consolas" w:eastAsia="Consolas" w:hAnsi="Consolas"/>
+          <w:b w:val="false"/>
+          <w:bCs w:val="false"/>
+          <w:i w:val="false"/>
+          <w:iCs w:val="false"/>
+          <w:color w:val="8B2500"/>
+          <w:sz w:val="20"/>
+          <w:szCs w:val="20"/>
+        </w:rPr>
+        <w:t xml:space="preserve">locales/*.json</w:t>
+      </w:r>
+      <w:r>
+        <w:rPr>
+          <w:b w:val="false"/>
+          <w:bCs w:val="false"/>
+          <w:i w:val="false"/>
+          <w:iCs w:val="false"/>
+        </w:rPr>
+        <w:t xml:space="preserve"> a řídí se stejným pravidlem.</w:t>
       </w:r>
     </w:p>
     <w:p>
@@ -16758,6 +18007,147 @@
                 <w:iCs w:val="false"/>
               </w:rPr>
               <w:t xml:space="preserve">Bühlmannova notace</w:t>
+            </w:r>
+          </w:p>
+        </w:tc>
+      </w:tr>
+      <w:tr>
+        <w:trPr>
+          <w:tblHeader w:val="false"/>
+        </w:trPr>
+        <w:tc>
+          <w:tcPr>
+            <w:tcW w:type="dxa" w:w="3008"/>
+            <w:tcBorders>
+              <w:top w:val="single" w:color="B8C4CE" w:sz="1"/>
+              <w:left w:val="single" w:color="B8C4CE" w:sz="1"/>
+              <w:bottom w:val="single" w:color="B8C4CE" w:sz="1"/>
+              <w:right w:val="single" w:color="B8C4CE" w:sz="1"/>
+            </w:tcBorders>
+            <w:tcMar>
+              <w:top w:type="dxa" w:w="60"/>
+              <w:left w:type="dxa" w:w="100"/>
+              <w:bottom w:type="dxa" w:w="60"/>
+              <w:right w:type="dxa" w:w="100"/>
+            </w:tcMar>
+            <w:vAlign w:val="center"/>
+          </w:tcPr>
+          <w:p>
+            <w:pPr>
+              <w:spacing w:after="20" w:before="20"/>
+            </w:pPr>
+            <w:r>
+              <w:rPr>
+                <w:b w:val="false"/>
+                <w:bCs w:val="false"/>
+                <w:i w:val="false"/>
+                <w:iCs w:val="false"/>
+              </w:rPr>
+              <w:t xml:space="preserve">✗ </w:t>
+            </w:r>
+            <w:r>
+              <w:rPr>
+                <w:rFonts w:ascii="Consolas" w:cs="Consolas" w:eastAsia="Consolas" w:hAnsi="Consolas"/>
+                <w:b w:val="false"/>
+                <w:bCs w:val="false"/>
+                <w:i w:val="false"/>
+                <w:iCs w:val="false"/>
+                <w:color w:val="8B2500"/>
+                <w:sz w:val="20"/>
+                <w:szCs w:val="20"/>
+              </w:rPr>
+              <w:t xml:space="preserve">t½</w:t>
+            </w:r>
+            <w:r>
+              <w:rPr>
+                <w:b w:val="false"/>
+                <w:bCs w:val="false"/>
+                <w:i w:val="false"/>
+                <w:iCs w:val="false"/>
+              </w:rPr>
+              <w:t xml:space="preserve"> v HTML</w:t>
+            </w:r>
+          </w:p>
+        </w:tc>
+        <w:tc>
+          <w:tcPr>
+            <w:tcW w:type="dxa" w:w="3008"/>
+            <w:tcBorders>
+              <w:top w:val="single" w:color="B8C4CE" w:sz="1"/>
+              <w:left w:val="single" w:color="B8C4CE" w:sz="1"/>
+              <w:bottom w:val="single" w:color="B8C4CE" w:sz="1"/>
+              <w:right w:val="single" w:color="B8C4CE" w:sz="1"/>
+            </w:tcBorders>
+            <w:tcMar>
+              <w:top w:type="dxa" w:w="60"/>
+              <w:left w:type="dxa" w:w="100"/>
+              <w:bottom w:type="dxa" w:w="60"/>
+              <w:right w:type="dxa" w:w="100"/>
+            </w:tcMar>
+            <w:vAlign w:val="center"/>
+          </w:tcPr>
+          <w:p>
+            <w:pPr>
+              <w:spacing w:after="20" w:before="20"/>
+            </w:pPr>
+            <w:r>
+              <w:rPr>
+                <w:rFonts w:ascii="Consolas" w:cs="Consolas" w:eastAsia="Consolas" w:hAnsi="Consolas"/>
+                <w:b w:val="false"/>
+                <w:bCs w:val="false"/>
+                <w:i/>
+                <w:iCs/>
+                <w:color w:val="8B2500"/>
+                <w:sz w:val="20"/>
+                <w:szCs w:val="20"/>
+              </w:rPr>
+              <w:t xml:space="preserve">t</w:t>
+            </w:r>
+            <w:r>
+              <w:rPr>
+                <w:rFonts w:ascii="Consolas" w:cs="Consolas" w:eastAsia="Consolas" w:hAnsi="Consolas"/>
+                <w:b w:val="false"/>
+                <w:bCs w:val="false"/>
+                <w:i w:val="false"/>
+                <w:iCs w:val="false"/>
+                <w:color w:val="8B2500"/>
+                <w:sz w:val="20"/>
+                <w:szCs w:val="20"/>
+                <w:vertAlign w:val="subscript"/>
+              </w:rPr>
+              <w:t xml:space="preserve">1/2</w:t>
+            </w:r>
+          </w:p>
+        </w:tc>
+        <w:tc>
+          <w:tcPr>
+            <w:tcW w:type="dxa" w:w="3010"/>
+            <w:tcBorders>
+              <w:top w:val="single" w:color="B8C4CE" w:sz="1"/>
+              <w:left w:val="single" w:color="B8C4CE" w:sz="1"/>
+              <w:bottom w:val="single" w:color="B8C4CE" w:sz="1"/>
+              <w:right w:val="single" w:color="B8C4CE" w:sz="1"/>
+            </w:tcBorders>
+            <w:tcMar>
+              <w:top w:type="dxa" w:w="60"/>
+              <w:left w:type="dxa" w:w="100"/>
+              <w:bottom w:type="dxa" w:w="60"/>
+              <w:right w:type="dxa" w:w="100"/>
+            </w:tcMar>
+            <w:vAlign w:val="center"/>
+          </w:tcPr>
+          <w:p>
+            <w:pPr>
+              <w:spacing w:after="20" w:before="20"/>
+            </w:pPr>
+            <w:r>
+              <w:rPr>
+                <w:b w:val="false"/>
+                <w:bCs w:val="false"/>
+                <w:i w:val="false"/>
+                <w:iCs w:val="false"/>
+              </w:rPr>
+              <w:t xml:space="preserve">U+00BD je kompatibilní znak, jako ℃ výše</w:t>
             </w:r>
           </w:p>
         </w:tc>

</xml_diff>

<commit_message>
Přegenerovat slovníček pro garanta a pojistit ho proti zastarání (#106)
Export .docx, který se sdílí s garantem, byl z #81, ale glossary.md se
od té doby změnil v #91 (poločas t(1/2)) a #98 (popisné indexy). Garant
by četl verzi, které chybí celá nová tabulka — 28 odstavců.

Konvertor se navíc nedal spustit tak, jak README popisovalo: package.json
má "type": "module", takže .js soubor s require() skončí na ReferenceError.
Přejmenováno na .cjs; dokumentovaný příkaz teď funguje.

Aby to znovu neuteklo, konvertor ukládá vedle dokumentu otisk předlohy
(.sha256) a nový test ho porovnává s aktuálním glossary.md. Úprava
slovníčku bez přegenerování tím shodí npm test.

Ověřeno: kurzíva 130, indexy 71, uniklý markup 0. Test ověřen i obráceně —
po změně glossary.md bez regenerace selže.

Testy: 341/341. Bez bumpu verze, do prohlížeče nic nejde.

Co-authored-by: Copilot <223556219+Copilot@users.noreply.github.com>
</commit_message>
<xml_diff>
--- a/docs/notation/export/slovnicek-velicin.docx
+++ b/docs/notation/export/slovnicek-velicin.docx
@@ -8130,7 +8130,7 @@
           <w:i w:val="false"/>
           <w:iCs w:val="false"/>
         </w:rPr>
-        <w:t xml:space="preserve">Důsledek, který zatím neřešíme:</w:t>
+        <w:t xml:space="preserve">Slova psaná ve vzorci celá.</w:t>
       </w:r>
       <w:r>
         <w:rPr>
@@ -8139,7 +8139,1256 @@
           <w:i w:val="false"/>
           <w:iCs w:val="false"/>
         </w:rPr>
-        <w:t xml:space="preserve"> popisky grafů jsou sdílené přes CZ/EN/ES, takže lokalizované indexy si vyžádají jejich převedení do i18n. To je práce fáze 2.</w:t>
+        <w:t xml:space="preserve"> Některé indexy nejsou zkratkou, ale běžným slovem; ve vzorci se sázejí stojatě a překládají stejně jako zkratky.</w:t>
+      </w:r>
+    </w:p>
+    <w:tbl>
+      <w:tblPr>
+        <w:tblW w:type="dxa" w:w="9026"/>
+        <w:tblBorders>
+          <w:top w:val="single" w:color="auto" w:sz="4"/>
+          <w:left w:val="single" w:color="auto" w:sz="4"/>
+          <w:bottom w:val="single" w:color="auto" w:sz="4"/>
+          <w:right w:val="single" w:color="auto" w:sz="4"/>
+          <w:insideH w:val="single" w:color="auto" w:sz="4"/>
+          <w:insideV w:val="single" w:color="auto" w:sz="4"/>
+        </w:tblBorders>
+      </w:tblPr>
+      <w:tblGrid>
+        <w:gridCol w:w="2256"/>
+        <w:gridCol w:w="2256"/>
+        <w:gridCol w:w="2256"/>
+        <w:gridCol w:w="2258"/>
+      </w:tblGrid>
+      <w:tr>
+        <w:trPr>
+          <w:tblHeader/>
+        </w:trPr>
+        <w:tc>
+          <w:tcPr>
+            <w:tcW w:type="dxa" w:w="2256"/>
+            <w:tcBorders>
+              <w:top w:val="single" w:color="B8C4CE" w:sz="1"/>
+              <w:left w:val="single" w:color="B8C4CE" w:sz="1"/>
+              <w:bottom w:val="single" w:color="B8C4CE" w:sz="1"/>
+              <w:right w:val="single" w:color="B8C4CE" w:sz="1"/>
+            </w:tcBorders>
+            <w:shd w:fill="DCE6F1" w:val="clear"/>
+            <w:tcMar>
+              <w:top w:type="dxa" w:w="60"/>
+              <w:left w:type="dxa" w:w="100"/>
+              <w:bottom w:type="dxa" w:w="60"/>
+              <w:right w:type="dxa" w:w="100"/>
+            </w:tcMar>
+            <w:vAlign w:val="center"/>
+          </w:tcPr>
+          <w:p>
+            <w:pPr>
+              <w:spacing w:after="20" w:before="20"/>
+            </w:pPr>
+            <w:r>
+              <w:rPr>
+                <w:b/>
+                <w:bCs/>
+                <w:i w:val="false"/>
+                <w:iCs w:val="false"/>
+              </w:rPr>
+              <w:t xml:space="preserve">Význam</w:t>
+            </w:r>
+          </w:p>
+        </w:tc>
+        <w:tc>
+          <w:tcPr>
+            <w:tcW w:type="dxa" w:w="2256"/>
+            <w:tcBorders>
+              <w:top w:val="single" w:color="B8C4CE" w:sz="1"/>
+              <w:left w:val="single" w:color="B8C4CE" w:sz="1"/>
+              <w:bottom w:val="single" w:color="B8C4CE" w:sz="1"/>
+              <w:right w:val="single" w:color="B8C4CE" w:sz="1"/>
+            </w:tcBorders>
+            <w:shd w:fill="DCE6F1" w:val="clear"/>
+            <w:tcMar>
+              <w:top w:type="dxa" w:w="60"/>
+              <w:left w:type="dxa" w:w="100"/>
+              <w:bottom w:type="dxa" w:w="60"/>
+              <w:right w:type="dxa" w:w="100"/>
+            </w:tcMar>
+            <w:vAlign w:val="center"/>
+          </w:tcPr>
+          <w:p>
+            <w:pPr>
+              <w:spacing w:after="20" w:before="20"/>
+            </w:pPr>
+            <w:r>
+              <w:rPr>
+                <w:b/>
+                <w:bCs/>
+                <w:i w:val="false"/>
+                <w:iCs w:val="false"/>
+              </w:rPr>
+              <w:t xml:space="preserve">Zdroj (EN)</w:t>
+            </w:r>
+          </w:p>
+        </w:tc>
+        <w:tc>
+          <w:tcPr>
+            <w:tcW w:type="dxa" w:w="2256"/>
+            <w:tcBorders>
+              <w:top w:val="single" w:color="B8C4CE" w:sz="1"/>
+              <w:left w:val="single" w:color="B8C4CE" w:sz="1"/>
+              <w:bottom w:val="single" w:color="B8C4CE" w:sz="1"/>
+              <w:right w:val="single" w:color="B8C4CE" w:sz="1"/>
+            </w:tcBorders>
+            <w:shd w:fill="DCE6F1" w:val="clear"/>
+            <w:tcMar>
+              <w:top w:type="dxa" w:w="60"/>
+              <w:left w:type="dxa" w:w="100"/>
+              <w:bottom w:type="dxa" w:w="60"/>
+              <w:right w:type="dxa" w:w="100"/>
+            </w:tcMar>
+            <w:vAlign w:val="center"/>
+          </w:tcPr>
+          <w:p>
+            <w:pPr>
+              <w:spacing w:after="20" w:before="20"/>
+            </w:pPr>
+            <w:r>
+              <w:rPr>
+                <w:b/>
+                <w:bCs/>
+                <w:i w:val="false"/>
+                <w:iCs w:val="false"/>
+              </w:rPr>
+              <w:t xml:space="preserve">CZ</w:t>
+            </w:r>
+          </w:p>
+        </w:tc>
+        <w:tc>
+          <w:tcPr>
+            <w:tcW w:type="dxa" w:w="2258"/>
+            <w:tcBorders>
+              <w:top w:val="single" w:color="B8C4CE" w:sz="1"/>
+              <w:left w:val="single" w:color="B8C4CE" w:sz="1"/>
+              <w:bottom w:val="single" w:color="B8C4CE" w:sz="1"/>
+              <w:right w:val="single" w:color="B8C4CE" w:sz="1"/>
+            </w:tcBorders>
+            <w:shd w:fill="DCE6F1" w:val="clear"/>
+            <w:tcMar>
+              <w:top w:type="dxa" w:w="60"/>
+              <w:left w:type="dxa" w:w="100"/>
+              <w:bottom w:type="dxa" w:w="60"/>
+              <w:right w:type="dxa" w:w="100"/>
+            </w:tcMar>
+            <w:vAlign w:val="center"/>
+          </w:tcPr>
+          <w:p>
+            <w:pPr>
+              <w:spacing w:after="20" w:before="20"/>
+            </w:pPr>
+            <w:r>
+              <w:rPr>
+                <w:b/>
+                <w:bCs/>
+                <w:i w:val="false"/>
+                <w:iCs w:val="false"/>
+              </w:rPr>
+              <w:t xml:space="preserve">Příklad</w:t>
+            </w:r>
+          </w:p>
+        </w:tc>
+      </w:tr>
+      <w:tr>
+        <w:trPr>
+          <w:tblHeader w:val="false"/>
+        </w:trPr>
+        <w:tc>
+          <w:tcPr>
+            <w:tcW w:type="dxa" w:w="2256"/>
+            <w:tcBorders>
+              <w:top w:val="single" w:color="B8C4CE" w:sz="1"/>
+              <w:left w:val="single" w:color="B8C4CE" w:sz="1"/>
+              <w:bottom w:val="single" w:color="B8C4CE" w:sz="1"/>
+              <w:right w:val="single" w:color="B8C4CE" w:sz="1"/>
+            </w:tcBorders>
+            <w:tcMar>
+              <w:top w:type="dxa" w:w="60"/>
+              <w:left w:type="dxa" w:w="100"/>
+              <w:bottom w:type="dxa" w:w="60"/>
+              <w:right w:type="dxa" w:w="100"/>
+            </w:tcMar>
+            <w:vAlign w:val="center"/>
+          </w:tcPr>
+          <w:p>
+            <w:pPr>
+              <w:spacing w:after="20" w:before="20"/>
+            </w:pPr>
+            <w:r>
+              <w:rPr>
+                <w:b w:val="false"/>
+                <w:bCs w:val="false"/>
+                <w:i w:val="false"/>
+                <w:iCs w:val="false"/>
+              </w:rPr>
+              <w:t xml:space="preserve">hloubka</w:t>
+            </w:r>
+          </w:p>
+        </w:tc>
+        <w:tc>
+          <w:tcPr>
+            <w:tcW w:type="dxa" w:w="2256"/>
+            <w:tcBorders>
+              <w:top w:val="single" w:color="B8C4CE" w:sz="1"/>
+              <w:left w:val="single" w:color="B8C4CE" w:sz="1"/>
+              <w:bottom w:val="single" w:color="B8C4CE" w:sz="1"/>
+              <w:right w:val="single" w:color="B8C4CE" w:sz="1"/>
+            </w:tcBorders>
+            <w:tcMar>
+              <w:top w:type="dxa" w:w="60"/>
+              <w:left w:type="dxa" w:w="100"/>
+              <w:bottom w:type="dxa" w:w="60"/>
+              <w:right w:type="dxa" w:w="100"/>
+            </w:tcMar>
+            <w:vAlign w:val="center"/>
+          </w:tcPr>
+          <w:p>
+            <w:pPr>
+              <w:spacing w:after="20" w:before="20"/>
+            </w:pPr>
+            <w:r>
+              <w:rPr>
+                <w:b w:val="false"/>
+                <w:bCs w:val="false"/>
+                <w:i w:val="false"/>
+                <w:iCs w:val="false"/>
+              </w:rPr>
+              <w:t xml:space="preserve">depth</w:t>
+            </w:r>
+          </w:p>
+        </w:tc>
+        <w:tc>
+          <w:tcPr>
+            <w:tcW w:type="dxa" w:w="2256"/>
+            <w:tcBorders>
+              <w:top w:val="single" w:color="B8C4CE" w:sz="1"/>
+              <w:left w:val="single" w:color="B8C4CE" w:sz="1"/>
+              <w:bottom w:val="single" w:color="B8C4CE" w:sz="1"/>
+              <w:right w:val="single" w:color="B8C4CE" w:sz="1"/>
+            </w:tcBorders>
+            <w:tcMar>
+              <w:top w:type="dxa" w:w="60"/>
+              <w:left w:type="dxa" w:w="100"/>
+              <w:bottom w:type="dxa" w:w="60"/>
+              <w:right w:type="dxa" w:w="100"/>
+            </w:tcMar>
+            <w:vAlign w:val="center"/>
+          </w:tcPr>
+          <w:p>
+            <w:pPr>
+              <w:spacing w:after="20" w:before="20"/>
+            </w:pPr>
+            <w:r>
+              <w:rPr>
+                <w:b w:val="false"/>
+                <w:bCs w:val="false"/>
+                <w:i w:val="false"/>
+                <w:iCs w:val="false"/>
+              </w:rPr>
+              <w:t xml:space="preserve">hloubka</w:t>
+            </w:r>
+          </w:p>
+        </w:tc>
+        <w:tc>
+          <w:tcPr>
+            <w:tcW w:type="dxa" w:w="2258"/>
+            <w:tcBorders>
+              <w:top w:val="single" w:color="B8C4CE" w:sz="1"/>
+              <w:left w:val="single" w:color="B8C4CE" w:sz="1"/>
+              <w:bottom w:val="single" w:color="B8C4CE" w:sz="1"/>
+              <w:right w:val="single" w:color="B8C4CE" w:sz="1"/>
+            </w:tcBorders>
+            <w:tcMar>
+              <w:top w:type="dxa" w:w="60"/>
+              <w:left w:type="dxa" w:w="100"/>
+              <w:bottom w:type="dxa" w:w="60"/>
+              <w:right w:type="dxa" w:w="100"/>
+            </w:tcMar>
+            <w:vAlign w:val="center"/>
+          </w:tcPr>
+          <w:p>
+            <w:pPr>
+              <w:spacing w:after="20" w:before="20"/>
+            </w:pPr>
+            <w:r>
+              <w:rPr>
+                <w:b w:val="false"/>
+                <w:bCs w:val="false"/>
+                <w:i/>
+                <w:iCs/>
+              </w:rPr>
+              <w:t xml:space="preserve">p</w:t>
+            </w:r>
+            <w:r>
+              <w:rPr>
+                <w:b w:val="false"/>
+                <w:bCs w:val="false"/>
+                <w:i w:val="false"/>
+                <w:iCs w:val="false"/>
+                <w:vertAlign w:val="subscript"/>
+              </w:rPr>
+              <w:t xml:space="preserve">okol</w:t>
+            </w:r>
+            <w:r>
+              <w:rPr>
+                <w:b w:val="false"/>
+                <w:bCs w:val="false"/>
+                <w:i w:val="false"/>
+                <w:iCs w:val="false"/>
+              </w:rPr>
+              <w:t xml:space="preserve"> = 1 + hloubka / 10</w:t>
+            </w:r>
+          </w:p>
+        </w:tc>
+      </w:tr>
+      <w:tr>
+        <w:trPr>
+          <w:tblHeader w:val="false"/>
+        </w:trPr>
+        <w:tc>
+          <w:tcPr>
+            <w:tcW w:type="dxa" w:w="2256"/>
+            <w:tcBorders>
+              <w:top w:val="single" w:color="B8C4CE" w:sz="1"/>
+              <w:left w:val="single" w:color="B8C4CE" w:sz="1"/>
+              <w:bottom w:val="single" w:color="B8C4CE" w:sz="1"/>
+              <w:right w:val="single" w:color="B8C4CE" w:sz="1"/>
+            </w:tcBorders>
+            <w:tcMar>
+              <w:top w:type="dxa" w:w="60"/>
+              <w:left w:type="dxa" w:w="100"/>
+              <w:bottom w:type="dxa" w:w="60"/>
+              <w:right w:type="dxa" w:w="100"/>
+            </w:tcMar>
+            <w:vAlign w:val="center"/>
+          </w:tcPr>
+          <w:p>
+            <w:pPr>
+              <w:spacing w:after="20" w:before="20"/>
+            </w:pPr>
+            <w:r>
+              <w:rPr>
+                <w:b w:val="false"/>
+                <w:bCs w:val="false"/>
+                <w:i w:val="false"/>
+                <w:iCs w:val="false"/>
+              </w:rPr>
+              <w:t xml:space="preserve">lahev</w:t>
+            </w:r>
+          </w:p>
+        </w:tc>
+        <w:tc>
+          <w:tcPr>
+            <w:tcW w:type="dxa" w:w="2256"/>
+            <w:tcBorders>
+              <w:top w:val="single" w:color="B8C4CE" w:sz="1"/>
+              <w:left w:val="single" w:color="B8C4CE" w:sz="1"/>
+              <w:bottom w:val="single" w:color="B8C4CE" w:sz="1"/>
+              <w:right w:val="single" w:color="B8C4CE" w:sz="1"/>
+            </w:tcBorders>
+            <w:tcMar>
+              <w:top w:type="dxa" w:w="60"/>
+              <w:left w:type="dxa" w:w="100"/>
+              <w:bottom w:type="dxa" w:w="60"/>
+              <w:right w:type="dxa" w:w="100"/>
+            </w:tcMar>
+            <w:vAlign w:val="center"/>
+          </w:tcPr>
+          <w:p>
+            <w:pPr>
+              <w:spacing w:after="20" w:before="20"/>
+            </w:pPr>
+            <w:r>
+              <w:rPr>
+                <w:b w:val="false"/>
+                <w:bCs w:val="false"/>
+                <w:i w:val="false"/>
+                <w:iCs w:val="false"/>
+              </w:rPr>
+              <w:t xml:space="preserve">cyl</w:t>
+            </w:r>
+          </w:p>
+        </w:tc>
+        <w:tc>
+          <w:tcPr>
+            <w:tcW w:type="dxa" w:w="2256"/>
+            <w:tcBorders>
+              <w:top w:val="single" w:color="B8C4CE" w:sz="1"/>
+              <w:left w:val="single" w:color="B8C4CE" w:sz="1"/>
+              <w:bottom w:val="single" w:color="B8C4CE" w:sz="1"/>
+              <w:right w:val="single" w:color="B8C4CE" w:sz="1"/>
+            </w:tcBorders>
+            <w:tcMar>
+              <w:top w:type="dxa" w:w="60"/>
+              <w:left w:type="dxa" w:w="100"/>
+              <w:bottom w:type="dxa" w:w="60"/>
+              <w:right w:type="dxa" w:w="100"/>
+            </w:tcMar>
+            <w:vAlign w:val="center"/>
+          </w:tcPr>
+          <w:p>
+            <w:pPr>
+              <w:spacing w:after="20" w:before="20"/>
+            </w:pPr>
+            <w:r>
+              <w:rPr>
+                <w:b w:val="false"/>
+                <w:bCs w:val="false"/>
+                <w:i w:val="false"/>
+                <w:iCs w:val="false"/>
+              </w:rPr>
+              <w:t xml:space="preserve">lahev</w:t>
+            </w:r>
+          </w:p>
+        </w:tc>
+        <w:tc>
+          <w:tcPr>
+            <w:tcW w:type="dxa" w:w="2258"/>
+            <w:tcBorders>
+              <w:top w:val="single" w:color="B8C4CE" w:sz="1"/>
+              <w:left w:val="single" w:color="B8C4CE" w:sz="1"/>
+              <w:bottom w:val="single" w:color="B8C4CE" w:sz="1"/>
+              <w:right w:val="single" w:color="B8C4CE" w:sz="1"/>
+            </w:tcBorders>
+            <w:tcMar>
+              <w:top w:type="dxa" w:w="60"/>
+              <w:left w:type="dxa" w:w="100"/>
+              <w:bottom w:type="dxa" w:w="60"/>
+              <w:right w:type="dxa" w:w="100"/>
+            </w:tcMar>
+            <w:vAlign w:val="center"/>
+          </w:tcPr>
+          <w:p>
+            <w:pPr>
+              <w:spacing w:after="20" w:before="20"/>
+            </w:pPr>
+            <w:r>
+              <w:rPr>
+                <w:b w:val="false"/>
+                <w:bCs w:val="false"/>
+                <w:i/>
+                <w:iCs/>
+              </w:rPr>
+              <w:t xml:space="preserve">V</w:t>
+            </w:r>
+            <w:r>
+              <w:rPr>
+                <w:b w:val="false"/>
+                <w:bCs w:val="false"/>
+                <w:i w:val="false"/>
+                <w:iCs w:val="false"/>
+                <w:vertAlign w:val="subscript"/>
+              </w:rPr>
+              <w:t xml:space="preserve">lahev</w:t>
+            </w:r>
+          </w:p>
+        </w:tc>
+      </w:tr>
+      <w:tr>
+        <w:trPr>
+          <w:tblHeader w:val="false"/>
+        </w:trPr>
+        <w:tc>
+          <w:tcPr>
+            <w:tcW w:type="dxa" w:w="2256"/>
+            <w:tcBorders>
+              <w:top w:val="single" w:color="B8C4CE" w:sz="1"/>
+              <w:left w:val="single" w:color="B8C4CE" w:sz="1"/>
+              <w:bottom w:val="single" w:color="B8C4CE" w:sz="1"/>
+              <w:right w:val="single" w:color="B8C4CE" w:sz="1"/>
+            </w:tcBorders>
+            <w:tcMar>
+              <w:top w:type="dxa" w:w="60"/>
+              <w:left w:type="dxa" w:w="100"/>
+              <w:bottom w:type="dxa" w:w="60"/>
+              <w:right w:type="dxa" w:w="100"/>
+            </w:tcMar>
+            <w:vAlign w:val="center"/>
+          </w:tcPr>
+          <w:p>
+            <w:pPr>
+              <w:spacing w:after="20" w:before="20"/>
+            </w:pPr>
+            <w:r>
+              <w:rPr>
+                <w:b w:val="false"/>
+                <w:bCs w:val="false"/>
+                <w:i w:val="false"/>
+                <w:iCs w:val="false"/>
+              </w:rPr>
+              <w:t xml:space="preserve">počáteční tlak</w:t>
+            </w:r>
+          </w:p>
+        </w:tc>
+        <w:tc>
+          <w:tcPr>
+            <w:tcW w:type="dxa" w:w="2256"/>
+            <w:tcBorders>
+              <w:top w:val="single" w:color="B8C4CE" w:sz="1"/>
+              <w:left w:val="single" w:color="B8C4CE" w:sz="1"/>
+              <w:bottom w:val="single" w:color="B8C4CE" w:sz="1"/>
+              <w:right w:val="single" w:color="B8C4CE" w:sz="1"/>
+            </w:tcBorders>
+            <w:tcMar>
+              <w:top w:type="dxa" w:w="60"/>
+              <w:left w:type="dxa" w:w="100"/>
+              <w:bottom w:type="dxa" w:w="60"/>
+              <w:right w:type="dxa" w:w="100"/>
+            </w:tcMar>
+            <w:vAlign w:val="center"/>
+          </w:tcPr>
+          <w:p>
+            <w:pPr>
+              <w:spacing w:after="20" w:before="20"/>
+            </w:pPr>
+            <w:r>
+              <w:rPr>
+                <w:b w:val="false"/>
+                <w:bCs w:val="false"/>
+                <w:i w:val="false"/>
+                <w:iCs w:val="false"/>
+              </w:rPr>
+              <w:t xml:space="preserve">start</w:t>
+            </w:r>
+          </w:p>
+        </w:tc>
+        <w:tc>
+          <w:tcPr>
+            <w:tcW w:type="dxa" w:w="2256"/>
+            <w:tcBorders>
+              <w:top w:val="single" w:color="B8C4CE" w:sz="1"/>
+              <w:left w:val="single" w:color="B8C4CE" w:sz="1"/>
+              <w:bottom w:val="single" w:color="B8C4CE" w:sz="1"/>
+              <w:right w:val="single" w:color="B8C4CE" w:sz="1"/>
+            </w:tcBorders>
+            <w:tcMar>
+              <w:top w:type="dxa" w:w="60"/>
+              <w:left w:type="dxa" w:w="100"/>
+              <w:bottom w:type="dxa" w:w="60"/>
+              <w:right w:type="dxa" w:w="100"/>
+            </w:tcMar>
+            <w:vAlign w:val="center"/>
+          </w:tcPr>
+          <w:p>
+            <w:pPr>
+              <w:spacing w:after="20" w:before="20"/>
+            </w:pPr>
+            <w:r>
+              <w:rPr>
+                <w:b w:val="false"/>
+                <w:bCs w:val="false"/>
+                <w:i w:val="false"/>
+                <w:iCs w:val="false"/>
+              </w:rPr>
+              <w:t xml:space="preserve">poč</w:t>
+            </w:r>
+          </w:p>
+        </w:tc>
+        <w:tc>
+          <w:tcPr>
+            <w:tcW w:type="dxa" w:w="2258"/>
+            <w:tcBorders>
+              <w:top w:val="single" w:color="B8C4CE" w:sz="1"/>
+              <w:left w:val="single" w:color="B8C4CE" w:sz="1"/>
+              <w:bottom w:val="single" w:color="B8C4CE" w:sz="1"/>
+              <w:right w:val="single" w:color="B8C4CE" w:sz="1"/>
+            </w:tcBorders>
+            <w:tcMar>
+              <w:top w:type="dxa" w:w="60"/>
+              <w:left w:type="dxa" w:w="100"/>
+              <w:bottom w:type="dxa" w:w="60"/>
+              <w:right w:type="dxa" w:w="100"/>
+            </w:tcMar>
+            <w:vAlign w:val="center"/>
+          </w:tcPr>
+          <w:p>
+            <w:pPr>
+              <w:spacing w:after="20" w:before="20"/>
+            </w:pPr>
+            <w:r>
+              <w:rPr>
+                <w:b w:val="false"/>
+                <w:bCs w:val="false"/>
+                <w:i/>
+                <w:iCs/>
+              </w:rPr>
+              <w:t xml:space="preserve">p</w:t>
+            </w:r>
+            <w:r>
+              <w:rPr>
+                <w:b w:val="false"/>
+                <w:bCs w:val="false"/>
+                <w:i w:val="false"/>
+                <w:iCs w:val="false"/>
+                <w:vertAlign w:val="subscript"/>
+              </w:rPr>
+              <w:t xml:space="preserve">poč</w:t>
+            </w:r>
+          </w:p>
+        </w:tc>
+      </w:tr>
+      <w:tr>
+        <w:trPr>
+          <w:tblHeader w:val="false"/>
+        </w:trPr>
+        <w:tc>
+          <w:tcPr>
+            <w:tcW w:type="dxa" w:w="2256"/>
+            <w:tcBorders>
+              <w:top w:val="single" w:color="B8C4CE" w:sz="1"/>
+              <w:left w:val="single" w:color="B8C4CE" w:sz="1"/>
+              <w:bottom w:val="single" w:color="B8C4CE" w:sz="1"/>
+              <w:right w:val="single" w:color="B8C4CE" w:sz="1"/>
+            </w:tcBorders>
+            <w:tcMar>
+              <w:top w:type="dxa" w:w="60"/>
+              <w:left w:type="dxa" w:w="100"/>
+              <w:bottom w:type="dxa" w:w="60"/>
+              <w:right w:type="dxa" w:w="100"/>
+            </w:tcMar>
+            <w:vAlign w:val="center"/>
+          </w:tcPr>
+          <w:p>
+            <w:pPr>
+              <w:spacing w:after="20" w:before="20"/>
+            </w:pPr>
+            <w:r>
+              <w:rPr>
+                <w:b w:val="false"/>
+                <w:bCs w:val="false"/>
+                <w:i w:val="false"/>
+                <w:iCs w:val="false"/>
+              </w:rPr>
+              <w:t xml:space="preserve">rezerva</w:t>
+            </w:r>
+          </w:p>
+        </w:tc>
+        <w:tc>
+          <w:tcPr>
+            <w:tcW w:type="dxa" w:w="2256"/>
+            <w:tcBorders>
+              <w:top w:val="single" w:color="B8C4CE" w:sz="1"/>
+              <w:left w:val="single" w:color="B8C4CE" w:sz="1"/>
+              <w:bottom w:val="single" w:color="B8C4CE" w:sz="1"/>
+              <w:right w:val="single" w:color="B8C4CE" w:sz="1"/>
+            </w:tcBorders>
+            <w:tcMar>
+              <w:top w:type="dxa" w:w="60"/>
+              <w:left w:type="dxa" w:w="100"/>
+              <w:bottom w:type="dxa" w:w="60"/>
+              <w:right w:type="dxa" w:w="100"/>
+            </w:tcMar>
+            <w:vAlign w:val="center"/>
+          </w:tcPr>
+          <w:p>
+            <w:pPr>
+              <w:spacing w:after="20" w:before="20"/>
+            </w:pPr>
+            <w:r>
+              <w:rPr>
+                <w:b w:val="false"/>
+                <w:bCs w:val="false"/>
+                <w:i w:val="false"/>
+                <w:iCs w:val="false"/>
+              </w:rPr>
+              <w:t xml:space="preserve">reserve</w:t>
+            </w:r>
+          </w:p>
+        </w:tc>
+        <w:tc>
+          <w:tcPr>
+            <w:tcW w:type="dxa" w:w="2256"/>
+            <w:tcBorders>
+              <w:top w:val="single" w:color="B8C4CE" w:sz="1"/>
+              <w:left w:val="single" w:color="B8C4CE" w:sz="1"/>
+              <w:bottom w:val="single" w:color="B8C4CE" w:sz="1"/>
+              <w:right w:val="single" w:color="B8C4CE" w:sz="1"/>
+            </w:tcBorders>
+            <w:tcMar>
+              <w:top w:type="dxa" w:w="60"/>
+              <w:left w:type="dxa" w:w="100"/>
+              <w:bottom w:type="dxa" w:w="60"/>
+              <w:right w:type="dxa" w:w="100"/>
+            </w:tcMar>
+            <w:vAlign w:val="center"/>
+          </w:tcPr>
+          <w:p>
+            <w:pPr>
+              <w:spacing w:after="20" w:before="20"/>
+            </w:pPr>
+            <w:r>
+              <w:rPr>
+                <w:b w:val="false"/>
+                <w:bCs w:val="false"/>
+                <w:i w:val="false"/>
+                <w:iCs w:val="false"/>
+              </w:rPr>
+              <w:t xml:space="preserve">rez</w:t>
+            </w:r>
+          </w:p>
+        </w:tc>
+        <w:tc>
+          <w:tcPr>
+            <w:tcW w:type="dxa" w:w="2258"/>
+            <w:tcBorders>
+              <w:top w:val="single" w:color="B8C4CE" w:sz="1"/>
+              <w:left w:val="single" w:color="B8C4CE" w:sz="1"/>
+              <w:bottom w:val="single" w:color="B8C4CE" w:sz="1"/>
+              <w:right w:val="single" w:color="B8C4CE" w:sz="1"/>
+            </w:tcBorders>
+            <w:tcMar>
+              <w:top w:type="dxa" w:w="60"/>
+              <w:left w:type="dxa" w:w="100"/>
+              <w:bottom w:type="dxa" w:w="60"/>
+              <w:right w:type="dxa" w:w="100"/>
+            </w:tcMar>
+            <w:vAlign w:val="center"/>
+          </w:tcPr>
+          <w:p>
+            <w:pPr>
+              <w:spacing w:after="20" w:before="20"/>
+            </w:pPr>
+            <w:r>
+              <w:rPr>
+                <w:b w:val="false"/>
+                <w:bCs w:val="false"/>
+                <w:i/>
+                <w:iCs/>
+              </w:rPr>
+              <w:t xml:space="preserve">p</w:t>
+            </w:r>
+            <w:r>
+              <w:rPr>
+                <w:b w:val="false"/>
+                <w:bCs w:val="false"/>
+                <w:i w:val="false"/>
+                <w:iCs w:val="false"/>
+                <w:vertAlign w:val="subscript"/>
+              </w:rPr>
+              <w:t xml:space="preserve">rez</w:t>
+            </w:r>
+          </w:p>
+        </w:tc>
+      </w:tr>
+      <w:tr>
+        <w:trPr>
+          <w:tblHeader w:val="false"/>
+        </w:trPr>
+        <w:tc>
+          <w:tcPr>
+            <w:tcW w:type="dxa" w:w="2256"/>
+            <w:tcBorders>
+              <w:top w:val="single" w:color="B8C4CE" w:sz="1"/>
+              <w:left w:val="single" w:color="B8C4CE" w:sz="1"/>
+              <w:bottom w:val="single" w:color="B8C4CE" w:sz="1"/>
+              <w:right w:val="single" w:color="B8C4CE" w:sz="1"/>
+            </w:tcBorders>
+            <w:tcMar>
+              <w:top w:type="dxa" w:w="60"/>
+              <w:left w:type="dxa" w:w="100"/>
+              <w:bottom w:type="dxa" w:w="60"/>
+              <w:right w:type="dxa" w:w="100"/>
+            </w:tcMar>
+            <w:vAlign w:val="center"/>
+          </w:tcPr>
+          <w:p>
+            <w:pPr>
+              <w:spacing w:after="20" w:before="20"/>
+            </w:pPr>
+            <w:r>
+              <w:rPr>
+                <w:b w:val="false"/>
+                <w:bCs w:val="false"/>
+                <w:i w:val="false"/>
+                <w:iCs w:val="false"/>
+              </w:rPr>
+              <w:t xml:space="preserve">průměrný</w:t>
+            </w:r>
+          </w:p>
+        </w:tc>
+        <w:tc>
+          <w:tcPr>
+            <w:tcW w:type="dxa" w:w="2256"/>
+            <w:tcBorders>
+              <w:top w:val="single" w:color="B8C4CE" w:sz="1"/>
+              <w:left w:val="single" w:color="B8C4CE" w:sz="1"/>
+              <w:bottom w:val="single" w:color="B8C4CE" w:sz="1"/>
+              <w:right w:val="single" w:color="B8C4CE" w:sz="1"/>
+            </w:tcBorders>
+            <w:tcMar>
+              <w:top w:type="dxa" w:w="60"/>
+              <w:left w:type="dxa" w:w="100"/>
+              <w:bottom w:type="dxa" w:w="60"/>
+              <w:right w:type="dxa" w:w="100"/>
+            </w:tcMar>
+            <w:vAlign w:val="center"/>
+          </w:tcPr>
+          <w:p>
+            <w:pPr>
+              <w:spacing w:after="20" w:before="20"/>
+            </w:pPr>
+            <w:r>
+              <w:rPr>
+                <w:b w:val="false"/>
+                <w:bCs w:val="false"/>
+                <w:i w:val="false"/>
+                <w:iCs w:val="false"/>
+              </w:rPr>
+              <w:t xml:space="preserve">avg</w:t>
+            </w:r>
+          </w:p>
+        </w:tc>
+        <w:tc>
+          <w:tcPr>
+            <w:tcW w:type="dxa" w:w="2256"/>
+            <w:tcBorders>
+              <w:top w:val="single" w:color="B8C4CE" w:sz="1"/>
+              <w:left w:val="single" w:color="B8C4CE" w:sz="1"/>
+              <w:bottom w:val="single" w:color="B8C4CE" w:sz="1"/>
+              <w:right w:val="single" w:color="B8C4CE" w:sz="1"/>
+            </w:tcBorders>
+            <w:tcMar>
+              <w:top w:type="dxa" w:w="60"/>
+              <w:left w:type="dxa" w:w="100"/>
+              <w:bottom w:type="dxa" w:w="60"/>
+              <w:right w:type="dxa" w:w="100"/>
+            </w:tcMar>
+            <w:vAlign w:val="center"/>
+          </w:tcPr>
+          <w:p>
+            <w:pPr>
+              <w:spacing w:after="20" w:before="20"/>
+            </w:pPr>
+            <w:r>
+              <w:rPr>
+                <w:b w:val="false"/>
+                <w:bCs w:val="false"/>
+                <w:i w:val="false"/>
+                <w:iCs w:val="false"/>
+              </w:rPr>
+              <w:t xml:space="preserve">prům</w:t>
+            </w:r>
+          </w:p>
+        </w:tc>
+        <w:tc>
+          <w:tcPr>
+            <w:tcW w:type="dxa" w:w="2258"/>
+            <w:tcBorders>
+              <w:top w:val="single" w:color="B8C4CE" w:sz="1"/>
+              <w:left w:val="single" w:color="B8C4CE" w:sz="1"/>
+              <w:bottom w:val="single" w:color="B8C4CE" w:sz="1"/>
+              <w:right w:val="single" w:color="B8C4CE" w:sz="1"/>
+            </w:tcBorders>
+            <w:tcMar>
+              <w:top w:type="dxa" w:w="60"/>
+              <w:left w:type="dxa" w:w="100"/>
+              <w:bottom w:type="dxa" w:w="60"/>
+              <w:right w:type="dxa" w:w="100"/>
+            </w:tcMar>
+            <w:vAlign w:val="center"/>
+          </w:tcPr>
+          <w:p>
+            <w:pPr>
+              <w:spacing w:after="20" w:before="20"/>
+            </w:pPr>
+            <w:r>
+              <w:rPr>
+                <w:b w:val="false"/>
+                <w:bCs w:val="false"/>
+                <w:i/>
+                <w:iCs/>
+              </w:rPr>
+              <w:t xml:space="preserve">p</w:t>
+            </w:r>
+            <w:r>
+              <w:rPr>
+                <w:b w:val="false"/>
+                <w:bCs w:val="false"/>
+                <w:i w:val="false"/>
+                <w:iCs w:val="false"/>
+                <w:vertAlign w:val="subscript"/>
+              </w:rPr>
+              <w:t xml:space="preserve">prům</w:t>
+            </w:r>
+          </w:p>
+        </w:tc>
+      </w:tr>
+    </w:tbl>
+    <w:p>
+      <w:pPr>
+        <w:spacing w:after="160"/>
+      </w:pPr>
+    </w:p>
+    <w:p>
+      <w:pPr>
+        <w:spacing w:after="120"/>
+      </w:pPr>
+      <w:r>
+        <w:rPr>
+          <w:b/>
+          <w:bCs/>
+          <w:i w:val="false"/>
+          <w:iCs w:val="false"/>
+        </w:rPr>
+        <w:t xml:space="preserve">Zkratky se nepřekládají</w:t>
+      </w:r>
+      <w:r>
+        <w:rPr>
+          <w:b w:val="false"/>
+          <w:bCs w:val="false"/>
+          <w:i w:val="false"/>
+          <w:iCs w:val="false"/>
+        </w:rPr>
+        <w:t xml:space="preserve"> (§5): </w:t>
+      </w:r>
+      <w:r>
+        <w:rPr>
+          <w:rFonts w:ascii="Consolas" w:cs="Consolas" w:eastAsia="Consolas" w:hAnsi="Consolas"/>
+          <w:b w:val="false"/>
+          <w:bCs w:val="false"/>
+          <w:i w:val="false"/>
+          <w:iCs w:val="false"/>
+          <w:color w:val="8B2500"/>
+          <w:sz w:val="20"/>
+          <w:szCs w:val="20"/>
+        </w:rPr>
+        <w:t xml:space="preserve">SAC</w:t>
+      </w:r>
+      <w:r>
+        <w:rPr>
+          <w:b w:val="false"/>
+          <w:bCs w:val="false"/>
+          <w:i w:val="false"/>
+          <w:iCs w:val="false"/>
+        </w:rPr>
+        <w:t xml:space="preserve">, </w:t>
+      </w:r>
+      <w:r>
+        <w:rPr>
+          <w:rFonts w:ascii="Consolas" w:cs="Consolas" w:eastAsia="Consolas" w:hAnsi="Consolas"/>
+          <w:b w:val="false"/>
+          <w:bCs w:val="false"/>
+          <w:i w:val="false"/>
+          <w:iCs w:val="false"/>
+          <w:color w:val="8B2500"/>
+          <w:sz w:val="20"/>
+          <w:szCs w:val="20"/>
+        </w:rPr>
+        <w:t xml:space="preserve">MOD</w:t>
+      </w:r>
+      <w:r>
+        <w:rPr>
+          <w:b w:val="false"/>
+          <w:bCs w:val="false"/>
+          <w:i w:val="false"/>
+          <w:iCs w:val="false"/>
+        </w:rPr>
+        <w:t xml:space="preserve">, </w:t>
+      </w:r>
+      <w:r>
+        <w:rPr>
+          <w:rFonts w:ascii="Consolas" w:cs="Consolas" w:eastAsia="Consolas" w:hAnsi="Consolas"/>
+          <w:b w:val="false"/>
+          <w:bCs w:val="false"/>
+          <w:i w:val="false"/>
+          <w:iCs w:val="false"/>
+          <w:color w:val="8B2500"/>
+          <w:sz w:val="20"/>
+          <w:szCs w:val="20"/>
+        </w:rPr>
+        <w:t xml:space="preserve">OTU</w:t>
+      </w:r>
+      <w:r>
+        <w:rPr>
+          <w:b w:val="false"/>
+          <w:bCs w:val="false"/>
+          <w:i w:val="false"/>
+          <w:iCs w:val="false"/>
+        </w:rPr>
+        <w:t xml:space="preserve">, </w:t>
+      </w:r>
+      <w:r>
+        <w:rPr>
+          <w:rFonts w:ascii="Consolas" w:cs="Consolas" w:eastAsia="Consolas" w:hAnsi="Consolas"/>
+          <w:b w:val="false"/>
+          <w:bCs w:val="false"/>
+          <w:i w:val="false"/>
+          <w:iCs w:val="false"/>
+          <w:color w:val="8B2500"/>
+          <w:sz w:val="20"/>
+          <w:szCs w:val="20"/>
+        </w:rPr>
+        <w:t xml:space="preserve">NDL</w:t>
+      </w:r>
+      <w:r>
+        <w:rPr>
+          <w:b w:val="false"/>
+          <w:bCs w:val="false"/>
+          <w:i w:val="false"/>
+          <w:iCs w:val="false"/>
+        </w:rPr>
+        <w:t xml:space="preserve">, </w:t>
+      </w:r>
+      <w:r>
+        <w:rPr>
+          <w:rFonts w:ascii="Consolas" w:cs="Consolas" w:eastAsia="Consolas" w:hAnsi="Consolas"/>
+          <w:b w:val="false"/>
+          <w:bCs w:val="false"/>
+          <w:i w:val="false"/>
+          <w:iCs w:val="false"/>
+          <w:color w:val="8B2500"/>
+          <w:sz w:val="20"/>
+          <w:szCs w:val="20"/>
+        </w:rPr>
+        <w:t xml:space="preserve">GF</w:t>
+      </w:r>
+      <w:r>
+        <w:rPr>
+          <w:b w:val="false"/>
+          <w:bCs w:val="false"/>
+          <w:i w:val="false"/>
+          <w:iCs w:val="false"/>
+        </w:rPr>
+        <w:t xml:space="preserve"> zůstávají ve všech jazycích stejné — ve vzorci ale musí být stojatě (</w:t>
+      </w:r>
+      <w:r>
+        <w:rPr>
+          <w:rFonts w:ascii="Consolas" w:cs="Consolas" w:eastAsia="Consolas" w:hAnsi="Consolas"/>
+          <w:b w:val="false"/>
+          <w:bCs w:val="false"/>
+          <w:i w:val="false"/>
+          <w:iCs w:val="false"/>
+          <w:color w:val="8B2500"/>
+          <w:sz w:val="20"/>
+          <w:szCs w:val="20"/>
+        </w:rPr>
+        <w:t xml:space="preserve">\mathrm{SAC}</w:t>
+      </w:r>
+      <w:r>
+        <w:rPr>
+          <w:b w:val="false"/>
+          <w:bCs w:val="false"/>
+          <w:i w:val="false"/>
+          <w:iCs w:val="false"/>
+        </w:rPr>
+        <w:t xml:space="preserve">), jinak je KaTeX vysází jako součin kurzívních písmen </w:t>
+      </w:r>
+      <w:r>
+        <w:rPr>
+          <w:b w:val="false"/>
+          <w:bCs w:val="false"/>
+          <w:i/>
+          <w:iCs/>
+        </w:rPr>
+        <w:t xml:space="preserve">S</w:t>
+      </w:r>
+      <w:r>
+        <w:rPr>
+          <w:b w:val="false"/>
+          <w:bCs w:val="false"/>
+          <w:i w:val="false"/>
+          <w:iCs w:val="false"/>
+        </w:rPr>
+        <w:t xml:space="preserve">·</w:t>
+      </w:r>
+      <w:r>
+        <w:rPr>
+          <w:b w:val="false"/>
+          <w:bCs w:val="false"/>
+          <w:i/>
+          <w:iCs/>
+        </w:rPr>
+        <w:t xml:space="preserve">A</w:t>
+      </w:r>
+      <w:r>
+        <w:rPr>
+          <w:b w:val="false"/>
+          <w:bCs w:val="false"/>
+          <w:i w:val="false"/>
+          <w:iCs w:val="false"/>
+        </w:rPr>
+        <w:t xml:space="preserve">·</w:t>
+      </w:r>
+      <w:r>
+        <w:rPr>
+          <w:b w:val="false"/>
+          <w:bCs w:val="false"/>
+          <w:i/>
+          <w:iCs/>
+        </w:rPr>
+        <w:t xml:space="preserve">C</w:t>
+      </w:r>
+      <w:r>
+        <w:rPr>
+          <w:b w:val="false"/>
+          <w:bCs w:val="false"/>
+          <w:i w:val="false"/>
+          <w:iCs w:val="false"/>
+        </w:rPr>
+        <w:t xml:space="preserve">.</w:t>
+      </w:r>
+    </w:p>
+    <w:p>
+      <w:pPr>
+        <w:spacing w:after="120"/>
+      </w:pPr>
+      <w:r>
+        <w:rPr>
+          <w:b/>
+          <w:bCs/>
+          <w:i w:val="false"/>
+          <w:iCs w:val="false"/>
+        </w:rPr>
+        <w:t xml:space="preserve">Vyřešeno ve fázi 2:</w:t>
+      </w:r>
+      <w:r>
+        <w:rPr>
+          <w:b w:val="false"/>
+          <w:bCs w:val="false"/>
+          <w:i w:val="false"/>
+          <w:iCs w:val="false"/>
+        </w:rPr>
+        <w:t xml:space="preserve"> vzorce se sázejí z jednoho anglického zdroje a překládá je </w:t>
+      </w:r>
+      <w:r>
+        <w:rPr>
+          <w:rFonts w:ascii="Consolas" w:cs="Consolas" w:eastAsia="Consolas" w:hAnsi="Consolas"/>
+          <w:b w:val="false"/>
+          <w:bCs w:val="false"/>
+          <w:i w:val="false"/>
+          <w:iCs w:val="false"/>
+          <w:color w:val="8B2500"/>
+          <w:sz w:val="20"/>
+          <w:szCs w:val="20"/>
+        </w:rPr>
+        <w:t xml:space="preserve">localizeLatex()</w:t>
+      </w:r>
+      <w:r>
+        <w:rPr>
+          <w:b w:val="false"/>
+          <w:bCs w:val="false"/>
+          <w:i w:val="false"/>
+          <w:iCs w:val="false"/>
+        </w:rPr>
+        <w:t xml:space="preserve"> v </w:t>
+      </w:r>
+      <w:r>
+        <w:rPr>
+          <w:rFonts w:ascii="Consolas" w:cs="Consolas" w:eastAsia="Consolas" w:hAnsi="Consolas"/>
+          <w:b w:val="false"/>
+          <w:bCs w:val="false"/>
+          <w:i w:val="false"/>
+          <w:iCs w:val="false"/>
+          <w:color w:val="8B2500"/>
+          <w:sz w:val="20"/>
+          <w:szCs w:val="20"/>
+        </w:rPr>
+        <w:t xml:space="preserve">js/format.js</w:t>
+      </w:r>
+      <w:r>
+        <w:rPr>
+          <w:b w:val="false"/>
+          <w:bCs w:val="false"/>
+          <w:i w:val="false"/>
+          <w:iCs w:val="false"/>
+        </w:rPr>
+        <w:t xml:space="preserve"> — tabulka </w:t>
+      </w:r>
+      <w:r>
+        <w:rPr>
+          <w:rFonts w:ascii="Consolas" w:cs="Consolas" w:eastAsia="Consolas" w:hAnsi="Consolas"/>
+          <w:b w:val="false"/>
+          <w:bCs w:val="false"/>
+          <w:i w:val="false"/>
+          <w:iCs w:val="false"/>
+          <w:color w:val="8B2500"/>
+          <w:sz w:val="20"/>
+          <w:szCs w:val="20"/>
+        </w:rPr>
+        <w:t xml:space="preserve">UPRIGHT_CS</w:t>
+      </w:r>
+      <w:r>
+        <w:rPr>
+          <w:b w:val="false"/>
+          <w:bCs w:val="false"/>
+          <w:i w:val="false"/>
+          <w:iCs w:val="false"/>
+        </w:rPr>
+        <w:t xml:space="preserve"> je strojovým protějškem obou tabulek výše. Do HTML se tedy píše kanonický anglický tvar (</w:t>
+      </w:r>
+      <w:r>
+        <w:rPr>
+          <w:rFonts w:ascii="Consolas" w:cs="Consolas" w:eastAsia="Consolas" w:hAnsi="Consolas"/>
+          <w:b w:val="false"/>
+          <w:bCs w:val="false"/>
+          <w:i w:val="false"/>
+          <w:iCs w:val="false"/>
+          <w:color w:val="8B2500"/>
+          <w:sz w:val="20"/>
+          <w:szCs w:val="20"/>
+        </w:rPr>
+        <w:t xml:space="preserve">p_{\mathrm{tot}}</w:t>
+      </w:r>
+      <w:r>
+        <w:rPr>
+          <w:b w:val="false"/>
+          <w:bCs w:val="false"/>
+          <w:i w:val="false"/>
+          <w:iCs w:val="false"/>
+        </w:rPr>
+        <w:t xml:space="preserve">) a český čtenář dostane </w:t>
+      </w:r>
+      <w:r>
+        <w:rPr>
+          <w:rFonts w:ascii="Consolas" w:cs="Consolas" w:eastAsia="Consolas" w:hAnsi="Consolas"/>
+          <w:b w:val="false"/>
+          <w:bCs w:val="false"/>
+          <w:i w:val="false"/>
+          <w:iCs w:val="false"/>
+          <w:color w:val="8B2500"/>
+          <w:sz w:val="20"/>
+          <w:szCs w:val="20"/>
+        </w:rPr>
+        <w:t xml:space="preserve">p_{\mathrm{celk}}</w:t>
+      </w:r>
+      <w:r>
+        <w:rPr>
+          <w:b w:val="false"/>
+          <w:bCs w:val="false"/>
+          <w:i w:val="false"/>
+          <w:iCs w:val="false"/>
+        </w:rPr>
+        <w:t xml:space="preserve">. Popisky grafů jdou přes </w:t>
+      </w:r>
+      <w:r>
+        <w:rPr>
+          <w:rFonts w:ascii="Consolas" w:cs="Consolas" w:eastAsia="Consolas" w:hAnsi="Consolas"/>
+          <w:b w:val="false"/>
+          <w:bCs w:val="false"/>
+          <w:i w:val="false"/>
+          <w:iCs w:val="false"/>
+          <w:color w:val="8B2500"/>
+          <w:sz w:val="20"/>
+          <w:szCs w:val="20"/>
+        </w:rPr>
+        <w:t xml:space="preserve">locales/*.json</w:t>
+      </w:r>
+      <w:r>
+        <w:rPr>
+          <w:b w:val="false"/>
+          <w:bCs w:val="false"/>
+          <w:i w:val="false"/>
+          <w:iCs w:val="false"/>
+        </w:rPr>
+        <w:t xml:space="preserve"> a řídí se stejným pravidlem.</w:t>
       </w:r>
     </w:p>
     <w:p>
@@ -16758,6 +18007,147 @@
                 <w:iCs w:val="false"/>
               </w:rPr>
               <w:t xml:space="preserve">Bühlmannova notace</w:t>
+            </w:r>
+          </w:p>
+        </w:tc>
+      </w:tr>
+      <w:tr>
+        <w:trPr>
+          <w:tblHeader w:val="false"/>
+        </w:trPr>
+        <w:tc>
+          <w:tcPr>
+            <w:tcW w:type="dxa" w:w="3008"/>
+            <w:tcBorders>
+              <w:top w:val="single" w:color="B8C4CE" w:sz="1"/>
+              <w:left w:val="single" w:color="B8C4CE" w:sz="1"/>
+              <w:bottom w:val="single" w:color="B8C4CE" w:sz="1"/>
+              <w:right w:val="single" w:color="B8C4CE" w:sz="1"/>
+            </w:tcBorders>
+            <w:tcMar>
+              <w:top w:type="dxa" w:w="60"/>
+              <w:left w:type="dxa" w:w="100"/>
+              <w:bottom w:type="dxa" w:w="60"/>
+              <w:right w:type="dxa" w:w="100"/>
+            </w:tcMar>
+            <w:vAlign w:val="center"/>
+          </w:tcPr>
+          <w:p>
+            <w:pPr>
+              <w:spacing w:after="20" w:before="20"/>
+            </w:pPr>
+            <w:r>
+              <w:rPr>
+                <w:b w:val="false"/>
+                <w:bCs w:val="false"/>
+                <w:i w:val="false"/>
+                <w:iCs w:val="false"/>
+              </w:rPr>
+              <w:t xml:space="preserve">✗ </w:t>
+            </w:r>
+            <w:r>
+              <w:rPr>
+                <w:rFonts w:ascii="Consolas" w:cs="Consolas" w:eastAsia="Consolas" w:hAnsi="Consolas"/>
+                <w:b w:val="false"/>
+                <w:bCs w:val="false"/>
+                <w:i w:val="false"/>
+                <w:iCs w:val="false"/>
+                <w:color w:val="8B2500"/>
+                <w:sz w:val="20"/>
+                <w:szCs w:val="20"/>
+              </w:rPr>
+              <w:t xml:space="preserve">t½</w:t>
+            </w:r>
+            <w:r>
+              <w:rPr>
+                <w:b w:val="false"/>
+                <w:bCs w:val="false"/>
+                <w:i w:val="false"/>
+                <w:iCs w:val="false"/>
+              </w:rPr>
+              <w:t xml:space="preserve"> v HTML</w:t>
+            </w:r>
+          </w:p>
+        </w:tc>
+        <w:tc>
+          <w:tcPr>
+            <w:tcW w:type="dxa" w:w="3008"/>
+            <w:tcBorders>
+              <w:top w:val="single" w:color="B8C4CE" w:sz="1"/>
+              <w:left w:val="single" w:color="B8C4CE" w:sz="1"/>
+              <w:bottom w:val="single" w:color="B8C4CE" w:sz="1"/>
+              <w:right w:val="single" w:color="B8C4CE" w:sz="1"/>
+            </w:tcBorders>
+            <w:tcMar>
+              <w:top w:type="dxa" w:w="60"/>
+              <w:left w:type="dxa" w:w="100"/>
+              <w:bottom w:type="dxa" w:w="60"/>
+              <w:right w:type="dxa" w:w="100"/>
+            </w:tcMar>
+            <w:vAlign w:val="center"/>
+          </w:tcPr>
+          <w:p>
+            <w:pPr>
+              <w:spacing w:after="20" w:before="20"/>
+            </w:pPr>
+            <w:r>
+              <w:rPr>
+                <w:rFonts w:ascii="Consolas" w:cs="Consolas" w:eastAsia="Consolas" w:hAnsi="Consolas"/>
+                <w:b w:val="false"/>
+                <w:bCs w:val="false"/>
+                <w:i/>
+                <w:iCs/>
+                <w:color w:val="8B2500"/>
+                <w:sz w:val="20"/>
+                <w:szCs w:val="20"/>
+              </w:rPr>
+              <w:t xml:space="preserve">t</w:t>
+            </w:r>
+            <w:r>
+              <w:rPr>
+                <w:rFonts w:ascii="Consolas" w:cs="Consolas" w:eastAsia="Consolas" w:hAnsi="Consolas"/>
+                <w:b w:val="false"/>
+                <w:bCs w:val="false"/>
+                <w:i w:val="false"/>
+                <w:iCs w:val="false"/>
+                <w:color w:val="8B2500"/>
+                <w:sz w:val="20"/>
+                <w:szCs w:val="20"/>
+                <w:vertAlign w:val="subscript"/>
+              </w:rPr>
+              <w:t xml:space="preserve">1/2</w:t>
+            </w:r>
+          </w:p>
+        </w:tc>
+        <w:tc>
+          <w:tcPr>
+            <w:tcW w:type="dxa" w:w="3010"/>
+            <w:tcBorders>
+              <w:top w:val="single" w:color="B8C4CE" w:sz="1"/>
+              <w:left w:val="single" w:color="B8C4CE" w:sz="1"/>
+              <w:bottom w:val="single" w:color="B8C4CE" w:sz="1"/>
+              <w:right w:val="single" w:color="B8C4CE" w:sz="1"/>
+            </w:tcBorders>
+            <w:tcMar>
+              <w:top w:type="dxa" w:w="60"/>
+              <w:left w:type="dxa" w:w="100"/>
+              <w:bottom w:type="dxa" w:w="60"/>
+              <w:right w:type="dxa" w:w="100"/>
+            </w:tcMar>
+            <w:vAlign w:val="center"/>
+          </w:tcPr>
+          <w:p>
+            <w:pPr>
+              <w:spacing w:after="20" w:before="20"/>
+            </w:pPr>
+            <w:r>
+              <w:rPr>
+                <w:b w:val="false"/>
+                <w:bCs w:val="false"/>
+                <w:i w:val="false"/>
+                <w:iCs w:val="false"/>
+              </w:rPr>
+              <w:t xml:space="preserve">U+00BD je kompatibilní znak, jako ℃ výše</w:t>
             </w:r>
           </w:p>
         </w:tc>

</xml_diff>

<commit_message>
Upravit výukové stránky a skrýt helium
Co-authored-by: Copilot <223556219+Copilot@users.noreply.github.com>
</commit_message>
<xml_diff>
--- a/docs/notation/export/slovnicek-velicin.docx
+++ b/docs/notation/export/slovnicek-velicin.docx
@@ -399,7 +399,7 @@
           </w:tcPr>
           <w:p>
             <w:pPr>
-              <w:spacing w:after="20" w:before="20"/>
+              <w:spacing w:before="20" w:after="20"/>
             </w:pPr>
             <w:r>
               <w:rPr>
@@ -432,7 +432,7 @@
           </w:tcPr>
           <w:p>
             <w:pPr>
-              <w:spacing w:after="20" w:before="20"/>
+              <w:spacing w:before="20" w:after="20"/>
             </w:pPr>
             <w:r>
               <w:rPr>
@@ -465,7 +465,7 @@
           </w:tcPr>
           <w:p>
             <w:pPr>
-              <w:spacing w:after="20" w:before="20"/>
+              <w:spacing w:before="20" w:after="20"/>
             </w:pPr>
             <w:r>
               <w:rPr>
@@ -502,7 +502,7 @@
           </w:tcPr>
           <w:p>
             <w:pPr>
-              <w:spacing w:after="20" w:before="20"/>
+              <w:spacing w:before="20" w:after="20"/>
             </w:pPr>
             <w:r>
               <w:rPr>
@@ -544,7 +544,7 @@
           </w:tcPr>
           <w:p>
             <w:pPr>
-              <w:spacing w:after="20" w:before="20"/>
+              <w:spacing w:before="20" w:after="20"/>
             </w:pPr>
             <w:r>
               <w:rPr>
@@ -585,7 +585,7 @@
           </w:tcPr>
           <w:p>
             <w:pPr>
-              <w:spacing w:after="20" w:before="20"/>
+              <w:spacing w:before="20" w:after="20"/>
             </w:pPr>
             <w:r>
               <w:rPr>
@@ -622,7 +622,7 @@
           </w:tcPr>
           <w:p>
             <w:pPr>
-              <w:spacing w:after="20" w:before="20"/>
+              <w:spacing w:before="20" w:after="20"/>
             </w:pPr>
             <w:r>
               <w:rPr>
@@ -664,7 +664,7 @@
           </w:tcPr>
           <w:p>
             <w:pPr>
-              <w:spacing w:after="20" w:before="20"/>
+              <w:spacing w:before="20" w:after="20"/>
             </w:pPr>
             <w:r>
               <w:rPr>
@@ -696,7 +696,7 @@
           </w:tcPr>
           <w:p>
             <w:pPr>
-              <w:spacing w:after="20" w:before="20"/>
+              <w:spacing w:before="20" w:after="20"/>
             </w:pPr>
             <w:r>
               <w:rPr>
@@ -733,7 +733,7 @@
           </w:tcPr>
           <w:p>
             <w:pPr>
-              <w:spacing w:after="20" w:before="20"/>
+              <w:spacing w:before="20" w:after="20"/>
             </w:pPr>
             <w:r>
               <w:rPr>
@@ -775,7 +775,7 @@
           </w:tcPr>
           <w:p>
             <w:pPr>
-              <w:spacing w:after="20" w:before="20"/>
+              <w:spacing w:before="20" w:after="20"/>
             </w:pPr>
             <w:r>
               <w:rPr>
@@ -816,7 +816,7 @@
           </w:tcPr>
           <w:p>
             <w:pPr>
-              <w:spacing w:after="20" w:before="20"/>
+              <w:spacing w:before="20" w:after="20"/>
             </w:pPr>
             <w:r>
               <w:rPr>
@@ -853,7 +853,7 @@
           </w:tcPr>
           <w:p>
             <w:pPr>
-              <w:spacing w:after="20" w:before="20"/>
+              <w:spacing w:before="20" w:after="20"/>
             </w:pPr>
             <w:r>
               <w:rPr>
@@ -895,7 +895,7 @@
           </w:tcPr>
           <w:p>
             <w:pPr>
-              <w:spacing w:after="20" w:before="20"/>
+              <w:spacing w:before="20" w:after="20"/>
             </w:pPr>
             <w:r>
               <w:rPr>
@@ -936,7 +936,7 @@
           </w:tcPr>
           <w:p>
             <w:pPr>
-              <w:spacing w:after="20" w:before="20"/>
+              <w:spacing w:before="20" w:after="20"/>
             </w:pPr>
             <w:r>
               <w:rPr>
@@ -973,7 +973,7 @@
           </w:tcPr>
           <w:p>
             <w:pPr>
-              <w:spacing w:after="20" w:before="20"/>
+              <w:spacing w:before="20" w:after="20"/>
             </w:pPr>
             <w:r>
               <w:rPr>
@@ -1015,7 +1015,7 @@
           </w:tcPr>
           <w:p>
             <w:pPr>
-              <w:spacing w:after="20" w:before="20"/>
+              <w:spacing w:before="20" w:after="20"/>
             </w:pPr>
             <w:r>
               <w:rPr>
@@ -1056,7 +1056,7 @@
           </w:tcPr>
           <w:p>
             <w:pPr>
-              <w:spacing w:after="20" w:before="20"/>
+              <w:spacing w:before="20" w:after="20"/>
             </w:pPr>
             <w:r>
               <w:rPr>
@@ -1222,7 +1222,7 @@
           </w:tcPr>
           <w:p>
             <w:pPr>
-              <w:spacing w:after="20" w:before="20"/>
+              <w:spacing w:before="20" w:after="20"/>
             </w:pPr>
             <w:r>
               <w:rPr>
@@ -1255,7 +1255,7 @@
           </w:tcPr>
           <w:p>
             <w:pPr>
-              <w:spacing w:after="20" w:before="20"/>
+              <w:spacing w:before="20" w:after="20"/>
             </w:pPr>
             <w:r>
               <w:rPr>
@@ -1288,7 +1288,7 @@
           </w:tcPr>
           <w:p>
             <w:pPr>
-              <w:spacing w:after="20" w:before="20"/>
+              <w:spacing w:before="20" w:after="20"/>
             </w:pPr>
             <w:r>
               <w:rPr>
@@ -1321,7 +1321,7 @@
           </w:tcPr>
           <w:p>
             <w:pPr>
-              <w:spacing w:after="20" w:before="20"/>
+              <w:spacing w:before="20" w:after="20"/>
             </w:pPr>
             <w:r>
               <w:rPr>
@@ -1354,7 +1354,7 @@
           </w:tcPr>
           <w:p>
             <w:pPr>
-              <w:spacing w:after="20" w:before="20"/>
+              <w:spacing w:before="20" w:after="20"/>
             </w:pPr>
             <w:r>
               <w:rPr>
@@ -1387,7 +1387,7 @@
           </w:tcPr>
           <w:p>
             <w:pPr>
-              <w:spacing w:after="20" w:before="20"/>
+              <w:spacing w:before="20" w:after="20"/>
             </w:pPr>
             <w:r>
               <w:rPr>
@@ -1424,7 +1424,7 @@
           </w:tcPr>
           <w:p>
             <w:pPr>
-              <w:spacing w:after="20" w:before="20"/>
+              <w:spacing w:before="20" w:after="20"/>
             </w:pPr>
             <w:r>
               <w:rPr>
@@ -1456,7 +1456,7 @@
           </w:tcPr>
           <w:p>
             <w:pPr>
-              <w:spacing w:after="20" w:before="20"/>
+              <w:spacing w:before="20" w:after="20"/>
             </w:pPr>
             <w:r>
               <w:rPr>
@@ -1488,7 +1488,7 @@
           </w:tcPr>
           <w:p>
             <w:pPr>
-              <w:spacing w:after="20" w:before="20"/>
+              <w:spacing w:before="20" w:after="20"/>
             </w:pPr>
             <w:r>
               <w:rPr>
@@ -1520,7 +1520,7 @@
           </w:tcPr>
           <w:p>
             <w:pPr>
-              <w:spacing w:after="20" w:before="20"/>
+              <w:spacing w:before="20" w:after="20"/>
             </w:pPr>
             <w:r>
               <w:rPr>
@@ -1552,7 +1552,7 @@
           </w:tcPr>
           <w:p>
             <w:pPr>
-              <w:spacing w:after="20" w:before="20"/>
+              <w:spacing w:before="20" w:after="20"/>
             </w:pPr>
             <w:r>
               <w:rPr>
@@ -1584,7 +1584,7 @@
           </w:tcPr>
           <w:p>
             <w:pPr>
-              <w:spacing w:after="20" w:before="20"/>
+              <w:spacing w:before="20" w:after="20"/>
             </w:pPr>
             <w:r>
               <w:rPr>
@@ -1621,7 +1621,7 @@
           </w:tcPr>
           <w:p>
             <w:pPr>
-              <w:spacing w:after="20" w:before="20"/>
+              <w:spacing w:before="20" w:after="20"/>
             </w:pPr>
             <w:r>
               <w:rPr>
@@ -1663,7 +1663,7 @@
           </w:tcPr>
           <w:p>
             <w:pPr>
-              <w:spacing w:after="20" w:before="20"/>
+              <w:spacing w:before="20" w:after="20"/>
             </w:pPr>
             <w:r>
               <w:rPr>
@@ -1695,7 +1695,7 @@
           </w:tcPr>
           <w:p>
             <w:pPr>
-              <w:spacing w:after="20" w:before="20"/>
+              <w:spacing w:before="20" w:after="20"/>
             </w:pPr>
             <w:r>
               <w:rPr>
@@ -1727,7 +1727,7 @@
           </w:tcPr>
           <w:p>
             <w:pPr>
-              <w:spacing w:after="20" w:before="20"/>
+              <w:spacing w:before="20" w:after="20"/>
             </w:pPr>
             <w:r>
               <w:rPr>
@@ -1759,7 +1759,7 @@
           </w:tcPr>
           <w:p>
             <w:pPr>
-              <w:spacing w:after="20" w:before="20"/>
+              <w:spacing w:before="20" w:after="20"/>
             </w:pPr>
             <w:r>
               <w:rPr>
@@ -1791,7 +1791,7 @@
           </w:tcPr>
           <w:p>
             <w:pPr>
-              <w:spacing w:after="20" w:before="20"/>
+              <w:spacing w:before="20" w:after="20"/>
             </w:pPr>
             <w:r>
               <w:rPr>
@@ -1828,7 +1828,7 @@
           </w:tcPr>
           <w:p>
             <w:pPr>
-              <w:spacing w:after="20" w:before="20"/>
+              <w:spacing w:before="20" w:after="20"/>
             </w:pPr>
             <w:r>
               <w:rPr>
@@ -1870,7 +1870,7 @@
           </w:tcPr>
           <w:p>
             <w:pPr>
-              <w:spacing w:after="20" w:before="20"/>
+              <w:spacing w:before="20" w:after="20"/>
             </w:pPr>
             <w:r>
               <w:rPr>
@@ -1902,7 +1902,7 @@
           </w:tcPr>
           <w:p>
             <w:pPr>
-              <w:spacing w:after="20" w:before="20"/>
+              <w:spacing w:before="20" w:after="20"/>
             </w:pPr>
             <w:r>
               <w:rPr>
@@ -1934,7 +1934,7 @@
           </w:tcPr>
           <w:p>
             <w:pPr>
-              <w:spacing w:after="20" w:before="20"/>
+              <w:spacing w:before="20" w:after="20"/>
             </w:pPr>
             <w:r>
               <w:rPr>
@@ -1966,7 +1966,7 @@
           </w:tcPr>
           <w:p>
             <w:pPr>
-              <w:spacing w:after="20" w:before="20"/>
+              <w:spacing w:before="20" w:after="20"/>
             </w:pPr>
             <w:r>
               <w:rPr>
@@ -1998,7 +1998,7 @@
           </w:tcPr>
           <w:p>
             <w:pPr>
-              <w:spacing w:after="20" w:before="20"/>
+              <w:spacing w:before="20" w:after="20"/>
             </w:pPr>
             <w:r>
               <w:rPr>
@@ -2035,7 +2035,7 @@
           </w:tcPr>
           <w:p>
             <w:pPr>
-              <w:spacing w:after="20" w:before="20"/>
+              <w:spacing w:before="20" w:after="20"/>
             </w:pPr>
             <w:r>
               <w:rPr>
@@ -2077,7 +2077,7 @@
           </w:tcPr>
           <w:p>
             <w:pPr>
-              <w:spacing w:after="20" w:before="20"/>
+              <w:spacing w:before="20" w:after="20"/>
             </w:pPr>
             <w:r>
               <w:rPr>
@@ -2109,7 +2109,7 @@
           </w:tcPr>
           <w:p>
             <w:pPr>
-              <w:spacing w:after="20" w:before="20"/>
+              <w:spacing w:before="20" w:after="20"/>
             </w:pPr>
             <w:r>
               <w:rPr>
@@ -2141,7 +2141,7 @@
           </w:tcPr>
           <w:p>
             <w:pPr>
-              <w:spacing w:after="20" w:before="20"/>
+              <w:spacing w:before="20" w:after="20"/>
             </w:pPr>
             <w:r>
               <w:rPr>
@@ -2173,7 +2173,7 @@
           </w:tcPr>
           <w:p>
             <w:pPr>
-              <w:spacing w:after="20" w:before="20"/>
+              <w:spacing w:before="20" w:after="20"/>
             </w:pPr>
             <w:r>
               <w:rPr>
@@ -2205,7 +2205,7 @@
           </w:tcPr>
           <w:p>
             <w:pPr>
-              <w:spacing w:after="20" w:before="20"/>
+              <w:spacing w:before="20" w:after="20"/>
             </w:pPr>
             <w:r>
               <w:rPr>
@@ -2242,7 +2242,7 @@
           </w:tcPr>
           <w:p>
             <w:pPr>
-              <w:spacing w:after="20" w:before="20"/>
+              <w:spacing w:before="20" w:after="20"/>
             </w:pPr>
             <w:r>
               <w:rPr>
@@ -2284,7 +2284,7 @@
           </w:tcPr>
           <w:p>
             <w:pPr>
-              <w:spacing w:after="20" w:before="20"/>
+              <w:spacing w:before="20" w:after="20"/>
             </w:pPr>
             <w:r>
               <w:rPr>
@@ -2316,7 +2316,7 @@
           </w:tcPr>
           <w:p>
             <w:pPr>
-              <w:spacing w:after="20" w:before="20"/>
+              <w:spacing w:before="20" w:after="20"/>
             </w:pPr>
             <w:r>
               <w:rPr>
@@ -2348,7 +2348,7 @@
           </w:tcPr>
           <w:p>
             <w:pPr>
-              <w:spacing w:after="20" w:before="20"/>
+              <w:spacing w:before="20" w:after="20"/>
             </w:pPr>
             <w:r>
               <w:rPr>
@@ -2380,7 +2380,7 @@
           </w:tcPr>
           <w:p>
             <w:pPr>
-              <w:spacing w:after="20" w:before="20"/>
+              <w:spacing w:before="20" w:after="20"/>
             </w:pPr>
             <w:r>
               <w:rPr>
@@ -2412,7 +2412,7 @@
           </w:tcPr>
           <w:p>
             <w:pPr>
-              <w:spacing w:after="20" w:before="20"/>
+              <w:spacing w:before="20" w:after="20"/>
             </w:pPr>
             <w:r>
               <w:rPr>
@@ -2449,7 +2449,7 @@
           </w:tcPr>
           <w:p>
             <w:pPr>
-              <w:spacing w:after="20" w:before="20"/>
+              <w:spacing w:before="20" w:after="20"/>
             </w:pPr>
             <w:r>
               <w:rPr>
@@ -2491,7 +2491,7 @@
           </w:tcPr>
           <w:p>
             <w:pPr>
-              <w:spacing w:after="20" w:before="20"/>
+              <w:spacing w:before="20" w:after="20"/>
             </w:pPr>
             <w:r>
               <w:rPr>
@@ -2523,7 +2523,7 @@
           </w:tcPr>
           <w:p>
             <w:pPr>
-              <w:spacing w:after="20" w:before="20"/>
+              <w:spacing w:before="20" w:after="20"/>
             </w:pPr>
             <w:r>
               <w:rPr>
@@ -2555,7 +2555,7 @@
           </w:tcPr>
           <w:p>
             <w:pPr>
-              <w:spacing w:after="20" w:before="20"/>
+              <w:spacing w:before="20" w:after="20"/>
             </w:pPr>
             <w:r>
               <w:rPr>
@@ -2587,7 +2587,7 @@
           </w:tcPr>
           <w:p>
             <w:pPr>
-              <w:spacing w:after="20" w:before="20"/>
+              <w:spacing w:before="20" w:after="20"/>
             </w:pPr>
             <w:r>
               <w:rPr>
@@ -2619,7 +2619,7 @@
           </w:tcPr>
           <w:p>
             <w:pPr>
-              <w:spacing w:after="20" w:before="20"/>
+              <w:spacing w:before="20" w:after="20"/>
             </w:pPr>
             <w:r>
               <w:rPr>
@@ -2656,7 +2656,7 @@
           </w:tcPr>
           <w:p>
             <w:pPr>
-              <w:spacing w:after="20" w:before="20"/>
+              <w:spacing w:before="20" w:after="20"/>
             </w:pPr>
             <w:r>
               <w:rPr>
@@ -2688,7 +2688,7 @@
           </w:tcPr>
           <w:p>
             <w:pPr>
-              <w:spacing w:after="20" w:before="20"/>
+              <w:spacing w:before="20" w:after="20"/>
             </w:pPr>
             <w:r>
               <w:rPr>
@@ -2720,7 +2720,7 @@
           </w:tcPr>
           <w:p>
             <w:pPr>
-              <w:spacing w:after="20" w:before="20"/>
+              <w:spacing w:before="20" w:after="20"/>
             </w:pPr>
             <w:r>
               <w:rPr>
@@ -2752,7 +2752,7 @@
           </w:tcPr>
           <w:p>
             <w:pPr>
-              <w:spacing w:after="20" w:before="20"/>
+              <w:spacing w:before="20" w:after="20"/>
             </w:pPr>
             <w:r>
               <w:rPr>
@@ -2784,7 +2784,7 @@
           </w:tcPr>
           <w:p>
             <w:pPr>
-              <w:spacing w:after="20" w:before="20"/>
+              <w:spacing w:before="20" w:after="20"/>
             </w:pPr>
             <w:r>
               <w:rPr>
@@ -2816,7 +2816,7 @@
           </w:tcPr>
           <w:p>
             <w:pPr>
-              <w:spacing w:after="20" w:before="20"/>
+              <w:spacing w:before="20" w:after="20"/>
             </w:pPr>
             <w:r>
               <w:rPr>
@@ -2853,7 +2853,7 @@
           </w:tcPr>
           <w:p>
             <w:pPr>
-              <w:spacing w:after="20" w:before="20"/>
+              <w:spacing w:before="20" w:after="20"/>
             </w:pPr>
             <w:r>
               <w:rPr>
@@ -2885,7 +2885,7 @@
           </w:tcPr>
           <w:p>
             <w:pPr>
-              <w:spacing w:after="20" w:before="20"/>
+              <w:spacing w:before="20" w:after="20"/>
             </w:pPr>
             <w:r>
               <w:rPr>
@@ -2917,7 +2917,7 @@
           </w:tcPr>
           <w:p>
             <w:pPr>
-              <w:spacing w:after="20" w:before="20"/>
+              <w:spacing w:before="20" w:after="20"/>
             </w:pPr>
             <w:r>
               <w:rPr>
@@ -2949,7 +2949,7 @@
           </w:tcPr>
           <w:p>
             <w:pPr>
-              <w:spacing w:after="20" w:before="20"/>
+              <w:spacing w:before="20" w:after="20"/>
             </w:pPr>
             <w:r>
               <w:rPr>
@@ -2981,7 +2981,7 @@
           </w:tcPr>
           <w:p>
             <w:pPr>
-              <w:spacing w:after="20" w:before="20"/>
+              <w:spacing w:before="20" w:after="20"/>
             </w:pPr>
             <w:r>
               <w:rPr>
@@ -3013,7 +3013,7 @@
           </w:tcPr>
           <w:p>
             <w:pPr>
-              <w:spacing w:after="20" w:before="20"/>
+              <w:spacing w:before="20" w:after="20"/>
             </w:pPr>
             <w:r>
               <w:rPr>
@@ -3050,7 +3050,7 @@
           </w:tcPr>
           <w:p>
             <w:pPr>
-              <w:spacing w:after="20" w:before="20"/>
+              <w:spacing w:before="20" w:after="20"/>
             </w:pPr>
             <w:r>
               <w:rPr>
@@ -3082,7 +3082,7 @@
           </w:tcPr>
           <w:p>
             <w:pPr>
-              <w:spacing w:after="20" w:before="20"/>
+              <w:spacing w:before="20" w:after="20"/>
             </w:pPr>
             <w:r>
               <w:rPr>
@@ -3114,7 +3114,7 @@
           </w:tcPr>
           <w:p>
             <w:pPr>
-              <w:spacing w:after="20" w:before="20"/>
+              <w:spacing w:before="20" w:after="20"/>
             </w:pPr>
             <w:r>
               <w:rPr>
@@ -3146,7 +3146,7 @@
           </w:tcPr>
           <w:p>
             <w:pPr>
-              <w:spacing w:after="20" w:before="20"/>
+              <w:spacing w:before="20" w:after="20"/>
             </w:pPr>
             <w:r>
               <w:rPr>
@@ -3178,7 +3178,7 @@
           </w:tcPr>
           <w:p>
             <w:pPr>
-              <w:spacing w:after="20" w:before="20"/>
+              <w:spacing w:before="20" w:after="20"/>
             </w:pPr>
             <w:r>
               <w:rPr>
@@ -3210,7 +3210,7 @@
           </w:tcPr>
           <w:p>
             <w:pPr>
-              <w:spacing w:after="20" w:before="20"/>
+              <w:spacing w:before="20" w:after="20"/>
             </w:pPr>
             <w:r>
               <w:rPr>
@@ -3247,7 +3247,7 @@
           </w:tcPr>
           <w:p>
             <w:pPr>
-              <w:spacing w:after="20" w:before="20"/>
+              <w:spacing w:before="20" w:after="20"/>
             </w:pPr>
             <w:r>
               <w:rPr>
@@ -3279,7 +3279,7 @@
           </w:tcPr>
           <w:p>
             <w:pPr>
-              <w:spacing w:after="20" w:before="20"/>
+              <w:spacing w:before="20" w:after="20"/>
             </w:pPr>
             <w:r>
               <w:rPr>
@@ -3311,7 +3311,7 @@
           </w:tcPr>
           <w:p>
             <w:pPr>
-              <w:spacing w:after="20" w:before="20"/>
+              <w:spacing w:before="20" w:after="20"/>
             </w:pPr>
             <w:r>
               <w:rPr>
@@ -3343,7 +3343,7 @@
           </w:tcPr>
           <w:p>
             <w:pPr>
-              <w:spacing w:after="20" w:before="20"/>
+              <w:spacing w:before="20" w:after="20"/>
             </w:pPr>
             <w:r>
               <w:rPr>
@@ -3375,7 +3375,7 @@
           </w:tcPr>
           <w:p>
             <w:pPr>
-              <w:spacing w:after="20" w:before="20"/>
+              <w:spacing w:before="20" w:after="20"/>
             </w:pPr>
             <w:r>
               <w:rPr>
@@ -3407,7 +3407,7 @@
           </w:tcPr>
           <w:p>
             <w:pPr>
-              <w:spacing w:after="20" w:before="20"/>
+              <w:spacing w:before="20" w:after="20"/>
             </w:pPr>
             <w:r>
               <w:rPr>
@@ -3444,7 +3444,7 @@
           </w:tcPr>
           <w:p>
             <w:pPr>
-              <w:spacing w:after="20" w:before="20"/>
+              <w:spacing w:before="20" w:after="20"/>
             </w:pPr>
             <w:r>
               <w:rPr>
@@ -3476,7 +3476,7 @@
           </w:tcPr>
           <w:p>
             <w:pPr>
-              <w:spacing w:after="20" w:before="20"/>
+              <w:spacing w:before="20" w:after="20"/>
             </w:pPr>
             <w:r>
               <w:rPr>
@@ -3508,7 +3508,7 @@
           </w:tcPr>
           <w:p>
             <w:pPr>
-              <w:spacing w:after="20" w:before="20"/>
+              <w:spacing w:before="20" w:after="20"/>
             </w:pPr>
             <w:r>
               <w:rPr>
@@ -3540,7 +3540,7 @@
           </w:tcPr>
           <w:p>
             <w:pPr>
-              <w:spacing w:after="20" w:before="20"/>
+              <w:spacing w:before="20" w:after="20"/>
             </w:pPr>
             <w:r>
               <w:rPr>
@@ -3572,7 +3572,7 @@
           </w:tcPr>
           <w:p>
             <w:pPr>
-              <w:spacing w:after="20" w:before="20"/>
+              <w:spacing w:before="20" w:after="20"/>
             </w:pPr>
             <w:r>
               <w:rPr>
@@ -3604,7 +3604,7 @@
           </w:tcPr>
           <w:p>
             <w:pPr>
-              <w:spacing w:after="20" w:before="20"/>
+              <w:spacing w:before="20" w:after="20"/>
             </w:pPr>
             <w:r>
               <w:rPr>
@@ -3641,7 +3641,7 @@
           </w:tcPr>
           <w:p>
             <w:pPr>
-              <w:spacing w:after="20" w:before="20"/>
+              <w:spacing w:before="20" w:after="20"/>
             </w:pPr>
             <w:r>
               <w:rPr>
@@ -3673,7 +3673,7 @@
           </w:tcPr>
           <w:p>
             <w:pPr>
-              <w:spacing w:after="20" w:before="20"/>
+              <w:spacing w:before="20" w:after="20"/>
             </w:pPr>
             <w:r>
               <w:rPr>
@@ -3705,7 +3705,7 @@
           </w:tcPr>
           <w:p>
             <w:pPr>
-              <w:spacing w:after="20" w:before="20"/>
+              <w:spacing w:before="20" w:after="20"/>
             </w:pPr>
             <w:r>
               <w:rPr>
@@ -3737,7 +3737,7 @@
           </w:tcPr>
           <w:p>
             <w:pPr>
-              <w:spacing w:after="20" w:before="20"/>
+              <w:spacing w:before="20" w:after="20"/>
             </w:pPr>
             <w:r>
               <w:rPr>
@@ -3769,7 +3769,7 @@
           </w:tcPr>
           <w:p>
             <w:pPr>
-              <w:spacing w:after="20" w:before="20"/>
+              <w:spacing w:before="20" w:after="20"/>
             </w:pPr>
             <w:r>
               <w:rPr>
@@ -3801,7 +3801,7 @@
           </w:tcPr>
           <w:p>
             <w:pPr>
-              <w:spacing w:after="20" w:before="20"/>
+              <w:spacing w:before="20" w:after="20"/>
             </w:pPr>
             <w:r>
               <w:rPr>
@@ -3838,7 +3838,7 @@
           </w:tcPr>
           <w:p>
             <w:pPr>
-              <w:spacing w:after="20" w:before="20"/>
+              <w:spacing w:before="20" w:after="20"/>
             </w:pPr>
             <w:r>
               <w:rPr>
@@ -3870,7 +3870,7 @@
           </w:tcPr>
           <w:p>
             <w:pPr>
-              <w:spacing w:after="20" w:before="20"/>
+              <w:spacing w:before="20" w:after="20"/>
             </w:pPr>
             <w:r>
               <w:rPr>
@@ -3902,7 +3902,7 @@
           </w:tcPr>
           <w:p>
             <w:pPr>
-              <w:spacing w:after="20" w:before="20"/>
+              <w:spacing w:before="20" w:after="20"/>
             </w:pPr>
             <w:r>
               <w:rPr>
@@ -3934,7 +3934,7 @@
           </w:tcPr>
           <w:p>
             <w:pPr>
-              <w:spacing w:after="20" w:before="20"/>
+              <w:spacing w:before="20" w:after="20"/>
             </w:pPr>
             <w:r>
               <w:rPr>
@@ -3966,7 +3966,7 @@
           </w:tcPr>
           <w:p>
             <w:pPr>
-              <w:spacing w:after="20" w:before="20"/>
+              <w:spacing w:before="20" w:after="20"/>
             </w:pPr>
             <w:r>
               <w:rPr>
@@ -3998,7 +3998,7 @@
           </w:tcPr>
           <w:p>
             <w:pPr>
-              <w:spacing w:after="20" w:before="20"/>
+              <w:spacing w:before="20" w:after="20"/>
             </w:pPr>
             <w:r>
               <w:rPr>
@@ -4035,7 +4035,7 @@
           </w:tcPr>
           <w:p>
             <w:pPr>
-              <w:spacing w:after="20" w:before="20"/>
+              <w:spacing w:before="20" w:after="20"/>
             </w:pPr>
             <w:r>
               <w:rPr>
@@ -4077,7 +4077,7 @@
           </w:tcPr>
           <w:p>
             <w:pPr>
-              <w:spacing w:after="20" w:before="20"/>
+              <w:spacing w:before="20" w:after="20"/>
             </w:pPr>
             <w:r>
               <w:rPr>
@@ -4109,7 +4109,7 @@
           </w:tcPr>
           <w:p>
             <w:pPr>
-              <w:spacing w:after="20" w:before="20"/>
+              <w:spacing w:before="20" w:after="20"/>
             </w:pPr>
             <w:r>
               <w:rPr>
@@ -4141,7 +4141,7 @@
           </w:tcPr>
           <w:p>
             <w:pPr>
-              <w:spacing w:after="20" w:before="20"/>
+              <w:spacing w:before="20" w:after="20"/>
             </w:pPr>
             <w:r>
               <w:rPr>
@@ -4173,7 +4173,7 @@
           </w:tcPr>
           <w:p>
             <w:pPr>
-              <w:spacing w:after="20" w:before="20"/>
+              <w:spacing w:before="20" w:after="20"/>
             </w:pPr>
             <w:r>
               <w:rPr>
@@ -4205,7 +4205,7 @@
           </w:tcPr>
           <w:p>
             <w:pPr>
-              <w:spacing w:after="20" w:before="20"/>
+              <w:spacing w:before="20" w:after="20"/>
             </w:pPr>
             <w:r>
               <w:rPr>
@@ -4242,7 +4242,7 @@
           </w:tcPr>
           <w:p>
             <w:pPr>
-              <w:spacing w:after="20" w:before="20"/>
+              <w:spacing w:before="20" w:after="20"/>
             </w:pPr>
             <w:r>
               <w:rPr>
@@ -4284,7 +4284,7 @@
           </w:tcPr>
           <w:p>
             <w:pPr>
-              <w:spacing w:after="20" w:before="20"/>
+              <w:spacing w:before="20" w:after="20"/>
             </w:pPr>
             <w:r>
               <w:rPr>
@@ -4316,7 +4316,7 @@
           </w:tcPr>
           <w:p>
             <w:pPr>
-              <w:spacing w:after="20" w:before="20"/>
+              <w:spacing w:before="20" w:after="20"/>
             </w:pPr>
             <w:r>
               <w:rPr>
@@ -4348,7 +4348,7 @@
           </w:tcPr>
           <w:p>
             <w:pPr>
-              <w:spacing w:after="20" w:before="20"/>
+              <w:spacing w:before="20" w:after="20"/>
             </w:pPr>
             <w:r>
               <w:rPr>
@@ -4380,7 +4380,7 @@
           </w:tcPr>
           <w:p>
             <w:pPr>
-              <w:spacing w:after="20" w:before="20"/>
+              <w:spacing w:before="20" w:after="20"/>
             </w:pPr>
             <w:r>
               <w:rPr>
@@ -4412,7 +4412,7 @@
           </w:tcPr>
           <w:p>
             <w:pPr>
-              <w:spacing w:after="20" w:before="20"/>
+              <w:spacing w:before="20" w:after="20"/>
             </w:pPr>
             <w:r>
               <w:rPr>
@@ -4449,7 +4449,7 @@
           </w:tcPr>
           <w:p>
             <w:pPr>
-              <w:spacing w:after="20" w:before="20"/>
+              <w:spacing w:before="20" w:after="20"/>
             </w:pPr>
             <w:r>
               <w:rPr>
@@ -4481,7 +4481,7 @@
           </w:tcPr>
           <w:p>
             <w:pPr>
-              <w:spacing w:after="20" w:before="20"/>
+              <w:spacing w:before="20" w:after="20"/>
             </w:pPr>
             <w:r>
               <w:rPr>
@@ -4513,7 +4513,7 @@
           </w:tcPr>
           <w:p>
             <w:pPr>
-              <w:spacing w:after="20" w:before="20"/>
+              <w:spacing w:before="20" w:after="20"/>
             </w:pPr>
             <w:r>
               <w:rPr>
@@ -4545,7 +4545,7 @@
           </w:tcPr>
           <w:p>
             <w:pPr>
-              <w:spacing w:after="20" w:before="20"/>
+              <w:spacing w:before="20" w:after="20"/>
             </w:pPr>
             <w:r>
               <w:rPr>
@@ -4577,7 +4577,7 @@
           </w:tcPr>
           <w:p>
             <w:pPr>
-              <w:spacing w:after="20" w:before="20"/>
+              <w:spacing w:before="20" w:after="20"/>
             </w:pPr>
             <w:r>
               <w:rPr>
@@ -4609,7 +4609,7 @@
           </w:tcPr>
           <w:p>
             <w:pPr>
-              <w:spacing w:after="20" w:before="20"/>
+              <w:spacing w:before="20" w:after="20"/>
             </w:pPr>
             <w:r>
               <w:rPr>
@@ -4664,7 +4664,7 @@
           </w:tcPr>
           <w:p>
             <w:pPr>
-              <w:spacing w:after="20" w:before="20"/>
+              <w:spacing w:before="20" w:after="20"/>
             </w:pPr>
             <w:r>
               <w:rPr>
@@ -4696,7 +4696,7 @@
           </w:tcPr>
           <w:p>
             <w:pPr>
-              <w:spacing w:after="20" w:before="20"/>
+              <w:spacing w:before="20" w:after="20"/>
             </w:pPr>
             <w:r>
               <w:rPr>
@@ -4728,7 +4728,7 @@
           </w:tcPr>
           <w:p>
             <w:pPr>
-              <w:spacing w:after="20" w:before="20"/>
+              <w:spacing w:before="20" w:after="20"/>
             </w:pPr>
             <w:r>
               <w:rPr>
@@ -4760,7 +4760,7 @@
           </w:tcPr>
           <w:p>
             <w:pPr>
-              <w:spacing w:after="20" w:before="20"/>
+              <w:spacing w:before="20" w:after="20"/>
             </w:pPr>
             <w:r>
               <w:rPr>
@@ -4792,7 +4792,7 @@
           </w:tcPr>
           <w:p>
             <w:pPr>
-              <w:spacing w:after="20" w:before="20"/>
+              <w:spacing w:before="20" w:after="20"/>
             </w:pPr>
             <w:r>
               <w:rPr>
@@ -4824,7 +4824,7 @@
           </w:tcPr>
           <w:p>
             <w:pPr>
-              <w:spacing w:after="20" w:before="20"/>
+              <w:spacing w:before="20" w:after="20"/>
             </w:pPr>
             <w:r>
               <w:rPr>
@@ -4861,7 +4861,7 @@
           </w:tcPr>
           <w:p>
             <w:pPr>
-              <w:spacing w:after="20" w:before="20"/>
+              <w:spacing w:before="20" w:after="20"/>
             </w:pPr>
             <w:r>
               <w:rPr>
@@ -4893,7 +4893,7 @@
           </w:tcPr>
           <w:p>
             <w:pPr>
-              <w:spacing w:after="20" w:before="20"/>
+              <w:spacing w:before="20" w:after="20"/>
             </w:pPr>
             <w:r>
               <w:rPr>
@@ -4925,7 +4925,7 @@
           </w:tcPr>
           <w:p>
             <w:pPr>
-              <w:spacing w:after="20" w:before="20"/>
+              <w:spacing w:before="20" w:after="20"/>
             </w:pPr>
             <w:r>
               <w:rPr>
@@ -4957,7 +4957,7 @@
           </w:tcPr>
           <w:p>
             <w:pPr>
-              <w:spacing w:after="20" w:before="20"/>
+              <w:spacing w:before="20" w:after="20"/>
             </w:pPr>
             <w:r>
               <w:rPr>
@@ -4989,7 +4989,7 @@
           </w:tcPr>
           <w:p>
             <w:pPr>
-              <w:spacing w:after="20" w:before="20"/>
+              <w:spacing w:before="20" w:after="20"/>
             </w:pPr>
             <w:r>
               <w:rPr>
@@ -5021,7 +5021,7 @@
           </w:tcPr>
           <w:p>
             <w:pPr>
-              <w:spacing w:after="20" w:before="20"/>
+              <w:spacing w:before="20" w:after="20"/>
             </w:pPr>
             <w:r>
               <w:rPr>
@@ -5058,7 +5058,7 @@
           </w:tcPr>
           <w:p>
             <w:pPr>
-              <w:spacing w:after="20" w:before="20"/>
+              <w:spacing w:before="20" w:after="20"/>
             </w:pPr>
             <w:r>
               <w:rPr>
@@ -5090,7 +5090,7 @@
           </w:tcPr>
           <w:p>
             <w:pPr>
-              <w:spacing w:after="20" w:before="20"/>
+              <w:spacing w:before="20" w:after="20"/>
             </w:pPr>
             <w:r>
               <w:rPr>
@@ -5122,7 +5122,7 @@
           </w:tcPr>
           <w:p>
             <w:pPr>
-              <w:spacing w:after="20" w:before="20"/>
+              <w:spacing w:before="20" w:after="20"/>
             </w:pPr>
             <w:r>
               <w:rPr>
@@ -5154,7 +5154,7 @@
           </w:tcPr>
           <w:p>
             <w:pPr>
-              <w:spacing w:after="20" w:before="20"/>
+              <w:spacing w:before="20" w:after="20"/>
             </w:pPr>
             <w:r>
               <w:rPr>
@@ -5186,7 +5186,7 @@
           </w:tcPr>
           <w:p>
             <w:pPr>
-              <w:spacing w:after="20" w:before="20"/>
+              <w:spacing w:before="20" w:after="20"/>
             </w:pPr>
             <w:r>
               <w:rPr>
@@ -5218,7 +5218,7 @@
           </w:tcPr>
           <w:p>
             <w:pPr>
-              <w:spacing w:after="20" w:before="20"/>
+              <w:spacing w:before="20" w:after="20"/>
             </w:pPr>
             <w:r>
               <w:rPr>
@@ -5255,7 +5255,7 @@
           </w:tcPr>
           <w:p>
             <w:pPr>
-              <w:spacing w:after="20" w:before="20"/>
+              <w:spacing w:before="20" w:after="20"/>
             </w:pPr>
             <w:r>
               <w:rPr>
@@ -5287,7 +5287,7 @@
           </w:tcPr>
           <w:p>
             <w:pPr>
-              <w:spacing w:after="20" w:before="20"/>
+              <w:spacing w:before="20" w:after="20"/>
             </w:pPr>
             <w:r>
               <w:rPr>
@@ -5319,7 +5319,7 @@
           </w:tcPr>
           <w:p>
             <w:pPr>
-              <w:spacing w:after="20" w:before="20"/>
+              <w:spacing w:before="20" w:after="20"/>
             </w:pPr>
             <w:r>
               <w:rPr>
@@ -5351,7 +5351,7 @@
           </w:tcPr>
           <w:p>
             <w:pPr>
-              <w:spacing w:after="20" w:before="20"/>
+              <w:spacing w:before="20" w:after="20"/>
             </w:pPr>
             <w:r>
               <w:rPr>
@@ -5383,7 +5383,7 @@
           </w:tcPr>
           <w:p>
             <w:pPr>
-              <w:spacing w:after="20" w:before="20"/>
+              <w:spacing w:before="20" w:after="20"/>
             </w:pPr>
             <w:r>
               <w:rPr>
@@ -5433,7 +5433,7 @@
           </w:tcPr>
           <w:p>
             <w:pPr>
-              <w:spacing w:after="20" w:before="20"/>
+              <w:spacing w:before="20" w:after="20"/>
             </w:pPr>
             <w:r>
               <w:rPr>
@@ -5470,7 +5470,7 @@
           </w:tcPr>
           <w:p>
             <w:pPr>
-              <w:spacing w:after="20" w:before="20"/>
+              <w:spacing w:before="20" w:after="20"/>
             </w:pPr>
             <w:r>
               <w:rPr>
@@ -5502,7 +5502,7 @@
           </w:tcPr>
           <w:p>
             <w:pPr>
-              <w:spacing w:after="20" w:before="20"/>
+              <w:spacing w:before="20" w:after="20"/>
             </w:pPr>
             <w:r>
               <w:rPr>
@@ -5534,7 +5534,7 @@
           </w:tcPr>
           <w:p>
             <w:pPr>
-              <w:spacing w:after="20" w:before="20"/>
+              <w:spacing w:before="20" w:after="20"/>
             </w:pPr>
             <w:r>
               <w:rPr>
@@ -5566,7 +5566,7 @@
           </w:tcPr>
           <w:p>
             <w:pPr>
-              <w:spacing w:after="20" w:before="20"/>
+              <w:spacing w:before="20" w:after="20"/>
             </w:pPr>
             <w:r>
               <w:rPr>
@@ -5598,7 +5598,7 @@
           </w:tcPr>
           <w:p>
             <w:pPr>
-              <w:spacing w:after="20" w:before="20"/>
+              <w:spacing w:before="20" w:after="20"/>
             </w:pPr>
             <w:r>
               <w:rPr>
@@ -5630,7 +5630,7 @@
           </w:tcPr>
           <w:p>
             <w:pPr>
-              <w:spacing w:after="20" w:before="20"/>
+              <w:spacing w:before="20" w:after="20"/>
             </w:pPr>
             <w:r>
               <w:rPr>
@@ -5655,7 +5655,7 @@
         <w:pBdr>
           <w:left w:val="single" w:color="8FAADC" w:sz="12" w:space="8"/>
         </w:pBdr>
-        <w:spacing w:after="120" w:before="80"/>
+        <w:spacing w:before="80" w:after="120"/>
         <w:ind w:left="480"/>
       </w:pPr>
       <w:r>
@@ -5839,7 +5839,7 @@
         <w:pBdr>
           <w:left w:val="single" w:color="8FAADC" w:sz="12" w:space="8"/>
         </w:pBdr>
-        <w:spacing w:after="120" w:before="80"/>
+        <w:spacing w:before="80" w:after="120"/>
         <w:ind w:left="480"/>
       </w:pPr>
       <w:r>
@@ -6117,7 +6117,7 @@
           </w:tcPr>
           <w:p>
             <w:pPr>
-              <w:spacing w:after="20" w:before="20"/>
+              <w:spacing w:before="20" w:after="20"/>
             </w:pPr>
             <w:r>
               <w:rPr>
@@ -6150,7 +6150,7 @@
           </w:tcPr>
           <w:p>
             <w:pPr>
-              <w:spacing w:after="20" w:before="20"/>
+              <w:spacing w:before="20" w:after="20"/>
             </w:pPr>
             <w:r>
               <w:rPr>
@@ -6183,7 +6183,7 @@
           </w:tcPr>
           <w:p>
             <w:pPr>
-              <w:spacing w:after="20" w:before="20"/>
+              <w:spacing w:before="20" w:after="20"/>
             </w:pPr>
             <w:r>
               <w:rPr>
@@ -6216,7 +6216,7 @@
           </w:tcPr>
           <w:p>
             <w:pPr>
-              <w:spacing w:after="20" w:before="20"/>
+              <w:spacing w:before="20" w:after="20"/>
             </w:pPr>
             <w:r>
               <w:rPr>
@@ -6249,7 +6249,7 @@
           </w:tcPr>
           <w:p>
             <w:pPr>
-              <w:spacing w:after="20" w:before="20"/>
+              <w:spacing w:before="20" w:after="20"/>
             </w:pPr>
             <w:r>
               <w:rPr>
@@ -6286,7 +6286,7 @@
           </w:tcPr>
           <w:p>
             <w:pPr>
-              <w:spacing w:after="20" w:before="20"/>
+              <w:spacing w:before="20" w:after="20"/>
             </w:pPr>
             <w:r>
               <w:rPr>
@@ -6318,7 +6318,7 @@
           </w:tcPr>
           <w:p>
             <w:pPr>
-              <w:spacing w:after="20" w:before="20"/>
+              <w:spacing w:before="20" w:after="20"/>
             </w:pPr>
             <w:r>
               <w:rPr>
@@ -6350,7 +6350,7 @@
           </w:tcPr>
           <w:p>
             <w:pPr>
-              <w:spacing w:after="20" w:before="20"/>
+              <w:spacing w:before="20" w:after="20"/>
             </w:pPr>
             <w:r>
               <w:rPr>
@@ -6382,7 +6382,7 @@
           </w:tcPr>
           <w:p>
             <w:pPr>
-              <w:spacing w:after="20" w:before="20"/>
+              <w:spacing w:before="20" w:after="20"/>
             </w:pPr>
             <w:r>
               <w:rPr>
@@ -6424,7 +6424,7 @@
           </w:tcPr>
           <w:p>
             <w:pPr>
-              <w:spacing w:after="20" w:before="20"/>
+              <w:spacing w:before="20" w:after="20"/>
             </w:pPr>
             <w:r>
               <w:rPr>
@@ -6471,7 +6471,7 @@
           </w:tcPr>
           <w:p>
             <w:pPr>
-              <w:spacing w:after="20" w:before="20"/>
+              <w:spacing w:before="20" w:after="20"/>
             </w:pPr>
             <w:r>
               <w:rPr>
@@ -6503,7 +6503,7 @@
           </w:tcPr>
           <w:p>
             <w:pPr>
-              <w:spacing w:after="20" w:before="20"/>
+              <w:spacing w:before="20" w:after="20"/>
             </w:pPr>
             <w:r>
               <w:rPr>
@@ -6535,7 +6535,7 @@
           </w:tcPr>
           <w:p>
             <w:pPr>
-              <w:spacing w:after="20" w:before="20"/>
+              <w:spacing w:before="20" w:after="20"/>
             </w:pPr>
             <w:r>
               <w:rPr>
@@ -6567,7 +6567,7 @@
           </w:tcPr>
           <w:p>
             <w:pPr>
-              <w:spacing w:after="20" w:before="20"/>
+              <w:spacing w:before="20" w:after="20"/>
             </w:pPr>
             <w:r>
               <w:rPr>
@@ -6609,7 +6609,7 @@
           </w:tcPr>
           <w:p>
             <w:pPr>
-              <w:spacing w:after="20" w:before="20"/>
+              <w:spacing w:before="20" w:after="20"/>
             </w:pPr>
             <w:r>
               <w:rPr>
@@ -6656,7 +6656,7 @@
           </w:tcPr>
           <w:p>
             <w:pPr>
-              <w:spacing w:after="20" w:before="20"/>
+              <w:spacing w:before="20" w:after="20"/>
             </w:pPr>
             <w:r>
               <w:rPr>
@@ -6688,7 +6688,7 @@
           </w:tcPr>
           <w:p>
             <w:pPr>
-              <w:spacing w:after="20" w:before="20"/>
+              <w:spacing w:before="20" w:after="20"/>
             </w:pPr>
             <w:r>
               <w:rPr>
@@ -6720,7 +6720,7 @@
           </w:tcPr>
           <w:p>
             <w:pPr>
-              <w:spacing w:after="20" w:before="20"/>
+              <w:spacing w:before="20" w:after="20"/>
             </w:pPr>
             <w:r>
               <w:rPr>
@@ -6752,7 +6752,7 @@
           </w:tcPr>
           <w:p>
             <w:pPr>
-              <w:spacing w:after="20" w:before="20"/>
+              <w:spacing w:before="20" w:after="20"/>
             </w:pPr>
             <w:r>
               <w:rPr>
@@ -6794,7 +6794,7 @@
           </w:tcPr>
           <w:p>
             <w:pPr>
-              <w:spacing w:after="20" w:before="20"/>
+              <w:spacing w:before="20" w:after="20"/>
             </w:pPr>
             <w:r>
               <w:rPr>
@@ -6841,7 +6841,7 @@
           </w:tcPr>
           <w:p>
             <w:pPr>
-              <w:spacing w:after="20" w:before="20"/>
+              <w:spacing w:before="20" w:after="20"/>
             </w:pPr>
             <w:r>
               <w:rPr>
@@ -6873,7 +6873,7 @@
           </w:tcPr>
           <w:p>
             <w:pPr>
-              <w:spacing w:after="20" w:before="20"/>
+              <w:spacing w:before="20" w:after="20"/>
             </w:pPr>
             <w:r>
               <w:rPr>
@@ -6905,7 +6905,7 @@
           </w:tcPr>
           <w:p>
             <w:pPr>
-              <w:spacing w:after="20" w:before="20"/>
+              <w:spacing w:before="20" w:after="20"/>
             </w:pPr>
             <w:r>
               <w:rPr>
@@ -6937,7 +6937,7 @@
           </w:tcPr>
           <w:p>
             <w:pPr>
-              <w:spacing w:after="20" w:before="20"/>
+              <w:spacing w:before="20" w:after="20"/>
             </w:pPr>
             <w:r>
               <w:rPr>
@@ -6979,7 +6979,7 @@
           </w:tcPr>
           <w:p>
             <w:pPr>
-              <w:spacing w:after="20" w:before="20"/>
+              <w:spacing w:before="20" w:after="20"/>
             </w:pPr>
             <w:r>
               <w:rPr>
@@ -7026,7 +7026,7 @@
           </w:tcPr>
           <w:p>
             <w:pPr>
-              <w:spacing w:after="20" w:before="20"/>
+              <w:spacing w:before="20" w:after="20"/>
             </w:pPr>
             <w:r>
               <w:rPr>
@@ -7058,7 +7058,7 @@
           </w:tcPr>
           <w:p>
             <w:pPr>
-              <w:spacing w:after="20" w:before="20"/>
+              <w:spacing w:before="20" w:after="20"/>
             </w:pPr>
             <w:r>
               <w:rPr>
@@ -7090,7 +7090,7 @@
           </w:tcPr>
           <w:p>
             <w:pPr>
-              <w:spacing w:after="20" w:before="20"/>
+              <w:spacing w:before="20" w:after="20"/>
             </w:pPr>
             <w:r>
               <w:rPr>
@@ -7122,7 +7122,7 @@
           </w:tcPr>
           <w:p>
             <w:pPr>
-              <w:spacing w:after="20" w:before="20"/>
+              <w:spacing w:before="20" w:after="20"/>
             </w:pPr>
             <w:r>
               <w:rPr>
@@ -7164,7 +7164,7 @@
           </w:tcPr>
           <w:p>
             <w:pPr>
-              <w:spacing w:after="20" w:before="20"/>
+              <w:spacing w:before="20" w:after="20"/>
             </w:pPr>
             <w:r>
               <w:rPr>
@@ -7211,7 +7211,7 @@
           </w:tcPr>
           <w:p>
             <w:pPr>
-              <w:spacing w:after="20" w:before="20"/>
+              <w:spacing w:before="20" w:after="20"/>
             </w:pPr>
             <w:r>
               <w:rPr>
@@ -7243,7 +7243,7 @@
           </w:tcPr>
           <w:p>
             <w:pPr>
-              <w:spacing w:after="20" w:before="20"/>
+              <w:spacing w:before="20" w:after="20"/>
             </w:pPr>
             <w:r>
               <w:rPr>
@@ -7275,7 +7275,7 @@
           </w:tcPr>
           <w:p>
             <w:pPr>
-              <w:spacing w:after="20" w:before="20"/>
+              <w:spacing w:before="20" w:after="20"/>
             </w:pPr>
             <w:r>
               <w:rPr>
@@ -7307,7 +7307,7 @@
           </w:tcPr>
           <w:p>
             <w:pPr>
-              <w:spacing w:after="20" w:before="20"/>
+              <w:spacing w:before="20" w:after="20"/>
             </w:pPr>
             <w:r>
               <w:rPr>
@@ -7349,7 +7349,7 @@
           </w:tcPr>
           <w:p>
             <w:pPr>
-              <w:spacing w:after="20" w:before="20"/>
+              <w:spacing w:before="20" w:after="20"/>
             </w:pPr>
             <w:r>
               <w:rPr>
@@ -7396,7 +7396,7 @@
           </w:tcPr>
           <w:p>
             <w:pPr>
-              <w:spacing w:after="20" w:before="20"/>
+              <w:spacing w:before="20" w:after="20"/>
             </w:pPr>
             <w:r>
               <w:rPr>
@@ -7428,7 +7428,7 @@
           </w:tcPr>
           <w:p>
             <w:pPr>
-              <w:spacing w:after="20" w:before="20"/>
+              <w:spacing w:before="20" w:after="20"/>
             </w:pPr>
             <w:r>
               <w:rPr>
@@ -7460,7 +7460,7 @@
           </w:tcPr>
           <w:p>
             <w:pPr>
-              <w:spacing w:after="20" w:before="20"/>
+              <w:spacing w:before="20" w:after="20"/>
             </w:pPr>
             <w:r>
               <w:rPr>
@@ -7492,7 +7492,7 @@
           </w:tcPr>
           <w:p>
             <w:pPr>
-              <w:spacing w:after="20" w:before="20"/>
+              <w:spacing w:before="20" w:after="20"/>
             </w:pPr>
             <w:r>
               <w:rPr>
@@ -7534,7 +7534,7 @@
           </w:tcPr>
           <w:p>
             <w:pPr>
-              <w:spacing w:after="20" w:before="20"/>
+              <w:spacing w:before="20" w:after="20"/>
             </w:pPr>
             <w:r>
               <w:rPr>
@@ -7581,7 +7581,7 @@
           </w:tcPr>
           <w:p>
             <w:pPr>
-              <w:spacing w:after="20" w:before="20"/>
+              <w:spacing w:before="20" w:after="20"/>
             </w:pPr>
             <w:r>
               <w:rPr>
@@ -7613,7 +7613,7 @@
           </w:tcPr>
           <w:p>
             <w:pPr>
-              <w:spacing w:after="20" w:before="20"/>
+              <w:spacing w:before="20" w:after="20"/>
             </w:pPr>
             <w:r>
               <w:rPr>
@@ -7645,7 +7645,7 @@
           </w:tcPr>
           <w:p>
             <w:pPr>
-              <w:spacing w:after="20" w:before="20"/>
+              <w:spacing w:before="20" w:after="20"/>
             </w:pPr>
             <w:r>
               <w:rPr>
@@ -7677,7 +7677,7 @@
           </w:tcPr>
           <w:p>
             <w:pPr>
-              <w:spacing w:after="20" w:before="20"/>
+              <w:spacing w:before="20" w:after="20"/>
             </w:pPr>
             <w:r>
               <w:rPr>
@@ -7719,7 +7719,7 @@
           </w:tcPr>
           <w:p>
             <w:pPr>
-              <w:spacing w:after="20" w:before="20"/>
+              <w:spacing w:before="20" w:after="20"/>
             </w:pPr>
             <w:r>
               <w:rPr>
@@ -7766,7 +7766,7 @@
           </w:tcPr>
           <w:p>
             <w:pPr>
-              <w:spacing w:after="20" w:before="20"/>
+              <w:spacing w:before="20" w:after="20"/>
             </w:pPr>
             <w:r>
               <w:rPr>
@@ -7798,7 +7798,7 @@
           </w:tcPr>
           <w:p>
             <w:pPr>
-              <w:spacing w:after="20" w:before="20"/>
+              <w:spacing w:before="20" w:after="20"/>
             </w:pPr>
             <w:r>
               <w:rPr>
@@ -7830,7 +7830,7 @@
           </w:tcPr>
           <w:p>
             <w:pPr>
-              <w:spacing w:after="20" w:before="20"/>
+              <w:spacing w:before="20" w:after="20"/>
             </w:pPr>
             <w:r>
               <w:rPr>
@@ -7862,7 +7862,7 @@
           </w:tcPr>
           <w:p>
             <w:pPr>
-              <w:spacing w:after="20" w:before="20"/>
+              <w:spacing w:before="20" w:after="20"/>
             </w:pPr>
             <w:r>
               <w:rPr>
@@ -7904,7 +7904,7 @@
           </w:tcPr>
           <w:p>
             <w:pPr>
-              <w:spacing w:after="20" w:before="20"/>
+              <w:spacing w:before="20" w:after="20"/>
             </w:pPr>
             <w:r>
               <w:rPr>
@@ -7951,7 +7951,7 @@
           </w:tcPr>
           <w:p>
             <w:pPr>
-              <w:spacing w:after="20" w:before="20"/>
+              <w:spacing w:before="20" w:after="20"/>
             </w:pPr>
             <w:r>
               <w:rPr>
@@ -7983,7 +7983,7 @@
           </w:tcPr>
           <w:p>
             <w:pPr>
-              <w:spacing w:after="20" w:before="20"/>
+              <w:spacing w:before="20" w:after="20"/>
             </w:pPr>
             <w:r>
               <w:rPr>
@@ -8015,7 +8015,7 @@
           </w:tcPr>
           <w:p>
             <w:pPr>
-              <w:spacing w:after="20" w:before="20"/>
+              <w:spacing w:before="20" w:after="20"/>
             </w:pPr>
             <w:r>
               <w:rPr>
@@ -8047,7 +8047,7 @@
           </w:tcPr>
           <w:p>
             <w:pPr>
-              <w:spacing w:after="20" w:before="20"/>
+              <w:spacing w:before="20" w:after="20"/>
             </w:pPr>
             <w:r>
               <w:rPr>
@@ -8089,7 +8089,7 @@
           </w:tcPr>
           <w:p>
             <w:pPr>
-              <w:spacing w:after="20" w:before="20"/>
+              <w:spacing w:before="20" w:after="20"/>
             </w:pPr>
             <w:r>
               <w:rPr>
@@ -8184,7 +8184,7 @@
           </w:tcPr>
           <w:p>
             <w:pPr>
-              <w:spacing w:after="20" w:before="20"/>
+              <w:spacing w:before="20" w:after="20"/>
             </w:pPr>
             <w:r>
               <w:rPr>
@@ -8217,7 +8217,7 @@
           </w:tcPr>
           <w:p>
             <w:pPr>
-              <w:spacing w:after="20" w:before="20"/>
+              <w:spacing w:before="20" w:after="20"/>
             </w:pPr>
             <w:r>
               <w:rPr>
@@ -8250,7 +8250,7 @@
           </w:tcPr>
           <w:p>
             <w:pPr>
-              <w:spacing w:after="20" w:before="20"/>
+              <w:spacing w:before="20" w:after="20"/>
             </w:pPr>
             <w:r>
               <w:rPr>
@@ -8283,7 +8283,7 @@
           </w:tcPr>
           <w:p>
             <w:pPr>
-              <w:spacing w:after="20" w:before="20"/>
+              <w:spacing w:before="20" w:after="20"/>
             </w:pPr>
             <w:r>
               <w:rPr>
@@ -8320,7 +8320,7 @@
           </w:tcPr>
           <w:p>
             <w:pPr>
-              <w:spacing w:after="20" w:before="20"/>
+              <w:spacing w:before="20" w:after="20"/>
             </w:pPr>
             <w:r>
               <w:rPr>
@@ -8352,7 +8352,7 @@
           </w:tcPr>
           <w:p>
             <w:pPr>
-              <w:spacing w:after="20" w:before="20"/>
+              <w:spacing w:before="20" w:after="20"/>
             </w:pPr>
             <w:r>
               <w:rPr>
@@ -8384,7 +8384,7 @@
           </w:tcPr>
           <w:p>
             <w:pPr>
-              <w:spacing w:after="20" w:before="20"/>
+              <w:spacing w:before="20" w:after="20"/>
             </w:pPr>
             <w:r>
               <w:rPr>
@@ -8416,7 +8416,7 @@
           </w:tcPr>
           <w:p>
             <w:pPr>
-              <w:spacing w:after="20" w:before="20"/>
+              <w:spacing w:before="20" w:after="20"/>
             </w:pPr>
             <w:r>
               <w:rPr>
@@ -8472,7 +8472,7 @@
           </w:tcPr>
           <w:p>
             <w:pPr>
-              <w:spacing w:after="20" w:before="20"/>
+              <w:spacing w:before="20" w:after="20"/>
             </w:pPr>
             <w:r>
               <w:rPr>
@@ -8504,7 +8504,7 @@
           </w:tcPr>
           <w:p>
             <w:pPr>
-              <w:spacing w:after="20" w:before="20"/>
+              <w:spacing w:before="20" w:after="20"/>
             </w:pPr>
             <w:r>
               <w:rPr>
@@ -8536,7 +8536,7 @@
           </w:tcPr>
           <w:p>
             <w:pPr>
-              <w:spacing w:after="20" w:before="20"/>
+              <w:spacing w:before="20" w:after="20"/>
             </w:pPr>
             <w:r>
               <w:rPr>
@@ -8568,7 +8568,7 @@
           </w:tcPr>
           <w:p>
             <w:pPr>
-              <w:spacing w:after="20" w:before="20"/>
+              <w:spacing w:before="20" w:after="20"/>
             </w:pPr>
             <w:r>
               <w:rPr>
@@ -8615,7 +8615,7 @@
           </w:tcPr>
           <w:p>
             <w:pPr>
-              <w:spacing w:after="20" w:before="20"/>
+              <w:spacing w:before="20" w:after="20"/>
             </w:pPr>
             <w:r>
               <w:rPr>
@@ -8647,7 +8647,7 @@
           </w:tcPr>
           <w:p>
             <w:pPr>
-              <w:spacing w:after="20" w:before="20"/>
+              <w:spacing w:before="20" w:after="20"/>
             </w:pPr>
             <w:r>
               <w:rPr>
@@ -8679,7 +8679,7 @@
           </w:tcPr>
           <w:p>
             <w:pPr>
-              <w:spacing w:after="20" w:before="20"/>
+              <w:spacing w:before="20" w:after="20"/>
             </w:pPr>
             <w:r>
               <w:rPr>
@@ -8711,7 +8711,7 @@
           </w:tcPr>
           <w:p>
             <w:pPr>
-              <w:spacing w:after="20" w:before="20"/>
+              <w:spacing w:before="20" w:after="20"/>
             </w:pPr>
             <w:r>
               <w:rPr>
@@ -8758,7 +8758,7 @@
           </w:tcPr>
           <w:p>
             <w:pPr>
-              <w:spacing w:after="20" w:before="20"/>
+              <w:spacing w:before="20" w:after="20"/>
             </w:pPr>
             <w:r>
               <w:rPr>
@@ -8790,7 +8790,7 @@
           </w:tcPr>
           <w:p>
             <w:pPr>
-              <w:spacing w:after="20" w:before="20"/>
+              <w:spacing w:before="20" w:after="20"/>
             </w:pPr>
             <w:r>
               <w:rPr>
@@ -8822,7 +8822,7 @@
           </w:tcPr>
           <w:p>
             <w:pPr>
-              <w:spacing w:after="20" w:before="20"/>
+              <w:spacing w:before="20" w:after="20"/>
             </w:pPr>
             <w:r>
               <w:rPr>
@@ -8854,7 +8854,7 @@
           </w:tcPr>
           <w:p>
             <w:pPr>
-              <w:spacing w:after="20" w:before="20"/>
+              <w:spacing w:before="20" w:after="20"/>
             </w:pPr>
             <w:r>
               <w:rPr>
@@ -8901,7 +8901,7 @@
           </w:tcPr>
           <w:p>
             <w:pPr>
-              <w:spacing w:after="20" w:before="20"/>
+              <w:spacing w:before="20" w:after="20"/>
             </w:pPr>
             <w:r>
               <w:rPr>
@@ -8933,7 +8933,7 @@
           </w:tcPr>
           <w:p>
             <w:pPr>
-              <w:spacing w:after="20" w:before="20"/>
+              <w:spacing w:before="20" w:after="20"/>
             </w:pPr>
             <w:r>
               <w:rPr>
@@ -8965,7 +8965,7 @@
           </w:tcPr>
           <w:p>
             <w:pPr>
-              <w:spacing w:after="20" w:before="20"/>
+              <w:spacing w:before="20" w:after="20"/>
             </w:pPr>
             <w:r>
               <w:rPr>
@@ -8997,7 +8997,7 @@
           </w:tcPr>
           <w:p>
             <w:pPr>
-              <w:spacing w:after="20" w:before="20"/>
+              <w:spacing w:before="20" w:after="20"/>
             </w:pPr>
             <w:r>
               <w:rPr>
@@ -9447,7 +9447,7 @@
           </w:tcPr>
           <w:p>
             <w:pPr>
-              <w:spacing w:after="20" w:before="20"/>
+              <w:spacing w:before="20" w:after="20"/>
             </w:pPr>
             <w:r>
               <w:rPr>
@@ -9480,7 +9480,7 @@
           </w:tcPr>
           <w:p>
             <w:pPr>
-              <w:spacing w:after="20" w:before="20"/>
+              <w:spacing w:before="20" w:after="20"/>
             </w:pPr>
             <w:r>
               <w:rPr>
@@ -9513,7 +9513,7 @@
           </w:tcPr>
           <w:p>
             <w:pPr>
-              <w:spacing w:after="20" w:before="20"/>
+              <w:spacing w:before="20" w:after="20"/>
             </w:pPr>
             <w:r>
               <w:rPr>
@@ -9546,7 +9546,7 @@
           </w:tcPr>
           <w:p>
             <w:pPr>
-              <w:spacing w:after="20" w:before="20"/>
+              <w:spacing w:before="20" w:after="20"/>
             </w:pPr>
             <w:r>
               <w:rPr>
@@ -9583,7 +9583,7 @@
           </w:tcPr>
           <w:p>
             <w:pPr>
-              <w:spacing w:after="20" w:before="20"/>
+              <w:spacing w:before="20" w:after="20"/>
             </w:pPr>
             <w:r>
               <w:rPr>
@@ -9625,7 +9625,7 @@
           </w:tcPr>
           <w:p>
             <w:pPr>
-              <w:spacing w:after="20" w:before="20"/>
+              <w:spacing w:before="20" w:after="20"/>
             </w:pPr>
             <w:r>
               <w:rPr>
@@ -9657,7 +9657,7 @@
           </w:tcPr>
           <w:p>
             <w:pPr>
-              <w:spacing w:after="20" w:before="20"/>
+              <w:spacing w:before="20" w:after="20"/>
             </w:pPr>
             <w:r>
               <w:rPr>
@@ -9689,7 +9689,7 @@
           </w:tcPr>
           <w:p>
             <w:pPr>
-              <w:spacing w:after="20" w:before="20"/>
+              <w:spacing w:before="20" w:after="20"/>
             </w:pPr>
             <w:r>
               <w:rPr>
@@ -9726,7 +9726,7 @@
           </w:tcPr>
           <w:p>
             <w:pPr>
-              <w:spacing w:after="20" w:before="20"/>
+              <w:spacing w:before="20" w:after="20"/>
             </w:pPr>
             <w:r>
               <w:rPr>
@@ -9768,7 +9768,7 @@
           </w:tcPr>
           <w:p>
             <w:pPr>
-              <w:spacing w:after="20" w:before="20"/>
+              <w:spacing w:before="20" w:after="20"/>
             </w:pPr>
             <w:r>
               <w:rPr>
@@ -9800,7 +9800,7 @@
           </w:tcPr>
           <w:p>
             <w:pPr>
-              <w:spacing w:after="20" w:before="20"/>
+              <w:spacing w:before="20" w:after="20"/>
             </w:pPr>
             <w:r>
               <w:rPr>
@@ -9832,7 +9832,7 @@
           </w:tcPr>
           <w:p>
             <w:pPr>
-              <w:spacing w:after="20" w:before="20"/>
+              <w:spacing w:before="20" w:after="20"/>
             </w:pPr>
             <w:r>
               <w:rPr>
@@ -9869,7 +9869,7 @@
           </w:tcPr>
           <w:p>
             <w:pPr>
-              <w:spacing w:after="20" w:before="20"/>
+              <w:spacing w:before="20" w:after="20"/>
             </w:pPr>
             <w:r>
               <w:rPr>
@@ -9911,7 +9911,7 @@
           </w:tcPr>
           <w:p>
             <w:pPr>
-              <w:spacing w:after="20" w:before="20"/>
+              <w:spacing w:before="20" w:after="20"/>
             </w:pPr>
             <w:r>
               <w:rPr>
@@ -9943,7 +9943,7 @@
           </w:tcPr>
           <w:p>
             <w:pPr>
-              <w:spacing w:after="20" w:before="20"/>
+              <w:spacing w:before="20" w:after="20"/>
             </w:pPr>
             <w:r>
               <w:rPr>
@@ -9975,7 +9975,7 @@
           </w:tcPr>
           <w:p>
             <w:pPr>
-              <w:spacing w:after="20" w:before="20"/>
+              <w:spacing w:before="20" w:after="20"/>
             </w:pPr>
             <w:r>
               <w:rPr>
@@ -10012,7 +10012,7 @@
           </w:tcPr>
           <w:p>
             <w:pPr>
-              <w:spacing w:after="20" w:before="20"/>
+              <w:spacing w:before="20" w:after="20"/>
             </w:pPr>
             <w:r>
               <w:rPr>
@@ -10054,7 +10054,7 @@
           </w:tcPr>
           <w:p>
             <w:pPr>
-              <w:spacing w:after="20" w:before="20"/>
+              <w:spacing w:before="20" w:after="20"/>
             </w:pPr>
             <w:r>
               <w:rPr>
@@ -10086,7 +10086,7 @@
           </w:tcPr>
           <w:p>
             <w:pPr>
-              <w:spacing w:after="20" w:before="20"/>
+              <w:spacing w:before="20" w:after="20"/>
             </w:pPr>
             <w:r>
               <w:rPr>
@@ -10118,7 +10118,7 @@
           </w:tcPr>
           <w:p>
             <w:pPr>
-              <w:spacing w:after="20" w:before="20"/>
+              <w:spacing w:before="20" w:after="20"/>
             </w:pPr>
             <w:r>
               <w:rPr>
@@ -10155,7 +10155,7 @@
           </w:tcPr>
           <w:p>
             <w:pPr>
-              <w:spacing w:after="20" w:before="20"/>
+              <w:spacing w:before="20" w:after="20"/>
             </w:pPr>
             <w:r>
               <w:rPr>
@@ -10197,7 +10197,7 @@
           </w:tcPr>
           <w:p>
             <w:pPr>
-              <w:spacing w:after="20" w:before="20"/>
+              <w:spacing w:before="20" w:after="20"/>
             </w:pPr>
             <w:r>
               <w:rPr>
@@ -10229,7 +10229,7 @@
           </w:tcPr>
           <w:p>
             <w:pPr>
-              <w:spacing w:after="20" w:before="20"/>
+              <w:spacing w:before="20" w:after="20"/>
             </w:pPr>
             <w:r>
               <w:rPr>
@@ -10261,7 +10261,7 @@
           </w:tcPr>
           <w:p>
             <w:pPr>
-              <w:spacing w:after="20" w:before="20"/>
+              <w:spacing w:before="20" w:after="20"/>
             </w:pPr>
             <w:r>
               <w:rPr>
@@ -10298,7 +10298,7 @@
           </w:tcPr>
           <w:p>
             <w:pPr>
-              <w:spacing w:after="20" w:before="20"/>
+              <w:spacing w:before="20" w:after="20"/>
             </w:pPr>
             <w:r>
               <w:rPr>
@@ -10340,7 +10340,7 @@
           </w:tcPr>
           <w:p>
             <w:pPr>
-              <w:spacing w:after="20" w:before="20"/>
+              <w:spacing w:before="20" w:after="20"/>
             </w:pPr>
             <w:r>
               <w:rPr>
@@ -10372,7 +10372,7 @@
           </w:tcPr>
           <w:p>
             <w:pPr>
-              <w:spacing w:after="20" w:before="20"/>
+              <w:spacing w:before="20" w:after="20"/>
             </w:pPr>
             <w:r>
               <w:rPr>
@@ -10404,7 +10404,7 @@
           </w:tcPr>
           <w:p>
             <w:pPr>
-              <w:spacing w:after="20" w:before="20"/>
+              <w:spacing w:before="20" w:after="20"/>
             </w:pPr>
             <w:r>
               <w:rPr>
@@ -10441,7 +10441,7 @@
           </w:tcPr>
           <w:p>
             <w:pPr>
-              <w:spacing w:after="20" w:before="20"/>
+              <w:spacing w:before="20" w:after="20"/>
             </w:pPr>
             <w:r>
               <w:rPr>
@@ -10483,7 +10483,7 @@
           </w:tcPr>
           <w:p>
             <w:pPr>
-              <w:spacing w:after="20" w:before="20"/>
+              <w:spacing w:before="20" w:after="20"/>
             </w:pPr>
             <w:r>
               <w:rPr>
@@ -10515,7 +10515,7 @@
           </w:tcPr>
           <w:p>
             <w:pPr>
-              <w:spacing w:after="20" w:before="20"/>
+              <w:spacing w:before="20" w:after="20"/>
             </w:pPr>
             <w:r>
               <w:rPr>
@@ -10547,7 +10547,7 @@
           </w:tcPr>
           <w:p>
             <w:pPr>
-              <w:spacing w:after="20" w:before="20"/>
+              <w:spacing w:before="20" w:after="20"/>
             </w:pPr>
             <w:r>
               <w:rPr>
@@ -10584,7 +10584,7 @@
           </w:tcPr>
           <w:p>
             <w:pPr>
-              <w:spacing w:after="20" w:before="20"/>
+              <w:spacing w:before="20" w:after="20"/>
             </w:pPr>
             <w:r>
               <w:rPr>
@@ -10626,7 +10626,7 @@
           </w:tcPr>
           <w:p>
             <w:pPr>
-              <w:spacing w:after="20" w:before="20"/>
+              <w:spacing w:before="20" w:after="20"/>
             </w:pPr>
             <w:r>
               <w:rPr>
@@ -10658,7 +10658,7 @@
           </w:tcPr>
           <w:p>
             <w:pPr>
-              <w:spacing w:after="20" w:before="20"/>
+              <w:spacing w:before="20" w:after="20"/>
             </w:pPr>
             <w:r>
               <w:rPr>
@@ -10690,7 +10690,7 @@
           </w:tcPr>
           <w:p>
             <w:pPr>
-              <w:spacing w:after="20" w:before="20"/>
+              <w:spacing w:before="20" w:after="20"/>
             </w:pPr>
             <w:r>
               <w:rPr>
@@ -10715,7 +10715,7 @@
         <w:pBdr>
           <w:left w:val="single" w:color="8FAADC" w:sz="12" w:space="8"/>
         </w:pBdr>
-        <w:spacing w:after="120" w:before="80"/>
+        <w:spacing w:before="80" w:after="120"/>
         <w:ind w:left="480"/>
       </w:pPr>
       <w:r>
@@ -10921,7 +10921,7 @@
           </w:tcPr>
           <w:p>
             <w:pPr>
-              <w:spacing w:after="20" w:before="20"/>
+              <w:spacing w:before="20" w:after="20"/>
             </w:pPr>
             <w:r>
               <w:rPr>
@@ -10954,7 +10954,7 @@
           </w:tcPr>
           <w:p>
             <w:pPr>
-              <w:spacing w:after="20" w:before="20"/>
+              <w:spacing w:before="20" w:after="20"/>
             </w:pPr>
             <w:r>
               <w:rPr>
@@ -10987,7 +10987,7 @@
           </w:tcPr>
           <w:p>
             <w:pPr>
-              <w:spacing w:after="20" w:before="20"/>
+              <w:spacing w:before="20" w:after="20"/>
             </w:pPr>
             <w:r>
               <w:rPr>
@@ -11020,7 +11020,7 @@
           </w:tcPr>
           <w:p>
             <w:pPr>
-              <w:spacing w:after="20" w:before="20"/>
+              <w:spacing w:before="20" w:after="20"/>
             </w:pPr>
             <w:r>
               <w:rPr>
@@ -11053,7 +11053,7 @@
           </w:tcPr>
           <w:p>
             <w:pPr>
-              <w:spacing w:after="20" w:before="20"/>
+              <w:spacing w:before="20" w:after="20"/>
             </w:pPr>
             <w:r>
               <w:rPr>
@@ -11090,7 +11090,7 @@
           </w:tcPr>
           <w:p>
             <w:pPr>
-              <w:spacing w:after="20" w:before="20"/>
+              <w:spacing w:before="20" w:after="20"/>
             </w:pPr>
             <w:r>
               <w:rPr>
@@ -11122,7 +11122,7 @@
           </w:tcPr>
           <w:p>
             <w:pPr>
-              <w:spacing w:after="20" w:before="20"/>
+              <w:spacing w:before="20" w:after="20"/>
             </w:pPr>
             <w:r>
               <w:rPr>
@@ -11154,7 +11154,7 @@
           </w:tcPr>
           <w:p>
             <w:pPr>
-              <w:spacing w:after="20" w:before="20"/>
+              <w:spacing w:before="20" w:after="20"/>
             </w:pPr>
             <w:r>
               <w:rPr>
@@ -11186,7 +11186,7 @@
           </w:tcPr>
           <w:p>
             <w:pPr>
-              <w:spacing w:after="20" w:before="20"/>
+              <w:spacing w:before="20" w:after="20"/>
             </w:pPr>
             <w:r>
               <w:rPr>
@@ -11218,7 +11218,7 @@
           </w:tcPr>
           <w:p>
             <w:pPr>
-              <w:spacing w:after="20" w:before="20"/>
+              <w:spacing w:before="20" w:after="20"/>
             </w:pPr>
             <w:r>
               <w:rPr>
@@ -11255,7 +11255,7 @@
           </w:tcPr>
           <w:p>
             <w:pPr>
-              <w:spacing w:after="20" w:before="20"/>
+              <w:spacing w:before="20" w:after="20"/>
             </w:pPr>
             <w:r>
               <w:rPr>
@@ -11297,7 +11297,7 @@
           </w:tcPr>
           <w:p>
             <w:pPr>
-              <w:spacing w:after="20" w:before="20"/>
+              <w:spacing w:before="20" w:after="20"/>
             </w:pPr>
             <w:r>
               <w:rPr>
@@ -11329,7 +11329,7 @@
           </w:tcPr>
           <w:p>
             <w:pPr>
-              <w:spacing w:after="20" w:before="20"/>
+              <w:spacing w:before="20" w:after="20"/>
             </w:pPr>
             <w:r>
               <w:rPr>
@@ -11361,7 +11361,7 @@
           </w:tcPr>
           <w:p>
             <w:pPr>
-              <w:spacing w:after="20" w:before="20"/>
+              <w:spacing w:before="20" w:after="20"/>
             </w:pPr>
             <w:r>
               <w:rPr>
@@ -11393,7 +11393,7 @@
           </w:tcPr>
           <w:p>
             <w:pPr>
-              <w:spacing w:after="20" w:before="20"/>
+              <w:spacing w:before="20" w:after="20"/>
             </w:pPr>
             <w:r>
               <w:rPr>
@@ -11448,7 +11448,7 @@
           </w:tcPr>
           <w:p>
             <w:pPr>
-              <w:spacing w:after="20" w:before="20"/>
+              <w:spacing w:before="20" w:after="20"/>
             </w:pPr>
             <w:r>
               <w:rPr>
@@ -11480,7 +11480,7 @@
           </w:tcPr>
           <w:p>
             <w:pPr>
-              <w:spacing w:after="20" w:before="20"/>
+              <w:spacing w:before="20" w:after="20"/>
             </w:pPr>
             <w:r>
               <w:rPr>
@@ -11549,7 +11549,7 @@
           </w:tcPr>
           <w:p>
             <w:pPr>
-              <w:spacing w:after="20" w:before="20"/>
+              <w:spacing w:before="20" w:after="20"/>
             </w:pPr>
             <w:r>
               <w:rPr>
@@ -11581,7 +11581,7 @@
           </w:tcPr>
           <w:p>
             <w:pPr>
-              <w:spacing w:after="20" w:before="20"/>
+              <w:spacing w:before="20" w:after="20"/>
             </w:pPr>
             <w:r>
               <w:rPr>
@@ -11613,7 +11613,7 @@
           </w:tcPr>
           <w:p>
             <w:pPr>
-              <w:spacing w:after="20" w:before="20"/>
+              <w:spacing w:before="20" w:after="20"/>
             </w:pPr>
             <w:r>
               <w:rPr>
@@ -11650,7 +11650,7 @@
           </w:tcPr>
           <w:p>
             <w:pPr>
-              <w:spacing w:after="20" w:before="20"/>
+              <w:spacing w:before="20" w:after="20"/>
             </w:pPr>
             <w:r>
               <w:rPr>
@@ -11682,7 +11682,7 @@
           </w:tcPr>
           <w:p>
             <w:pPr>
-              <w:spacing w:after="20" w:before="20"/>
+              <w:spacing w:before="20" w:after="20"/>
             </w:pPr>
             <w:r>
               <w:rPr>
@@ -11723,7 +11723,7 @@
           </w:tcPr>
           <w:p>
             <w:pPr>
-              <w:spacing w:after="20" w:before="20"/>
+              <w:spacing w:before="20" w:after="20"/>
             </w:pPr>
             <w:r>
               <w:rPr>
@@ -11755,7 +11755,7 @@
           </w:tcPr>
           <w:p>
             <w:pPr>
-              <w:spacing w:after="20" w:before="20"/>
+              <w:spacing w:before="20" w:after="20"/>
             </w:pPr>
             <w:r>
               <w:rPr>
@@ -11787,7 +11787,7 @@
           </w:tcPr>
           <w:p>
             <w:pPr>
-              <w:spacing w:after="20" w:before="20"/>
+              <w:spacing w:before="20" w:after="20"/>
             </w:pPr>
             <w:r>
               <w:rPr>
@@ -11824,7 +11824,7 @@
           </w:tcPr>
           <w:p>
             <w:pPr>
-              <w:spacing w:after="20" w:before="20"/>
+              <w:spacing w:before="20" w:after="20"/>
             </w:pPr>
             <w:r>
               <w:rPr>
@@ -11856,7 +11856,7 @@
           </w:tcPr>
           <w:p>
             <w:pPr>
-              <w:spacing w:after="20" w:before="20"/>
+              <w:spacing w:before="20" w:after="20"/>
             </w:pPr>
             <w:r>
               <w:rPr>
@@ -11897,7 +11897,7 @@
           </w:tcPr>
           <w:p>
             <w:pPr>
-              <w:spacing w:after="20" w:before="20"/>
+              <w:spacing w:before="20" w:after="20"/>
             </w:pPr>
             <w:r>
               <w:rPr>
@@ -11929,7 +11929,7 @@
           </w:tcPr>
           <w:p>
             <w:pPr>
-              <w:spacing w:after="20" w:before="20"/>
+              <w:spacing w:before="20" w:after="20"/>
             </w:pPr>
             <w:r>
               <w:rPr>
@@ -11961,7 +11961,7 @@
           </w:tcPr>
           <w:p>
             <w:pPr>
-              <w:spacing w:after="20" w:before="20"/>
+              <w:spacing w:before="20" w:after="20"/>
             </w:pPr>
             <w:r>
               <w:rPr>
@@ -11998,7 +11998,7 @@
           </w:tcPr>
           <w:p>
             <w:pPr>
-              <w:spacing w:after="20" w:before="20"/>
+              <w:spacing w:before="20" w:after="20"/>
             </w:pPr>
             <w:r>
               <w:rPr>
@@ -12040,7 +12040,7 @@
           </w:tcPr>
           <w:p>
             <w:pPr>
-              <w:spacing w:after="20" w:before="20"/>
+              <w:spacing w:before="20" w:after="20"/>
             </w:pPr>
             <w:r>
               <w:rPr>
@@ -12072,7 +12072,7 @@
           </w:tcPr>
           <w:p>
             <w:pPr>
-              <w:spacing w:after="20" w:before="20"/>
+              <w:spacing w:before="20" w:after="20"/>
             </w:pPr>
             <w:r>
               <w:rPr>
@@ -12104,7 +12104,7 @@
           </w:tcPr>
           <w:p>
             <w:pPr>
-              <w:spacing w:after="20" w:before="20"/>
+              <w:spacing w:before="20" w:after="20"/>
             </w:pPr>
             <w:r>
               <w:rPr>
@@ -12136,7 +12136,7 @@
           </w:tcPr>
           <w:p>
             <w:pPr>
-              <w:spacing w:after="20" w:before="20"/>
+              <w:spacing w:before="20" w:after="20"/>
             </w:pPr>
             <w:r>
               <w:rPr>
@@ -12173,7 +12173,7 @@
           </w:tcPr>
           <w:p>
             <w:pPr>
-              <w:spacing w:after="20" w:before="20"/>
+              <w:spacing w:before="20" w:after="20"/>
             </w:pPr>
             <w:r>
               <w:rPr>
@@ -12215,7 +12215,7 @@
           </w:tcPr>
           <w:p>
             <w:pPr>
-              <w:spacing w:after="20" w:before="20"/>
+              <w:spacing w:before="20" w:after="20"/>
             </w:pPr>
             <w:r>
               <w:rPr>
@@ -12247,7 +12247,7 @@
           </w:tcPr>
           <w:p>
             <w:pPr>
-              <w:spacing w:after="20" w:before="20"/>
+              <w:spacing w:before="20" w:after="20"/>
             </w:pPr>
             <w:r>
               <w:rPr>
@@ -12279,7 +12279,7 @@
           </w:tcPr>
           <w:p>
             <w:pPr>
-              <w:spacing w:after="20" w:before="20"/>
+              <w:spacing w:before="20" w:after="20"/>
             </w:pPr>
             <w:r>
               <w:rPr>
@@ -12311,7 +12311,7 @@
           </w:tcPr>
           <w:p>
             <w:pPr>
-              <w:spacing w:after="20" w:before="20"/>
+              <w:spacing w:before="20" w:after="20"/>
             </w:pPr>
             <w:r>
               <w:rPr>
@@ -12348,7 +12348,7 @@
           </w:tcPr>
           <w:p>
             <w:pPr>
-              <w:spacing w:after="20" w:before="20"/>
+              <w:spacing w:before="20" w:after="20"/>
             </w:pPr>
             <w:r>
               <w:rPr>
@@ -12390,7 +12390,7 @@
           </w:tcPr>
           <w:p>
             <w:pPr>
-              <w:spacing w:after="20" w:before="20"/>
+              <w:spacing w:before="20" w:after="20"/>
             </w:pPr>
             <w:r>
               <w:rPr>
@@ -12422,7 +12422,7 @@
           </w:tcPr>
           <w:p>
             <w:pPr>
-              <w:spacing w:after="20" w:before="20"/>
+              <w:spacing w:before="20" w:after="20"/>
             </w:pPr>
             <w:r>
               <w:rPr>
@@ -12454,7 +12454,7 @@
           </w:tcPr>
           <w:p>
             <w:pPr>
-              <w:spacing w:after="20" w:before="20"/>
+              <w:spacing w:before="20" w:after="20"/>
             </w:pPr>
             <w:r>
               <w:rPr>
@@ -12486,7 +12486,7 @@
           </w:tcPr>
           <w:p>
             <w:pPr>
-              <w:spacing w:after="20" w:before="20"/>
+              <w:spacing w:before="20" w:after="20"/>
             </w:pPr>
             <w:r>
               <w:rPr>
@@ -12523,7 +12523,7 @@
           </w:tcPr>
           <w:p>
             <w:pPr>
-              <w:spacing w:after="20" w:before="20"/>
+              <w:spacing w:before="20" w:after="20"/>
             </w:pPr>
             <w:r>
               <w:rPr>
@@ -12565,7 +12565,7 @@
           </w:tcPr>
           <w:p>
             <w:pPr>
-              <w:spacing w:after="20" w:before="20"/>
+              <w:spacing w:before="20" w:after="20"/>
             </w:pPr>
             <w:r>
               <w:rPr>
@@ -12597,7 +12597,7 @@
           </w:tcPr>
           <w:p>
             <w:pPr>
-              <w:spacing w:after="20" w:before="20"/>
+              <w:spacing w:before="20" w:after="20"/>
             </w:pPr>
             <w:r>
               <w:rPr>
@@ -12629,7 +12629,7 @@
           </w:tcPr>
           <w:p>
             <w:pPr>
-              <w:spacing w:after="20" w:before="20"/>
+              <w:spacing w:before="20" w:after="20"/>
             </w:pPr>
             <w:r>
               <w:rPr>
@@ -12661,7 +12661,7 @@
           </w:tcPr>
           <w:p>
             <w:pPr>
-              <w:spacing w:after="20" w:before="20"/>
+              <w:spacing w:before="20" w:after="20"/>
             </w:pPr>
             <w:r>
               <w:rPr>
@@ -12698,7 +12698,7 @@
           </w:tcPr>
           <w:p>
             <w:pPr>
-              <w:spacing w:after="20" w:before="20"/>
+              <w:spacing w:before="20" w:after="20"/>
             </w:pPr>
             <w:r>
               <w:rPr>
@@ -12730,7 +12730,7 @@
           </w:tcPr>
           <w:p>
             <w:pPr>
-              <w:spacing w:after="20" w:before="20"/>
+              <w:spacing w:before="20" w:after="20"/>
             </w:pPr>
             <w:r>
               <w:rPr>
@@ -12762,7 +12762,7 @@
           </w:tcPr>
           <w:p>
             <w:pPr>
-              <w:spacing w:after="20" w:before="20"/>
+              <w:spacing w:before="20" w:after="20"/>
             </w:pPr>
             <w:r>
               <w:rPr>
@@ -12794,7 +12794,7 @@
           </w:tcPr>
           <w:p>
             <w:pPr>
-              <w:spacing w:after="20" w:before="20"/>
+              <w:spacing w:before="20" w:after="20"/>
             </w:pPr>
             <w:r>
               <w:rPr>
@@ -12826,7 +12826,7 @@
           </w:tcPr>
           <w:p>
             <w:pPr>
-              <w:spacing w:after="20" w:before="20"/>
+              <w:spacing w:before="20" w:after="20"/>
             </w:pPr>
             <w:r>
               <w:rPr>
@@ -12863,7 +12863,7 @@
           </w:tcPr>
           <w:p>
             <w:pPr>
-              <w:spacing w:after="20" w:before="20"/>
+              <w:spacing w:before="20" w:after="20"/>
             </w:pPr>
             <w:r>
               <w:rPr>
@@ -12895,7 +12895,7 @@
           </w:tcPr>
           <w:p>
             <w:pPr>
-              <w:spacing w:after="20" w:before="20"/>
+              <w:spacing w:before="20" w:after="20"/>
             </w:pPr>
             <w:r>
               <w:rPr>
@@ -12927,7 +12927,7 @@
           </w:tcPr>
           <w:p>
             <w:pPr>
-              <w:spacing w:after="20" w:before="20"/>
+              <w:spacing w:before="20" w:after="20"/>
             </w:pPr>
             <w:r>
               <w:rPr>
@@ -12959,7 +12959,7 @@
           </w:tcPr>
           <w:p>
             <w:pPr>
-              <w:spacing w:after="20" w:before="20"/>
+              <w:spacing w:before="20" w:after="20"/>
             </w:pPr>
             <w:r>
               <w:rPr>
@@ -12991,7 +12991,7 @@
           </w:tcPr>
           <w:p>
             <w:pPr>
-              <w:spacing w:after="20" w:before="20"/>
+              <w:spacing w:before="20" w:after="20"/>
             </w:pPr>
             <w:r>
               <w:rPr>
@@ -13028,7 +13028,7 @@
           </w:tcPr>
           <w:p>
             <w:pPr>
-              <w:spacing w:after="20" w:before="20"/>
+              <w:spacing w:before="20" w:after="20"/>
             </w:pPr>
             <w:r>
               <w:rPr>
@@ -13070,7 +13070,7 @@
           </w:tcPr>
           <w:p>
             <w:pPr>
-              <w:spacing w:after="20" w:before="20"/>
+              <w:spacing w:before="20" w:after="20"/>
             </w:pPr>
             <w:r>
               <w:rPr>
@@ -13102,7 +13102,7 @@
           </w:tcPr>
           <w:p>
             <w:pPr>
-              <w:spacing w:after="20" w:before="20"/>
+              <w:spacing w:before="20" w:after="20"/>
             </w:pPr>
             <w:r>
               <w:rPr>
@@ -13134,7 +13134,7 @@
           </w:tcPr>
           <w:p>
             <w:pPr>
-              <w:spacing w:after="20" w:before="20"/>
+              <w:spacing w:before="20" w:after="20"/>
             </w:pPr>
             <w:r>
               <w:rPr>
@@ -13166,7 +13166,7 @@
           </w:tcPr>
           <w:p>
             <w:pPr>
-              <w:spacing w:after="20" w:before="20"/>
+              <w:spacing w:before="20" w:after="20"/>
             </w:pPr>
             <w:r>
               <w:rPr>
@@ -13203,7 +13203,7 @@
           </w:tcPr>
           <w:p>
             <w:pPr>
-              <w:spacing w:after="20" w:before="20"/>
+              <w:spacing w:before="20" w:after="20"/>
             </w:pPr>
             <w:r>
               <w:rPr>
@@ -13244,7 +13244,7 @@
           </w:tcPr>
           <w:p>
             <w:pPr>
-              <w:spacing w:after="20" w:before="20"/>
+              <w:spacing w:before="20" w:after="20"/>
             </w:pPr>
             <w:r>
               <w:rPr>
@@ -13276,7 +13276,7 @@
           </w:tcPr>
           <w:p>
             <w:pPr>
-              <w:spacing w:after="20" w:before="20"/>
+              <w:spacing w:before="20" w:after="20"/>
             </w:pPr>
             <w:r>
               <w:rPr>
@@ -13308,7 +13308,7 @@
           </w:tcPr>
           <w:p>
             <w:pPr>
-              <w:spacing w:after="20" w:before="20"/>
+              <w:spacing w:before="20" w:after="20"/>
             </w:pPr>
             <w:r>
               <w:rPr>
@@ -13340,7 +13340,7 @@
           </w:tcPr>
           <w:p>
             <w:pPr>
-              <w:spacing w:after="20" w:before="20"/>
+              <w:spacing w:before="20" w:after="20"/>
             </w:pPr>
             <w:r>
               <w:rPr>
@@ -13377,7 +13377,7 @@
           </w:tcPr>
           <w:p>
             <w:pPr>
-              <w:spacing w:after="20" w:before="20"/>
+              <w:spacing w:before="20" w:after="20"/>
             </w:pPr>
             <w:r>
               <w:rPr>
@@ -13419,7 +13419,7 @@
           </w:tcPr>
           <w:p>
             <w:pPr>
-              <w:spacing w:after="20" w:before="20"/>
+              <w:spacing w:before="20" w:after="20"/>
             </w:pPr>
             <w:r>
               <w:rPr>
@@ -13451,7 +13451,7 @@
           </w:tcPr>
           <w:p>
             <w:pPr>
-              <w:spacing w:after="20" w:before="20"/>
+              <w:spacing w:before="20" w:after="20"/>
             </w:pPr>
             <w:r>
               <w:rPr>
@@ -13483,7 +13483,7 @@
           </w:tcPr>
           <w:p>
             <w:pPr>
-              <w:spacing w:after="20" w:before="20"/>
+              <w:spacing w:before="20" w:after="20"/>
             </w:pPr>
             <w:r>
               <w:rPr>
@@ -13515,7 +13515,7 @@
           </w:tcPr>
           <w:p>
             <w:pPr>
-              <w:spacing w:after="20" w:before="20"/>
+              <w:spacing w:before="20" w:after="20"/>
             </w:pPr>
             <w:r>
               <w:rPr>
@@ -13552,7 +13552,7 @@
           </w:tcPr>
           <w:p>
             <w:pPr>
-              <w:spacing w:after="20" w:before="20"/>
+              <w:spacing w:before="20" w:after="20"/>
             </w:pPr>
             <w:r>
               <w:rPr>
@@ -13584,7 +13584,7 @@
           </w:tcPr>
           <w:p>
             <w:pPr>
-              <w:spacing w:after="20" w:before="20"/>
+              <w:spacing w:before="20" w:after="20"/>
             </w:pPr>
             <w:r>
               <w:rPr>
@@ -13616,7 +13616,7 @@
           </w:tcPr>
           <w:p>
             <w:pPr>
-              <w:spacing w:after="20" w:before="20"/>
+              <w:spacing w:before="20" w:after="20"/>
             </w:pPr>
             <w:r>
               <w:rPr>
@@ -13648,7 +13648,7 @@
           </w:tcPr>
           <w:p>
             <w:pPr>
-              <w:spacing w:after="20" w:before="20"/>
+              <w:spacing w:before="20" w:after="20"/>
             </w:pPr>
             <w:r>
               <w:rPr>
@@ -13680,7 +13680,7 @@
           </w:tcPr>
           <w:p>
             <w:pPr>
-              <w:spacing w:after="20" w:before="20"/>
+              <w:spacing w:before="20" w:after="20"/>
             </w:pPr>
             <w:r>
               <w:rPr>
@@ -13717,7 +13717,7 @@
           </w:tcPr>
           <w:p>
             <w:pPr>
-              <w:spacing w:after="20" w:before="20"/>
+              <w:spacing w:before="20" w:after="20"/>
             </w:pPr>
             <w:r>
               <w:rPr>
@@ -13759,7 +13759,7 @@
           </w:tcPr>
           <w:p>
             <w:pPr>
-              <w:spacing w:after="20" w:before="20"/>
+              <w:spacing w:before="20" w:after="20"/>
             </w:pPr>
             <w:r>
               <w:rPr>
@@ -13791,7 +13791,7 @@
           </w:tcPr>
           <w:p>
             <w:pPr>
-              <w:spacing w:after="20" w:before="20"/>
+              <w:spacing w:before="20" w:after="20"/>
             </w:pPr>
             <w:r>
               <w:rPr>
@@ -13823,7 +13823,7 @@
           </w:tcPr>
           <w:p>
             <w:pPr>
-              <w:spacing w:after="20" w:before="20"/>
+              <w:spacing w:before="20" w:after="20"/>
             </w:pPr>
             <w:r>
               <w:rPr>
@@ -13855,7 +13855,7 @@
           </w:tcPr>
           <w:p>
             <w:pPr>
-              <w:spacing w:after="20" w:before="20"/>
+              <w:spacing w:before="20" w:after="20"/>
             </w:pPr>
             <w:r>
               <w:rPr>
@@ -13892,7 +13892,7 @@
           </w:tcPr>
           <w:p>
             <w:pPr>
-              <w:spacing w:after="20" w:before="20"/>
+              <w:spacing w:before="20" w:after="20"/>
             </w:pPr>
             <w:r>
               <w:rPr>
@@ -13934,7 +13934,7 @@
           </w:tcPr>
           <w:p>
             <w:pPr>
-              <w:spacing w:after="20" w:before="20"/>
+              <w:spacing w:before="20" w:after="20"/>
             </w:pPr>
             <w:r>
               <w:rPr>
@@ -13966,7 +13966,7 @@
           </w:tcPr>
           <w:p>
             <w:pPr>
-              <w:spacing w:after="20" w:before="20"/>
+              <w:spacing w:before="20" w:after="20"/>
             </w:pPr>
             <w:r>
               <w:rPr>
@@ -13998,7 +13998,7 @@
           </w:tcPr>
           <w:p>
             <w:pPr>
-              <w:spacing w:after="20" w:before="20"/>
+              <w:spacing w:before="20" w:after="20"/>
             </w:pPr>
             <w:r>
               <w:rPr>
@@ -14030,7 +14030,7 @@
           </w:tcPr>
           <w:p>
             <w:pPr>
-              <w:spacing w:after="20" w:before="20"/>
+              <w:spacing w:before="20" w:after="20"/>
             </w:pPr>
             <w:r>
               <w:rPr>
@@ -14067,7 +14067,7 @@
           </w:tcPr>
           <w:p>
             <w:pPr>
-              <w:spacing w:after="20" w:before="20"/>
+              <w:spacing w:before="20" w:after="20"/>
             </w:pPr>
             <w:r>
               <w:rPr>
@@ -14109,7 +14109,7 @@
           </w:tcPr>
           <w:p>
             <w:pPr>
-              <w:spacing w:after="20" w:before="20"/>
+              <w:spacing w:before="20" w:after="20"/>
             </w:pPr>
             <w:r>
               <w:rPr>
@@ -14141,7 +14141,7 @@
           </w:tcPr>
           <w:p>
             <w:pPr>
-              <w:spacing w:after="20" w:before="20"/>
+              <w:spacing w:before="20" w:after="20"/>
             </w:pPr>
             <w:r>
               <w:rPr>
@@ -14173,7 +14173,7 @@
           </w:tcPr>
           <w:p>
             <w:pPr>
-              <w:spacing w:after="20" w:before="20"/>
+              <w:spacing w:before="20" w:after="20"/>
             </w:pPr>
             <w:r>
               <w:rPr>
@@ -14205,7 +14205,7 @@
           </w:tcPr>
           <w:p>
             <w:pPr>
-              <w:spacing w:after="20" w:before="20"/>
+              <w:spacing w:before="20" w:after="20"/>
             </w:pPr>
             <w:r>
               <w:rPr>
@@ -14242,7 +14242,7 @@
           </w:tcPr>
           <w:p>
             <w:pPr>
-              <w:spacing w:after="20" w:before="20"/>
+              <w:spacing w:before="20" w:after="20"/>
             </w:pPr>
             <w:r>
               <w:rPr>
@@ -14284,7 +14284,7 @@
           </w:tcPr>
           <w:p>
             <w:pPr>
-              <w:spacing w:after="20" w:before="20"/>
+              <w:spacing w:before="20" w:after="20"/>
             </w:pPr>
             <w:r>
               <w:rPr>
@@ -14316,7 +14316,7 @@
           </w:tcPr>
           <w:p>
             <w:pPr>
-              <w:spacing w:after="20" w:before="20"/>
+              <w:spacing w:before="20" w:after="20"/>
             </w:pPr>
             <w:r>
               <w:rPr>
@@ -14348,7 +14348,7 @@
           </w:tcPr>
           <w:p>
             <w:pPr>
-              <w:spacing w:after="20" w:before="20"/>
+              <w:spacing w:before="20" w:after="20"/>
             </w:pPr>
             <w:r>
               <w:rPr>
@@ -14380,7 +14380,7 @@
           </w:tcPr>
           <w:p>
             <w:pPr>
-              <w:spacing w:after="20" w:before="20"/>
+              <w:spacing w:before="20" w:after="20"/>
             </w:pPr>
             <w:r>
               <w:rPr>
@@ -14417,7 +14417,7 @@
           </w:tcPr>
           <w:p>
             <w:pPr>
-              <w:spacing w:after="20" w:before="20"/>
+              <w:spacing w:before="20" w:after="20"/>
             </w:pPr>
             <w:r>
               <w:rPr>
@@ -14459,7 +14459,7 @@
           </w:tcPr>
           <w:p>
             <w:pPr>
-              <w:spacing w:after="20" w:before="20"/>
+              <w:spacing w:before="20" w:after="20"/>
             </w:pPr>
             <w:r>
               <w:rPr>
@@ -14491,7 +14491,7 @@
           </w:tcPr>
           <w:p>
             <w:pPr>
-              <w:spacing w:after="20" w:before="20"/>
+              <w:spacing w:before="20" w:after="20"/>
             </w:pPr>
             <w:r>
               <w:rPr>
@@ -14523,7 +14523,7 @@
           </w:tcPr>
           <w:p>
             <w:pPr>
-              <w:spacing w:after="20" w:before="20"/>
+              <w:spacing w:before="20" w:after="20"/>
             </w:pPr>
             <w:r>
               <w:rPr>
@@ -14555,7 +14555,7 @@
           </w:tcPr>
           <w:p>
             <w:pPr>
-              <w:spacing w:after="20" w:before="20"/>
+              <w:spacing w:before="20" w:after="20"/>
             </w:pPr>
             <w:r>
               <w:rPr>
@@ -14580,7 +14580,7 @@
         <w:pBdr>
           <w:left w:val="single" w:color="8FAADC" w:sz="12" w:space="8"/>
         </w:pBdr>
-        <w:spacing w:after="120" w:before="80"/>
+        <w:spacing w:before="80" w:after="120"/>
         <w:ind w:left="480"/>
       </w:pPr>
       <w:r>
@@ -14745,7 +14745,7 @@
         <w:pBdr>
           <w:left w:val="single" w:color="8FAADC" w:sz="12" w:space="8"/>
         </w:pBdr>
-        <w:spacing w:after="120" w:before="80"/>
+        <w:spacing w:before="80" w:after="120"/>
         <w:ind w:left="480"/>
       </w:pPr>
       <w:r>
@@ -14926,7 +14926,7 @@
           </w:tcPr>
           <w:p>
             <w:pPr>
-              <w:spacing w:after="20" w:before="20"/>
+              <w:spacing w:before="20" w:after="20"/>
             </w:pPr>
             <w:r>
               <w:rPr>
@@ -14959,7 +14959,7 @@
           </w:tcPr>
           <w:p>
             <w:pPr>
-              <w:spacing w:after="20" w:before="20"/>
+              <w:spacing w:before="20" w:after="20"/>
             </w:pPr>
             <w:r>
               <w:rPr>
@@ -14992,7 +14992,7 @@
           </w:tcPr>
           <w:p>
             <w:pPr>
-              <w:spacing w:after="20" w:before="20"/>
+              <w:spacing w:before="20" w:after="20"/>
             </w:pPr>
             <w:r>
               <w:rPr>
@@ -15029,7 +15029,7 @@
           </w:tcPr>
           <w:p>
             <w:pPr>
-              <w:spacing w:after="20" w:before="20"/>
+              <w:spacing w:before="20" w:after="20"/>
             </w:pPr>
             <w:r>
               <w:rPr>
@@ -15061,7 +15061,7 @@
           </w:tcPr>
           <w:p>
             <w:pPr>
-              <w:spacing w:after="20" w:before="20"/>
+              <w:spacing w:before="20" w:after="20"/>
             </w:pPr>
             <w:r>
               <w:rPr>
@@ -15093,7 +15093,7 @@
           </w:tcPr>
           <w:p>
             <w:pPr>
-              <w:spacing w:after="20" w:before="20"/>
+              <w:spacing w:before="20" w:after="20"/>
             </w:pPr>
             <w:r>
               <w:rPr>
@@ -15130,7 +15130,7 @@
           </w:tcPr>
           <w:p>
             <w:pPr>
-              <w:spacing w:after="20" w:before="20"/>
+              <w:spacing w:before="20" w:after="20"/>
             </w:pPr>
             <w:r>
               <w:rPr>
@@ -15162,7 +15162,7 @@
           </w:tcPr>
           <w:p>
             <w:pPr>
-              <w:spacing w:after="20" w:before="20"/>
+              <w:spacing w:before="20" w:after="20"/>
             </w:pPr>
             <w:r>
               <w:rPr>
@@ -15194,7 +15194,7 @@
           </w:tcPr>
           <w:p>
             <w:pPr>
-              <w:spacing w:after="20" w:before="20"/>
+              <w:spacing w:before="20" w:after="20"/>
             </w:pPr>
             <w:r>
               <w:rPr>
@@ -15231,7 +15231,7 @@
           </w:tcPr>
           <w:p>
             <w:pPr>
-              <w:spacing w:after="20" w:before="20"/>
+              <w:spacing w:before="20" w:after="20"/>
             </w:pPr>
             <w:r>
               <w:rPr>
@@ -15263,7 +15263,7 @@
           </w:tcPr>
           <w:p>
             <w:pPr>
-              <w:spacing w:after="20" w:before="20"/>
+              <w:spacing w:before="20" w:after="20"/>
             </w:pPr>
             <w:r>
               <w:rPr>
@@ -15295,7 +15295,7 @@
           </w:tcPr>
           <w:p>
             <w:pPr>
-              <w:spacing w:after="20" w:before="20"/>
+              <w:spacing w:before="20" w:after="20"/>
             </w:pPr>
             <w:r>
               <w:rPr>
@@ -15332,7 +15332,7 @@
           </w:tcPr>
           <w:p>
             <w:pPr>
-              <w:spacing w:after="20" w:before="20"/>
+              <w:spacing w:before="20" w:after="20"/>
             </w:pPr>
             <w:r>
               <w:rPr>
@@ -15364,7 +15364,7 @@
           </w:tcPr>
           <w:p>
             <w:pPr>
-              <w:spacing w:after="20" w:before="20"/>
+              <w:spacing w:before="20" w:after="20"/>
             </w:pPr>
             <w:r>
               <w:rPr>
@@ -15396,7 +15396,7 @@
           </w:tcPr>
           <w:p>
             <w:pPr>
-              <w:spacing w:after="20" w:before="20"/>
+              <w:spacing w:before="20" w:after="20"/>
             </w:pPr>
             <w:r>
               <w:rPr>
@@ -15433,7 +15433,7 @@
           </w:tcPr>
           <w:p>
             <w:pPr>
-              <w:spacing w:after="20" w:before="20"/>
+              <w:spacing w:before="20" w:after="20"/>
             </w:pPr>
             <w:r>
               <w:rPr>
@@ -15465,7 +15465,7 @@
           </w:tcPr>
           <w:p>
             <w:pPr>
-              <w:spacing w:after="20" w:before="20"/>
+              <w:spacing w:before="20" w:after="20"/>
             </w:pPr>
             <w:r>
               <w:rPr>
@@ -15497,7 +15497,7 @@
           </w:tcPr>
           <w:p>
             <w:pPr>
-              <w:spacing w:after="20" w:before="20"/>
+              <w:spacing w:before="20" w:after="20"/>
             </w:pPr>
             <w:r>
               <w:rPr>
@@ -15534,7 +15534,7 @@
           </w:tcPr>
           <w:p>
             <w:pPr>
-              <w:spacing w:after="20" w:before="20"/>
+              <w:spacing w:before="20" w:after="20"/>
             </w:pPr>
             <w:r>
               <w:rPr>
@@ -15566,7 +15566,7 @@
           </w:tcPr>
           <w:p>
             <w:pPr>
-              <w:spacing w:after="20" w:before="20"/>
+              <w:spacing w:before="20" w:after="20"/>
             </w:pPr>
             <w:r>
               <w:rPr>
@@ -15598,7 +15598,7 @@
           </w:tcPr>
           <w:p>
             <w:pPr>
-              <w:spacing w:after="20" w:before="20"/>
+              <w:spacing w:before="20" w:after="20"/>
             </w:pPr>
             <w:r>
               <w:rPr>
@@ -15635,7 +15635,7 @@
           </w:tcPr>
           <w:p>
             <w:pPr>
-              <w:spacing w:after="20" w:before="20"/>
+              <w:spacing w:before="20" w:after="20"/>
             </w:pPr>
             <w:r>
               <w:rPr>
@@ -15667,7 +15667,7 @@
           </w:tcPr>
           <w:p>
             <w:pPr>
-              <w:spacing w:after="20" w:before="20"/>
+              <w:spacing w:before="20" w:after="20"/>
             </w:pPr>
             <w:r>
               <w:rPr>
@@ -15699,7 +15699,7 @@
           </w:tcPr>
           <w:p>
             <w:pPr>
-              <w:spacing w:after="20" w:before="20"/>
+              <w:spacing w:before="20" w:after="20"/>
             </w:pPr>
             <w:r>
               <w:rPr>
@@ -15736,7 +15736,7 @@
           </w:tcPr>
           <w:p>
             <w:pPr>
-              <w:spacing w:after="20" w:before="20"/>
+              <w:spacing w:before="20" w:after="20"/>
             </w:pPr>
             <w:r>
               <w:rPr>
@@ -15768,7 +15768,7 @@
           </w:tcPr>
           <w:p>
             <w:pPr>
-              <w:spacing w:after="20" w:before="20"/>
+              <w:spacing w:before="20" w:after="20"/>
             </w:pPr>
             <w:r>
               <w:rPr>
@@ -15800,7 +15800,7 @@
           </w:tcPr>
           <w:p>
             <w:pPr>
-              <w:spacing w:after="20" w:before="20"/>
+              <w:spacing w:before="20" w:after="20"/>
             </w:pPr>
             <w:r>
               <w:rPr>
@@ -15837,7 +15837,7 @@
           </w:tcPr>
           <w:p>
             <w:pPr>
-              <w:spacing w:after="20" w:before="20"/>
+              <w:spacing w:before="20" w:after="20"/>
             </w:pPr>
             <w:r>
               <w:rPr>
@@ -15869,7 +15869,7 @@
           </w:tcPr>
           <w:p>
             <w:pPr>
-              <w:spacing w:after="20" w:before="20"/>
+              <w:spacing w:before="20" w:after="20"/>
             </w:pPr>
             <w:r>
               <w:rPr>
@@ -15901,7 +15901,7 @@
           </w:tcPr>
           <w:p>
             <w:pPr>
-              <w:spacing w:after="20" w:before="20"/>
+              <w:spacing w:before="20" w:after="20"/>
             </w:pPr>
             <w:r>
               <w:rPr>
@@ -15938,7 +15938,7 @@
           </w:tcPr>
           <w:p>
             <w:pPr>
-              <w:spacing w:after="20" w:before="20"/>
+              <w:spacing w:before="20" w:after="20"/>
             </w:pPr>
             <w:r>
               <w:rPr>
@@ -15970,7 +15970,7 @@
           </w:tcPr>
           <w:p>
             <w:pPr>
-              <w:spacing w:after="20" w:before="20"/>
+              <w:spacing w:before="20" w:after="20"/>
             </w:pPr>
             <w:r>
               <w:rPr>
@@ -16002,7 +16002,7 @@
           </w:tcPr>
           <w:p>
             <w:pPr>
-              <w:spacing w:after="20" w:before="20"/>
+              <w:spacing w:before="20" w:after="20"/>
             </w:pPr>
             <w:r>
               <w:rPr>
@@ -16039,7 +16039,7 @@
           </w:tcPr>
           <w:p>
             <w:pPr>
-              <w:spacing w:after="20" w:before="20"/>
+              <w:spacing w:before="20" w:after="20"/>
             </w:pPr>
             <w:r>
               <w:rPr>
@@ -16071,7 +16071,7 @@
           </w:tcPr>
           <w:p>
             <w:pPr>
-              <w:spacing w:after="20" w:before="20"/>
+              <w:spacing w:before="20" w:after="20"/>
             </w:pPr>
             <w:r>
               <w:rPr>
@@ -16103,7 +16103,7 @@
           </w:tcPr>
           <w:p>
             <w:pPr>
-              <w:spacing w:after="20" w:before="20"/>
+              <w:spacing w:before="20" w:after="20"/>
             </w:pPr>
             <w:r>
               <w:rPr>
@@ -16350,7 +16350,25 @@
           <w:i w:val="false"/>
           <w:iCs w:val="false"/>
         </w:rPr>
-        <w:t xml:space="preserve">.</w:t>
+        <w:t xml:space="preserve">, </w:t>
+      </w:r>
+      <w:r>
+        <w:rPr>
+          <w:b/>
+          <w:bCs/>
+          <w:i w:val="false"/>
+          <w:iCs w:val="false"/>
+        </w:rPr>
+        <w:t xml:space="preserve">hladinový objem plynu</w:t>
+      </w:r>
+      <w:r>
+        <w:rPr>
+          <w:b w:val="false"/>
+          <w:bCs w:val="false"/>
+          <w:i w:val="false"/>
+          <w:iCs w:val="false"/>
+        </w:rPr>
+        <w:t xml:space="preserve"> (objem plynu přepočtený na tlak 1 bar).</w:t>
       </w:r>
     </w:p>
     <w:p>
@@ -16408,7 +16426,7 @@
           </w:tcPr>
           <w:p>
             <w:pPr>
-              <w:spacing w:after="20" w:before="20"/>
+              <w:spacing w:before="20" w:after="20"/>
             </w:pPr>
             <w:r>
               <w:rPr>
@@ -16441,7 +16459,7 @@
           </w:tcPr>
           <w:p>
             <w:pPr>
-              <w:spacing w:after="20" w:before="20"/>
+              <w:spacing w:before="20" w:after="20"/>
             </w:pPr>
             <w:r>
               <w:rPr>
@@ -16474,7 +16492,7 @@
           </w:tcPr>
           <w:p>
             <w:pPr>
-              <w:spacing w:after="20" w:before="20"/>
+              <w:spacing w:before="20" w:after="20"/>
             </w:pPr>
             <w:r>
               <w:rPr>
@@ -16511,7 +16529,7 @@
           </w:tcPr>
           <w:p>
             <w:pPr>
-              <w:spacing w:after="20" w:before="20"/>
+              <w:spacing w:before="20" w:after="20"/>
             </w:pPr>
             <w:r>
               <w:rPr>
@@ -16578,7 +16596,7 @@
           </w:tcPr>
           <w:p>
             <w:pPr>
-              <w:spacing w:after="20" w:before="20"/>
+              <w:spacing w:before="20" w:after="20"/>
             </w:pPr>
             <w:r>
               <w:rPr>
@@ -16636,7 +16654,7 @@
           </w:tcPr>
           <w:p>
             <w:pPr>
-              <w:spacing w:after="20" w:before="20"/>
+              <w:spacing w:before="20" w:after="20"/>
             </w:pPr>
             <w:r>
               <w:rPr>
@@ -16673,7 +16691,7 @@
           </w:tcPr>
           <w:p>
             <w:pPr>
-              <w:spacing w:after="20" w:before="20"/>
+              <w:spacing w:before="20" w:after="20"/>
             </w:pPr>
             <w:r>
               <w:rPr>
@@ -16727,7 +16745,7 @@
           </w:tcPr>
           <w:p>
             <w:pPr>
-              <w:spacing w:after="20" w:before="20"/>
+              <w:spacing w:before="20" w:after="20"/>
             </w:pPr>
             <w:r>
               <w:rPr>
@@ -16763,7 +16781,7 @@
           </w:tcPr>
           <w:p>
             <w:pPr>
-              <w:spacing w:after="20" w:before="20"/>
+              <w:spacing w:before="20" w:after="20"/>
             </w:pPr>
             <w:r>
               <w:rPr>
@@ -16800,7 +16818,7 @@
           </w:tcPr>
           <w:p>
             <w:pPr>
-              <w:spacing w:after="20" w:before="20"/>
+              <w:spacing w:before="20" w:after="20"/>
             </w:pPr>
             <w:r>
               <w:rPr>
@@ -16845,7 +16863,7 @@
           </w:tcPr>
           <w:p>
             <w:pPr>
-              <w:spacing w:after="20" w:before="20"/>
+              <w:spacing w:before="20" w:after="20"/>
             </w:pPr>
             <w:r>
               <w:rPr>
@@ -16881,7 +16899,7 @@
           </w:tcPr>
           <w:p>
             <w:pPr>
-              <w:spacing w:after="20" w:before="20"/>
+              <w:spacing w:before="20" w:after="20"/>
             </w:pPr>
             <w:r>
               <w:rPr>
@@ -16918,7 +16936,7 @@
           </w:tcPr>
           <w:p>
             <w:pPr>
-              <w:spacing w:after="20" w:before="20"/>
+              <w:spacing w:before="20" w:after="20"/>
             </w:pPr>
             <w:r>
               <w:rPr>
@@ -16963,7 +16981,7 @@
           </w:tcPr>
           <w:p>
             <w:pPr>
-              <w:spacing w:after="20" w:before="20"/>
+              <w:spacing w:before="20" w:after="20"/>
             </w:pPr>
             <w:r>
               <w:rPr>
@@ -16999,7 +17017,7 @@
           </w:tcPr>
           <w:p>
             <w:pPr>
-              <w:spacing w:after="20" w:before="20"/>
+              <w:spacing w:before="20" w:after="20"/>
             </w:pPr>
             <w:r>
               <w:rPr>
@@ -17036,7 +17054,7 @@
           </w:tcPr>
           <w:p>
             <w:pPr>
-              <w:spacing w:after="20" w:before="20"/>
+              <w:spacing w:before="20" w:after="20"/>
             </w:pPr>
             <w:r>
               <w:rPr>
@@ -17081,7 +17099,7 @@
           </w:tcPr>
           <w:p>
             <w:pPr>
-              <w:spacing w:after="20" w:before="20"/>
+              <w:spacing w:before="20" w:after="20"/>
             </w:pPr>
             <w:r>
               <w:rPr>
@@ -17117,7 +17135,7 @@
           </w:tcPr>
           <w:p>
             <w:pPr>
-              <w:spacing w:after="20" w:before="20"/>
+              <w:spacing w:before="20" w:after="20"/>
             </w:pPr>
             <w:r>
               <w:rPr>
@@ -17154,7 +17172,7 @@
           </w:tcPr>
           <w:p>
             <w:pPr>
-              <w:spacing w:after="20" w:before="20"/>
+              <w:spacing w:before="20" w:after="20"/>
             </w:pPr>
             <w:r>
               <w:rPr>
@@ -17199,7 +17217,7 @@
           </w:tcPr>
           <w:p>
             <w:pPr>
-              <w:spacing w:after="20" w:before="20"/>
+              <w:spacing w:before="20" w:after="20"/>
             </w:pPr>
             <w:r>
               <w:rPr>
@@ -17235,7 +17253,7 @@
           </w:tcPr>
           <w:p>
             <w:pPr>
-              <w:spacing w:after="20" w:before="20"/>
+              <w:spacing w:before="20" w:after="20"/>
             </w:pPr>
             <w:r>
               <w:rPr>
@@ -17272,7 +17290,7 @@
           </w:tcPr>
           <w:p>
             <w:pPr>
-              <w:spacing w:after="20" w:before="20"/>
+              <w:spacing w:before="20" w:after="20"/>
             </w:pPr>
             <w:r>
               <w:rPr>
@@ -17317,7 +17335,7 @@
           </w:tcPr>
           <w:p>
             <w:pPr>
-              <w:spacing w:after="20" w:before="20"/>
+              <w:spacing w:before="20" w:after="20"/>
             </w:pPr>
             <w:r>
               <w:rPr>
@@ -17353,7 +17371,7 @@
           </w:tcPr>
           <w:p>
             <w:pPr>
-              <w:spacing w:after="20" w:before="20"/>
+              <w:spacing w:before="20" w:after="20"/>
             </w:pPr>
             <w:r>
               <w:rPr>
@@ -17390,7 +17408,7 @@
           </w:tcPr>
           <w:p>
             <w:pPr>
-              <w:spacing w:after="20" w:before="20"/>
+              <w:spacing w:before="20" w:after="20"/>
             </w:pPr>
             <w:r>
               <w:rPr>
@@ -17435,7 +17453,7 @@
           </w:tcPr>
           <w:p>
             <w:pPr>
-              <w:spacing w:after="20" w:before="20"/>
+              <w:spacing w:before="20" w:after="20"/>
             </w:pPr>
             <w:r>
               <w:rPr>
@@ -17471,7 +17489,7 @@
           </w:tcPr>
           <w:p>
             <w:pPr>
-              <w:spacing w:after="20" w:before="20"/>
+              <w:spacing w:before="20" w:after="20"/>
             </w:pPr>
             <w:r>
               <w:t xml:space="preserve"/>
@@ -17511,7 +17529,7 @@
           </w:tcPr>
           <w:p>
             <w:pPr>
-              <w:spacing w:after="20" w:before="20"/>
+              <w:spacing w:before="20" w:after="20"/>
             </w:pPr>
             <w:r>
               <w:rPr>
@@ -17565,7 +17583,7 @@
           </w:tcPr>
           <w:p>
             <w:pPr>
-              <w:spacing w:after="20" w:before="20"/>
+              <w:spacing w:before="20" w:after="20"/>
             </w:pPr>
             <w:r>
               <w:rPr>
@@ -17597,7 +17615,7 @@
           </w:tcPr>
           <w:p>
             <w:pPr>
-              <w:spacing w:after="20" w:before="20"/>
+              <w:spacing w:before="20" w:after="20"/>
             </w:pPr>
             <w:r>
               <w:rPr>
@@ -17634,7 +17652,7 @@
           </w:tcPr>
           <w:p>
             <w:pPr>
-              <w:spacing w:after="20" w:before="20"/>
+              <w:spacing w:before="20" w:after="20"/>
             </w:pPr>
             <w:r>
               <w:rPr>
@@ -17701,7 +17719,7 @@
           </w:tcPr>
           <w:p>
             <w:pPr>
-              <w:spacing w:after="20" w:before="20"/>
+              <w:spacing w:before="20" w:after="20"/>
             </w:pPr>
             <w:r>
               <w:rPr>
@@ -17752,7 +17770,7 @@
           </w:tcPr>
           <w:p>
             <w:pPr>
-              <w:spacing w:after="20" w:before="20"/>
+              <w:spacing w:before="20" w:after="20"/>
             </w:pPr>
             <w:r>
               <w:rPr>
@@ -17789,7 +17807,7 @@
           </w:tcPr>
           <w:p>
             <w:pPr>
-              <w:spacing w:after="20" w:before="20"/>
+              <w:spacing w:before="20" w:after="20"/>
             </w:pPr>
             <w:r>
               <w:rPr>
@@ -17843,7 +17861,7 @@
           </w:tcPr>
           <w:p>
             <w:pPr>
-              <w:spacing w:after="20" w:before="20"/>
+              <w:spacing w:before="20" w:after="20"/>
             </w:pPr>
             <w:r>
               <w:rPr>
@@ -17879,7 +17897,7 @@
           </w:tcPr>
           <w:p>
             <w:pPr>
-              <w:spacing w:after="20" w:before="20"/>
+              <w:spacing w:before="20" w:after="20"/>
             </w:pPr>
             <w:r>
               <w:rPr>
@@ -17916,7 +17934,7 @@
           </w:tcPr>
           <w:p>
             <w:pPr>
-              <w:spacing w:after="20" w:before="20"/>
+              <w:spacing w:before="20" w:after="20"/>
             </w:pPr>
             <w:r>
               <w:rPr>
@@ -17961,7 +17979,7 @@
           </w:tcPr>
           <w:p>
             <w:pPr>
-              <w:spacing w:after="20" w:before="20"/>
+              <w:spacing w:before="20" w:after="20"/>
             </w:pPr>
             <w:r>
               <w:rPr>
@@ -17997,7 +18015,7 @@
           </w:tcPr>
           <w:p>
             <w:pPr>
-              <w:spacing w:after="20" w:before="20"/>
+              <w:spacing w:before="20" w:after="20"/>
             </w:pPr>
             <w:r>
               <w:rPr>
@@ -18034,7 +18052,7 @@
           </w:tcPr>
           <w:p>
             <w:pPr>
-              <w:spacing w:after="20" w:before="20"/>
+              <w:spacing w:before="20" w:after="20"/>
             </w:pPr>
             <w:r>
               <w:rPr>
@@ -18088,7 +18106,7 @@
           </w:tcPr>
           <w:p>
             <w:pPr>
-              <w:spacing w:after="20" w:before="20"/>
+              <w:spacing w:before="20" w:after="20"/>
             </w:pPr>
             <w:r>
               <w:rPr>
@@ -18138,7 +18156,7 @@
           </w:tcPr>
           <w:p>
             <w:pPr>
-              <w:spacing w:after="20" w:before="20"/>
+              <w:spacing w:before="20" w:after="20"/>
             </w:pPr>
             <w:r>
               <w:rPr>
@@ -18175,7 +18193,7 @@
           </w:tcPr>
           <w:p>
             <w:pPr>
-              <w:spacing w:after="20" w:before="20"/>
+              <w:spacing w:before="20" w:after="20"/>
             </w:pPr>
             <w:r>
               <w:rPr>
@@ -18229,7 +18247,7 @@
           </w:tcPr>
           <w:p>
             <w:pPr>
-              <w:spacing w:after="20" w:before="20"/>
+              <w:spacing w:before="20" w:after="20"/>
             </w:pPr>
             <w:r>
               <w:rPr>
@@ -18261,7 +18279,7 @@
           </w:tcPr>
           <w:p>
             <w:pPr>
-              <w:spacing w:after="20" w:before="20"/>
+              <w:spacing w:before="20" w:after="20"/>
             </w:pPr>
             <w:r>
               <w:rPr>
@@ -18325,7 +18343,7 @@
           </w:tcPr>
           <w:p>
             <w:pPr>
-              <w:spacing w:after="20" w:before="20"/>
+              <w:spacing w:before="20" w:after="20"/>
             </w:pPr>
             <w:r>
               <w:rPr>
@@ -18392,7 +18410,7 @@
           </w:tcPr>
           <w:p>
             <w:pPr>
-              <w:spacing w:after="20" w:before="20"/>
+              <w:spacing w:before="20" w:after="20"/>
             </w:pPr>
             <w:r>
               <w:rPr>
@@ -18428,7 +18446,7 @@
           </w:tcPr>
           <w:p>
             <w:pPr>
-              <w:spacing w:after="20" w:before="20"/>
+              <w:spacing w:before="20" w:after="20"/>
             </w:pPr>
             <w:r>
               <w:rPr>
@@ -18653,8 +18671,8 @@
       </w:r>
     </w:p>
     <w:sectPr>
-      <w:headerReference w:type="default" r:id="rId7"/>
-      <w:footerReference w:type="default" r:id="rId8"/>
+      <w:headerReference w:type="default" r:id="rId6"/>
+      <w:footerReference w:type="default" r:id="rId7"/>
       <w:pgSz w:w="11906" w:h="16838" w:orient="portrait"/>
       <w:pgMar w:top="1440" w:right="1440" w:bottom="1440" w:left="1440" w:header="708" w:footer="708" w:gutter="0"/>
       <w:pgNumType/>
@@ -18666,43 +18684,6 @@
 
 <file path=word/comments.xml><?xml version="1.0" encoding="utf-8"?>
 <w:comments xmlns:cx="http://schemas.microsoft.com/office/drawing/2014/chartex" xmlns:cx1="http://schemas.microsoft.com/office/drawing/2015/9/8/chartex" xmlns:cx2="http://schemas.microsoft.com/office/drawing/2015/10/21/chartex" xmlns:cx3="http://schemas.microsoft.com/office/drawing/2016/5/9/chartex" xmlns:cx4="http://schemas.microsoft.com/office/drawing/2016/5/10/chartex" xmlns:cx5="http://schemas.microsoft.com/office/drawing/2016/5/11/chartex" xmlns:cx6="http://schemas.microsoft.com/office/drawing/2016/5/12/chartex" xmlns:cx7="http://schemas.microsoft.com/office/drawing/2016/5/13/chartex" xmlns:cx8="http://schemas.microsoft.com/office/drawing/2016/5/14/chartex" xmlns:mc="http://schemas.openxmlformats.org/markup-compatibility/2006" xmlns:aink="http://schemas.microsoft.com/office/drawing/2016/ink" xmlns:am3d="http://schemas.microsoft.com/office/drawing/2017/model3d" xmlns:o="urn:schemas-microsoft-com:office:office" xmlns:r="http://schemas.openxmlformats.org/officeDocument/2006/relationships" xmlns:m="http://schemas.openxmlformats.org/officeDocument/2006/math" xmlns:v="urn:schemas-microsoft-com:vml" xmlns:wp14="http://schemas.microsoft.com/office/word/2010/wordprocessingDrawing" xmlns:wp="http://schemas.openxmlformats.org/drawingml/2006/wordprocessingDrawing" xmlns:w10="urn:schemas-microsoft-com:office:word" xmlns:w="http://schemas.openxmlformats.org/wordprocessingml/2006/main" xmlns:w14="http://schemas.microsoft.com/office/word/2010/wordml" xmlns:w15="http://schemas.microsoft.com/office/word/2012/wordml" xmlns:w16cex="http://schemas.microsoft.com/office/word/2018/wordml/cex" xmlns:w16cid="http://schemas.microsoft.com/office/word/2016/wordml/cid" xmlns:w16="http://schemas.microsoft.com/office/word/2018/wordml" xmlns:w16sdtdh="http://schemas.microsoft.com/office/word/2020/wordml/sdtdatahash" xmlns:w16se="http://schemas.microsoft.com/office/word/2015/wordml/symex" xmlns:wpg="http://schemas.microsoft.com/office/word/2010/wordprocessingGroup" xmlns:wpi="http://schemas.microsoft.com/office/word/2010/wordprocessingInk" xmlns:wne="http://schemas.microsoft.com/office/word/2006/wordml" xmlns:wps="http://schemas.microsoft.com/office/word/2010/wordprocessingShape"/>
-</file>
-
-<file path=word/endnotes.xml><?xml version="1.0" encoding="utf-8"?>
-<w:endnotes xmlns:wpc="http://schemas.microsoft.com/office/word/2010/wordprocessingCanvas" xmlns:mc="http://schemas.openxmlformats.org/markup-compatibility/2006" xmlns:o="urn:schemas-microsoft-com:office:office" xmlns:r="http://schemas.openxmlformats.org/officeDocument/2006/relationships" xmlns:m="http://schemas.openxmlformats.org/officeDocument/2006/math" xmlns:v="urn:schemas-microsoft-com:vml" xmlns:wp14="http://schemas.microsoft.com/office/word/2010/wordprocessingDrawing" xmlns:wp="http://schemas.openxmlformats.org/drawingml/2006/wordprocessingDrawing" xmlns:w10="urn:schemas-microsoft-com:office:word" xmlns:w="http://schemas.openxmlformats.org/wordprocessingml/2006/main" xmlns:w14="http://schemas.microsoft.com/office/word/2010/wordml" xmlns:w15="http://schemas.microsoft.com/office/word/2012/wordml" xmlns:wpg="http://schemas.microsoft.com/office/word/2010/wordprocessingGroup" xmlns:wpi="http://schemas.microsoft.com/office/word/2010/wordprocessingInk" xmlns:wne="http://schemas.microsoft.com/office/word/2006/wordml" xmlns:wps="http://schemas.microsoft.com/office/word/2010/wordprocessingShape" mc:Ignorable="w14 w15 wp14">
-  <w:endnote w:type="separator" w:id="-1">
-    <w:p>
-      <w:pPr>
-        <w:spacing w:after="0" w:line="240" w:lineRule="auto"/>
-      </w:pPr>
-      <w:r>
-        <w:rPr>
-          <w:rStyle w:val="EndnoteReference"/>
-        </w:rPr>
-        <w:endnoteRef/>
-      </w:r>
-      <w:r>
-        <w:separator/>
-      </w:r>
-    </w:p>
-  </w:endnote>
-  <w:endnote w:type="continuationSeparator" w:id="0">
-    <w:p>
-      <w:pPr>
-        <w:spacing w:after="0" w:line="240" w:lineRule="auto"/>
-      </w:pPr>
-      <w:r>
-        <w:rPr>
-          <w:rStyle w:val="EndnoteReference"/>
-        </w:rPr>
-        <w:endnoteRef/>
-      </w:r>
-      <w:r>
-        <w:continuationSeparator/>
-      </w:r>
-    </w:p>
-  </w:endnote>
-</w:endnotes>
 </file>
 
 <file path=word/footer1.xml><?xml version="1.0" encoding="utf-8"?>
@@ -19066,43 +19047,6 @@
       <w:szCs w:val="20"/>
     </w:rPr>
   </w:style>
-  <w:style w:type="character" w:styleId="EndnoteReference">
-    <w:name w:val="endnote reference"/>
-    <w:basedOn w:val="DefaultParagraphFont"/>
-    <w:uiPriority w:val="99"/>
-    <w:semiHidden/>
-    <w:unhideWhenUsed/>
-    <w:rPr>
-      <w:vertAlign w:val="superscript"/>
-    </w:rPr>
-  </w:style>
-  <w:style w:type="paragraph" w:styleId="EndnoteText">
-    <w:name w:val="endnote text"/>
-    <w:basedOn w:val="Normal"/>
-    <w:link w:val="EndnoteTextChar"/>
-    <w:uiPriority w:val="99"/>
-    <w:semiHidden/>
-    <w:unhideWhenUsed/>
-    <w:pPr>
-      <w:spacing w:after="0" w:line="240" w:lineRule="auto"/>
-    </w:pPr>
-    <w:rPr>
-      <w:sz w:val="20"/>
-      <w:szCs w:val="20"/>
-    </w:rPr>
-  </w:style>
-  <w:style w:type="character" w:styleId="EndnoteTextChar">
-    <w:name w:val="Endnote Text Char"/>
-    <w:basedOn w:val="DefaultParagraphFont"/>
-    <w:link w:val="EndnoteText"/>
-    <w:uiPriority w:val="99"/>
-    <w:semiHidden/>
-    <w:unhideWhenUsed/>
-    <w:rPr>
-      <w:sz w:val="20"/>
-      <w:szCs w:val="20"/>
-    </w:rPr>
-  </w:style>
   <w:style w:type="paragraph" w:styleId="Title">
     <w:name w:val="Title"/>
     <w:basedOn w:val="Normal"/>
@@ -19127,7 +19071,7 @@
     <w:next w:val="Normal"/>
     <w:qFormat/>
     <w:pPr>
-      <w:spacing w:after="140" w:before="320"/>
+      <w:spacing w:before="320" w:after="140"/>
       <w:outlineLvl w:val="0"/>
     </w:pPr>
     <w:rPr>
@@ -19145,7 +19089,7 @@
     <w:next w:val="Normal"/>
     <w:qFormat/>
     <w:pPr>
-      <w:spacing w:after="120" w:before="240"/>
+      <w:spacing w:before="240" w:after="120"/>
       <w:outlineLvl w:val="1"/>
     </w:pPr>
     <w:rPr>
@@ -19163,7 +19107,7 @@
     <w:next w:val="Normal"/>
     <w:qFormat/>
     <w:pPr>
-      <w:spacing w:after="100" w:before="200"/>
+      <w:spacing w:before="200" w:after="100"/>
       <w:outlineLvl w:val="2"/>
     </w:pPr>
     <w:rPr>

</xml_diff>